<commit_message>
Error and exepections  6/3
</commit_message>
<xml_diff>
--- a/Notes/Git and gitHub.docx
+++ b/Notes/Git and gitHub.docx
@@ -224,65 +224,9 @@
           <w:szCs w:val="36"/>
           <w:highlight w:val="green"/>
         </w:rPr>
-        <w:t>git init</w:t>
-      </w:r>
-    </w:p>
-    <w:p>
-      <w:pPr>
-        <w:jc w:val="center"/>
-        <w:rPr>
-          <w:rFonts w:ascii="Times New Roman" w:hAnsi="Times New Roman" w:cs="Times New Roman"/>
-          <w:sz w:val="36"/>
-          <w:szCs w:val="36"/>
-        </w:rPr>
-      </w:pPr>
-    </w:p>
-    <w:p>
-      <w:pPr>
-        <w:rPr>
-          <w:rFonts w:ascii="Times New Roman" w:hAnsi="Times New Roman" w:cs="Times New Roman"/>
-          <w:sz w:val="24"/>
-          <w:szCs w:val="24"/>
-        </w:rPr>
-      </w:pPr>
-      <w:r>
-        <w:rPr>
-          <w:rFonts w:ascii="Times New Roman" w:hAnsi="Times New Roman" w:cs="Times New Roman"/>
-          <w:b/>
-          <w:bCs/>
-          <w:sz w:val="28"/>
-          <w:szCs w:val="28"/>
-        </w:rPr>
-        <w:t xml:space="preserve">Cloning an Existing </w:t>
-      </w:r>
-      <w:r>
-        <w:rPr>
-          <w:rFonts w:ascii="Times New Roman" w:hAnsi="Times New Roman" w:cs="Times New Roman"/>
-          <w:b/>
-          <w:bCs/>
-          <w:sz w:val="28"/>
-          <w:szCs w:val="28"/>
-        </w:rPr>
-        <w:t>Repository: - This</w:t>
-      </w:r>
-      <w:r>
-        <w:rPr>
-          <w:rFonts w:ascii="Times New Roman" w:hAnsi="Times New Roman" w:cs="Times New Roman"/>
-          <w:sz w:val="24"/>
-          <w:szCs w:val="24"/>
-        </w:rPr>
-        <w:t xml:space="preserve"> copies a repository from GitHub to your local machine.</w:t>
-      </w:r>
-    </w:p>
-    <w:p>
-      <w:pPr>
-        <w:jc w:val="center"/>
-        <w:rPr>
-          <w:rFonts w:ascii="Times New Roman" w:hAnsi="Times New Roman" w:cs="Times New Roman"/>
-          <w:sz w:val="36"/>
-          <w:szCs w:val="36"/>
-        </w:rPr>
-      </w:pPr>
+        <w:t xml:space="preserve">git </w:t>
+      </w:r>
+      <w:proofErr w:type="spellStart"/>
       <w:r>
         <w:rPr>
           <w:rFonts w:ascii="Times New Roman" w:hAnsi="Times New Roman" w:cs="Times New Roman"/>
@@ -290,54 +234,55 @@
           <w:szCs w:val="36"/>
           <w:highlight w:val="green"/>
         </w:rPr>
-        <w:t>git clone &lt;repo_url&gt;</w:t>
-      </w:r>
+        <w:t>init</w:t>
+      </w:r>
+      <w:proofErr w:type="spellEnd"/>
     </w:p>
     <w:p>
       <w:pPr>
         <w:jc w:val="center"/>
         <w:rPr>
           <w:rFonts w:ascii="Times New Roman" w:hAnsi="Times New Roman" w:cs="Times New Roman"/>
+          <w:sz w:val="36"/>
+          <w:szCs w:val="36"/>
+        </w:rPr>
+      </w:pPr>
+    </w:p>
+    <w:p>
+      <w:pPr>
+        <w:rPr>
+          <w:rFonts w:ascii="Times New Roman" w:hAnsi="Times New Roman" w:cs="Times New Roman"/>
+          <w:sz w:val="24"/>
+          <w:szCs w:val="24"/>
+        </w:rPr>
+      </w:pPr>
+      <w:r>
+        <w:rPr>
+          <w:rFonts w:ascii="Times New Roman" w:hAnsi="Times New Roman" w:cs="Times New Roman"/>
+          <w:b/>
+          <w:bCs/>
           <w:sz w:val="28"/>
           <w:szCs w:val="28"/>
         </w:rPr>
-      </w:pPr>
-    </w:p>
-    <w:p>
-      <w:pPr>
+        <w:t xml:space="preserve">Cloning an Existing </w:t>
+      </w:r>
+      <w:r>
+        <w:rPr>
+          <w:rFonts w:ascii="Times New Roman" w:hAnsi="Times New Roman" w:cs="Times New Roman"/>
+          <w:b/>
+          <w:bCs/>
+          <w:sz w:val="28"/>
+          <w:szCs w:val="28"/>
+        </w:rPr>
+        <w:t>Repository: - This</w:t>
+      </w:r>
+      <w:r>
         <w:rPr>
           <w:rFonts w:ascii="Times New Roman" w:hAnsi="Times New Roman" w:cs="Times New Roman"/>
           <w:sz w:val="24"/>
           <w:szCs w:val="24"/>
         </w:rPr>
-      </w:pPr>
-      <w:r>
-        <w:rPr>
-          <w:rFonts w:ascii="Times New Roman" w:hAnsi="Times New Roman" w:cs="Times New Roman"/>
-          <w:b/>
-          <w:bCs/>
-          <w:sz w:val="28"/>
-          <w:szCs w:val="28"/>
-        </w:rPr>
-        <w:t xml:space="preserve">Checking Repository </w:t>
-      </w:r>
-      <w:r>
-        <w:rPr>
-          <w:rFonts w:ascii="Times New Roman" w:hAnsi="Times New Roman" w:cs="Times New Roman"/>
-          <w:b/>
-          <w:bCs/>
-          <w:sz w:val="28"/>
-          <w:szCs w:val="28"/>
-        </w:rPr>
-        <w:t xml:space="preserve">Status: - </w:t>
-      </w:r>
-      <w:r>
-        <w:rPr>
-          <w:rFonts w:ascii="Times New Roman" w:hAnsi="Times New Roman" w:cs="Times New Roman"/>
-          <w:sz w:val="24"/>
-          <w:szCs w:val="24"/>
-        </w:rPr>
-        <w:t>Shows the current state of your repository (new, modified, staged files).</w:t>
+        <w:t xml:space="preserve"> copies a repository from GitHub to your local machine.</w:t>
       </w:r>
     </w:p>
     <w:p>
@@ -356,59 +301,9 @@
           <w:szCs w:val="36"/>
           <w:highlight w:val="green"/>
         </w:rPr>
-        <w:t>git status</w:t>
-      </w:r>
-    </w:p>
-    <w:p>
-      <w:pPr>
-        <w:jc w:val="center"/>
-        <w:rPr>
-          <w:rFonts w:ascii="Times New Roman" w:hAnsi="Times New Roman" w:cs="Times New Roman"/>
-          <w:sz w:val="36"/>
-          <w:szCs w:val="36"/>
-        </w:rPr>
-      </w:pPr>
-    </w:p>
-    <w:p>
-      <w:pPr>
-        <w:rPr>
-          <w:rFonts w:ascii="Times New Roman" w:hAnsi="Times New Roman" w:cs="Times New Roman"/>
-          <w:b/>
-          <w:bCs/>
-          <w:sz w:val="28"/>
-          <w:szCs w:val="28"/>
-        </w:rPr>
-      </w:pPr>
-      <w:r>
-        <w:rPr>
-          <w:rFonts w:ascii="Times New Roman" w:hAnsi="Times New Roman" w:cs="Times New Roman"/>
-          <w:b/>
-          <w:bCs/>
-          <w:sz w:val="28"/>
-          <w:szCs w:val="28"/>
-        </w:rPr>
-        <w:t xml:space="preserve">Adding Changes to Staging </w:t>
-      </w:r>
-      <w:r>
-        <w:rPr>
-          <w:rFonts w:ascii="Times New Roman" w:hAnsi="Times New Roman" w:cs="Times New Roman"/>
-          <w:b/>
-          <w:bCs/>
-          <w:sz w:val="28"/>
-          <w:szCs w:val="28"/>
-        </w:rPr>
-        <w:t>Area: -</w:t>
-      </w:r>
-    </w:p>
-    <w:p>
-      <w:pPr>
-        <w:jc w:val="center"/>
-        <w:rPr>
-          <w:rFonts w:ascii="Times New Roman" w:hAnsi="Times New Roman" w:cs="Times New Roman"/>
-          <w:sz w:val="36"/>
-          <w:szCs w:val="36"/>
-        </w:rPr>
-      </w:pPr>
+        <w:t>git clone &lt;</w:t>
+      </w:r>
+      <w:proofErr w:type="spellStart"/>
       <w:r>
         <w:rPr>
           <w:rFonts w:ascii="Times New Roman" w:hAnsi="Times New Roman" w:cs="Times New Roman"/>
@@ -416,25 +311,9 @@
           <w:szCs w:val="36"/>
           <w:highlight w:val="green"/>
         </w:rPr>
-        <w:t>git add &lt;filename&gt;      # Add a specific file</w:t>
-      </w:r>
-    </w:p>
-    <w:p>
-      <w:pPr>
-        <w:rPr>
-          <w:rFonts w:ascii="Times New Roman" w:hAnsi="Times New Roman" w:cs="Times New Roman"/>
-          <w:sz w:val="36"/>
-          <w:szCs w:val="36"/>
-        </w:rPr>
-      </w:pPr>
-      <w:r>
-        <w:rPr>
-          <w:rFonts w:ascii="Times New Roman" w:hAnsi="Times New Roman" w:cs="Times New Roman"/>
-          <w:sz w:val="36"/>
-          <w:szCs w:val="36"/>
-        </w:rPr>
-        <w:t xml:space="preserve">                        </w:t>
-      </w:r>
+        <w:t>repo_url</w:t>
+      </w:r>
+      <w:proofErr w:type="spellEnd"/>
       <w:r>
         <w:rPr>
           <w:rFonts w:ascii="Times New Roman" w:hAnsi="Times New Roman" w:cs="Times New Roman"/>
@@ -442,7 +321,179 @@
           <w:szCs w:val="36"/>
           <w:highlight w:val="green"/>
         </w:rPr>
-        <w:t>git add .              # Add all changes</w:t>
+        <w:t>&gt;</w:t>
+      </w:r>
+    </w:p>
+    <w:p>
+      <w:pPr>
+        <w:jc w:val="center"/>
+        <w:rPr>
+          <w:rFonts w:ascii="Times New Roman" w:hAnsi="Times New Roman" w:cs="Times New Roman"/>
+          <w:sz w:val="28"/>
+          <w:szCs w:val="28"/>
+        </w:rPr>
+      </w:pPr>
+    </w:p>
+    <w:p>
+      <w:pPr>
+        <w:rPr>
+          <w:rFonts w:ascii="Times New Roman" w:hAnsi="Times New Roman" w:cs="Times New Roman"/>
+          <w:sz w:val="24"/>
+          <w:szCs w:val="24"/>
+        </w:rPr>
+      </w:pPr>
+      <w:r>
+        <w:rPr>
+          <w:rFonts w:ascii="Times New Roman" w:hAnsi="Times New Roman" w:cs="Times New Roman"/>
+          <w:b/>
+          <w:bCs/>
+          <w:sz w:val="28"/>
+          <w:szCs w:val="28"/>
+        </w:rPr>
+        <w:t xml:space="preserve">Checking Repository </w:t>
+      </w:r>
+      <w:r>
+        <w:rPr>
+          <w:rFonts w:ascii="Times New Roman" w:hAnsi="Times New Roman" w:cs="Times New Roman"/>
+          <w:b/>
+          <w:bCs/>
+          <w:sz w:val="28"/>
+          <w:szCs w:val="28"/>
+        </w:rPr>
+        <w:t xml:space="preserve">Status: - </w:t>
+      </w:r>
+      <w:r>
+        <w:rPr>
+          <w:rFonts w:ascii="Times New Roman" w:hAnsi="Times New Roman" w:cs="Times New Roman"/>
+          <w:sz w:val="24"/>
+          <w:szCs w:val="24"/>
+        </w:rPr>
+        <w:t>Shows the current state of your repository (new, modified, staged files).</w:t>
+      </w:r>
+    </w:p>
+    <w:p>
+      <w:pPr>
+        <w:jc w:val="center"/>
+        <w:rPr>
+          <w:rFonts w:ascii="Times New Roman" w:hAnsi="Times New Roman" w:cs="Times New Roman"/>
+          <w:sz w:val="36"/>
+          <w:szCs w:val="36"/>
+        </w:rPr>
+      </w:pPr>
+      <w:r>
+        <w:rPr>
+          <w:rFonts w:ascii="Times New Roman" w:hAnsi="Times New Roman" w:cs="Times New Roman"/>
+          <w:sz w:val="36"/>
+          <w:szCs w:val="36"/>
+          <w:highlight w:val="green"/>
+        </w:rPr>
+        <w:t>git status</w:t>
+      </w:r>
+    </w:p>
+    <w:p>
+      <w:pPr>
+        <w:jc w:val="center"/>
+        <w:rPr>
+          <w:rFonts w:ascii="Times New Roman" w:hAnsi="Times New Roman" w:cs="Times New Roman"/>
+          <w:sz w:val="36"/>
+          <w:szCs w:val="36"/>
+        </w:rPr>
+      </w:pPr>
+    </w:p>
+    <w:p>
+      <w:pPr>
+        <w:rPr>
+          <w:rFonts w:ascii="Times New Roman" w:hAnsi="Times New Roman" w:cs="Times New Roman"/>
+          <w:b/>
+          <w:bCs/>
+          <w:sz w:val="28"/>
+          <w:szCs w:val="28"/>
+        </w:rPr>
+      </w:pPr>
+      <w:r>
+        <w:rPr>
+          <w:rFonts w:ascii="Times New Roman" w:hAnsi="Times New Roman" w:cs="Times New Roman"/>
+          <w:b/>
+          <w:bCs/>
+          <w:sz w:val="28"/>
+          <w:szCs w:val="28"/>
+        </w:rPr>
+        <w:t xml:space="preserve">Adding Changes to Staging </w:t>
+      </w:r>
+      <w:r>
+        <w:rPr>
+          <w:rFonts w:ascii="Times New Roman" w:hAnsi="Times New Roman" w:cs="Times New Roman"/>
+          <w:b/>
+          <w:bCs/>
+          <w:sz w:val="28"/>
+          <w:szCs w:val="28"/>
+        </w:rPr>
+        <w:t>Area: -</w:t>
+      </w:r>
+    </w:p>
+    <w:p>
+      <w:pPr>
+        <w:jc w:val="center"/>
+        <w:rPr>
+          <w:rFonts w:ascii="Times New Roman" w:hAnsi="Times New Roman" w:cs="Times New Roman"/>
+          <w:sz w:val="36"/>
+          <w:szCs w:val="36"/>
+        </w:rPr>
+      </w:pPr>
+      <w:r>
+        <w:rPr>
+          <w:rFonts w:ascii="Times New Roman" w:hAnsi="Times New Roman" w:cs="Times New Roman"/>
+          <w:sz w:val="36"/>
+          <w:szCs w:val="36"/>
+          <w:highlight w:val="green"/>
+        </w:rPr>
+        <w:t>git add &lt;filename&gt;      # Add a specific file</w:t>
+      </w:r>
+    </w:p>
+    <w:p>
+      <w:pPr>
+        <w:rPr>
+          <w:rFonts w:ascii="Times New Roman" w:hAnsi="Times New Roman" w:cs="Times New Roman"/>
+          <w:sz w:val="36"/>
+          <w:szCs w:val="36"/>
+        </w:rPr>
+      </w:pPr>
+      <w:r>
+        <w:rPr>
+          <w:rFonts w:ascii="Times New Roman" w:hAnsi="Times New Roman" w:cs="Times New Roman"/>
+          <w:sz w:val="36"/>
+          <w:szCs w:val="36"/>
+        </w:rPr>
+        <w:t xml:space="preserve">                        </w:t>
+      </w:r>
+      <w:r>
+        <w:rPr>
+          <w:rFonts w:ascii="Times New Roman" w:hAnsi="Times New Roman" w:cs="Times New Roman"/>
+          <w:sz w:val="36"/>
+          <w:szCs w:val="36"/>
+          <w:highlight w:val="green"/>
+        </w:rPr>
+        <w:t xml:space="preserve">git </w:t>
+      </w:r>
+      <w:proofErr w:type="gramStart"/>
+      <w:r>
+        <w:rPr>
+          <w:rFonts w:ascii="Times New Roman" w:hAnsi="Times New Roman" w:cs="Times New Roman"/>
+          <w:sz w:val="36"/>
+          <w:szCs w:val="36"/>
+          <w:highlight w:val="green"/>
+        </w:rPr>
+        <w:t>add .</w:t>
+      </w:r>
+      <w:proofErr w:type="gramEnd"/>
+      <w:r>
+        <w:rPr>
+          <w:rFonts w:ascii="Times New Roman" w:hAnsi="Times New Roman" w:cs="Times New Roman"/>
+          <w:sz w:val="36"/>
+          <w:szCs w:val="36"/>
+          <w:highlight w:val="green"/>
+        </w:rPr>
+        <w:t xml:space="preserve">              # Add all changes</w:t>
       </w:r>
     </w:p>
     <w:p>
@@ -933,7 +984,31 @@
           <w:szCs w:val="28"/>
           <w:highlight w:val="green"/>
         </w:rPr>
-        <w:t>git remote add origin &lt;repo_url&gt;</w:t>
+        <w:t>git remote add origin &lt;</w:t>
+      </w:r>
+      <w:proofErr w:type="spellStart"/>
+      <w:r>
+        <w:rPr>
+          <w:rFonts w:ascii="Times New Roman" w:hAnsi="Times New Roman" w:cs="Times New Roman"/>
+          <w:b/>
+          <w:bCs/>
+          <w:sz w:val="28"/>
+          <w:szCs w:val="28"/>
+          <w:highlight w:val="green"/>
+        </w:rPr>
+        <w:t>repo_url</w:t>
+      </w:r>
+      <w:proofErr w:type="spellEnd"/>
+      <w:r>
+        <w:rPr>
+          <w:rFonts w:ascii="Times New Roman" w:hAnsi="Times New Roman" w:cs="Times New Roman"/>
+          <w:b/>
+          <w:bCs/>
+          <w:sz w:val="28"/>
+          <w:szCs w:val="28"/>
+          <w:highlight w:val="green"/>
+        </w:rPr>
+        <w:t>&gt;</w:t>
       </w:r>
     </w:p>
     <w:p>
@@ -1251,7 +1326,27 @@
           <w:szCs w:val="28"/>
           <w:highlight w:val="green"/>
         </w:rPr>
-        <w:t>git add &lt;conflicted_file&gt;</w:t>
+        <w:t>git add &lt;</w:t>
+      </w:r>
+      <w:proofErr w:type="spellStart"/>
+      <w:r>
+        <w:rPr>
+          <w:rFonts w:ascii="Times New Roman" w:hAnsi="Times New Roman" w:cs="Times New Roman"/>
+          <w:sz w:val="28"/>
+          <w:szCs w:val="28"/>
+          <w:highlight w:val="green"/>
+        </w:rPr>
+        <w:t>conflicted_file</w:t>
+      </w:r>
+      <w:proofErr w:type="spellEnd"/>
+      <w:r>
+        <w:rPr>
+          <w:rFonts w:ascii="Times New Roman" w:hAnsi="Times New Roman" w:cs="Times New Roman"/>
+          <w:sz w:val="28"/>
+          <w:szCs w:val="28"/>
+          <w:highlight w:val="green"/>
+        </w:rPr>
+        <w:t>&gt;</w:t>
       </w:r>
     </w:p>
     <w:p>
@@ -1715,19 +1810,7 @@
               <w:rPr>
                 <w:rFonts w:ascii="Times New Roman" w:hAnsi="Times New Roman" w:cs="Times New Roman"/>
               </w:rPr>
-              <w:t xml:space="preserve">git </w:t>
-            </w:r>
-            <w:r>
-              <w:rPr>
-                <w:rFonts w:ascii="Times New Roman" w:hAnsi="Times New Roman" w:cs="Times New Roman"/>
-              </w:rPr>
-              <w:t>switch</w:t>
-            </w:r>
-            <w:r>
-              <w:rPr>
-                <w:rFonts w:ascii="Times New Roman" w:hAnsi="Times New Roman" w:cs="Times New Roman"/>
-              </w:rPr>
-              <w:t xml:space="preserve"> new-feature</w:t>
+              <w:t>git switch new-feature</w:t>
             </w:r>
           </w:p>
         </w:tc>
@@ -1810,8 +1893,16 @@
               <w:rPr>
                 <w:rFonts w:ascii="Times New Roman" w:hAnsi="Times New Roman" w:cs="Times New Roman"/>
               </w:rPr>
-              <w:t>git add .</w:t>
-            </w:r>
+              <w:t xml:space="preserve">git </w:t>
+            </w:r>
+            <w:proofErr w:type="gramStart"/>
+            <w:r>
+              <w:rPr>
+                <w:rFonts w:ascii="Times New Roman" w:hAnsi="Times New Roman" w:cs="Times New Roman"/>
+              </w:rPr>
+              <w:t>add .</w:t>
+            </w:r>
+            <w:proofErr w:type="gramEnd"/>
           </w:p>
           <w:p>
             <w:pPr>
@@ -2446,8 +2537,16 @@
               <w:rPr>
                 <w:rFonts w:ascii="Times New Roman" w:hAnsi="Times New Roman" w:cs="Times New Roman"/>
               </w:rPr>
-              <w:t>git add .</w:t>
-            </w:r>
+              <w:t xml:space="preserve">git </w:t>
+            </w:r>
+            <w:proofErr w:type="gramStart"/>
+            <w:r>
+              <w:rPr>
+                <w:rFonts w:ascii="Times New Roman" w:hAnsi="Times New Roman" w:cs="Times New Roman"/>
+              </w:rPr>
+              <w:t>add .</w:t>
+            </w:r>
+            <w:proofErr w:type="gramEnd"/>
           </w:p>
           <w:p>
             <w:pPr>
@@ -2509,39 +2608,2703 @@
           <w:rFonts w:ascii="Times New Roman" w:hAnsi="Times New Roman" w:cs="Times New Roman"/>
         </w:rPr>
       </w:pPr>
-      <w:r>
-        <w:rPr>
-          <w:rFonts w:ascii="Times New Roman" w:hAnsi="Times New Roman" w:cs="Times New Roman"/>
-        </w:rPr>
-        <w:t xml:space="preserve">Note:- </w:t>
-      </w:r>
-    </w:p>
-    <w:p>
-      <w:pPr>
-        <w:tabs>
-          <w:tab w:val="left" w:pos="2298"/>
-        </w:tabs>
-        <w:rPr>
-          <w:rFonts w:ascii="Times New Roman" w:hAnsi="Times New Roman" w:cs="Times New Roman"/>
-        </w:rPr>
-      </w:pPr>
-      <w:r>
-        <w:rPr>
-          <w:rFonts w:ascii="Times New Roman" w:hAnsi="Times New Roman" w:cs="Times New Roman"/>
-        </w:rPr>
-        <w:t>Pull after every merge to escape from merge conflit.</w:t>
-      </w:r>
-    </w:p>
-    <w:p>
-      <w:pPr>
-        <w:tabs>
-          <w:tab w:val="left" w:pos="2298"/>
-        </w:tabs>
-        <w:rPr>
-          <w:rFonts w:ascii="Times New Roman" w:hAnsi="Times New Roman" w:cs="Times New Roman"/>
-        </w:rPr>
-      </w:pPr>
-    </w:p>
+      <w:proofErr w:type="gramStart"/>
+      <w:r>
+        <w:rPr>
+          <w:rFonts w:ascii="Times New Roman" w:hAnsi="Times New Roman" w:cs="Times New Roman"/>
+        </w:rPr>
+        <w:t>Note:-</w:t>
+      </w:r>
+      <w:proofErr w:type="gramEnd"/>
+      <w:r>
+        <w:rPr>
+          <w:rFonts w:ascii="Times New Roman" w:hAnsi="Times New Roman" w:cs="Times New Roman"/>
+        </w:rPr>
+        <w:t xml:space="preserve"> </w:t>
+      </w:r>
+    </w:p>
+    <w:p>
+      <w:pPr>
+        <w:tabs>
+          <w:tab w:val="left" w:pos="2298"/>
+        </w:tabs>
+        <w:rPr>
+          <w:rFonts w:ascii="Times New Roman" w:hAnsi="Times New Roman" w:cs="Times New Roman"/>
+        </w:rPr>
+      </w:pPr>
+      <w:r>
+        <w:rPr>
+          <w:rFonts w:ascii="Times New Roman" w:hAnsi="Times New Roman" w:cs="Times New Roman"/>
+        </w:rPr>
+        <w:t xml:space="preserve">Pull after every merge to escape from merge </w:t>
+      </w:r>
+      <w:r>
+        <w:rPr>
+          <w:rFonts w:ascii="Times New Roman" w:hAnsi="Times New Roman" w:cs="Times New Roman"/>
+        </w:rPr>
+        <w:t>conflict</w:t>
+      </w:r>
+      <w:r>
+        <w:rPr>
+          <w:rFonts w:ascii="Times New Roman" w:hAnsi="Times New Roman" w:cs="Times New Roman"/>
+        </w:rPr>
+        <w:t>.</w:t>
+      </w:r>
+    </w:p>
+    <w:p>
+      <w:pPr>
+        <w:tabs>
+          <w:tab w:val="left" w:pos="2298"/>
+        </w:tabs>
+        <w:rPr>
+          <w:rFonts w:ascii="Times New Roman" w:hAnsi="Times New Roman" w:cs="Times New Roman"/>
+        </w:rPr>
+      </w:pPr>
+    </w:p>
+    <w:p>
+      <w:pPr>
+        <w:tabs>
+          <w:tab w:val="left" w:pos="2298"/>
+        </w:tabs>
+        <w:rPr>
+          <w:rFonts w:ascii="Times New Roman" w:hAnsi="Times New Roman" w:cs="Times New Roman"/>
+        </w:rPr>
+      </w:pPr>
+    </w:p>
+    <w:p>
+      <w:pPr>
+        <w:tabs>
+          <w:tab w:val="left" w:pos="2298"/>
+        </w:tabs>
+        <w:rPr>
+          <w:rFonts w:ascii="Times New Roman" w:hAnsi="Times New Roman" w:cs="Times New Roman"/>
+        </w:rPr>
+      </w:pPr>
+    </w:p>
+    <w:p>
+      <w:pPr>
+        <w:tabs>
+          <w:tab w:val="left" w:pos="2298"/>
+        </w:tabs>
+        <w:rPr>
+          <w:rFonts w:ascii="Times New Roman" w:hAnsi="Times New Roman" w:cs="Times New Roman"/>
+        </w:rPr>
+      </w:pPr>
+    </w:p>
+    <w:p>
+      <w:pPr>
+        <w:tabs>
+          <w:tab w:val="left" w:pos="2298"/>
+        </w:tabs>
+        <w:rPr>
+          <w:rFonts w:ascii="Times New Roman" w:hAnsi="Times New Roman" w:cs="Times New Roman"/>
+        </w:rPr>
+      </w:pPr>
+    </w:p>
+    <w:p>
+      <w:pPr>
+        <w:tabs>
+          <w:tab w:val="left" w:pos="2298"/>
+        </w:tabs>
+        <w:rPr>
+          <w:rFonts w:ascii="Times New Roman" w:hAnsi="Times New Roman" w:cs="Times New Roman"/>
+        </w:rPr>
+      </w:pPr>
+    </w:p>
+    <w:p>
+      <w:pPr>
+        <w:tabs>
+          <w:tab w:val="left" w:pos="2298"/>
+        </w:tabs>
+        <w:rPr>
+          <w:rFonts w:ascii="Times New Roman" w:hAnsi="Times New Roman" w:cs="Times New Roman"/>
+        </w:rPr>
+      </w:pPr>
+    </w:p>
+    <w:p>
+      <w:pPr>
+        <w:tabs>
+          <w:tab w:val="left" w:pos="2298"/>
+        </w:tabs>
+        <w:rPr>
+          <w:rFonts w:ascii="Times New Roman" w:hAnsi="Times New Roman" w:cs="Times New Roman"/>
+        </w:rPr>
+      </w:pPr>
+    </w:p>
+    <w:p>
+      <w:pPr>
+        <w:tabs>
+          <w:tab w:val="left" w:pos="2298"/>
+        </w:tabs>
+        <w:rPr>
+          <w:rFonts w:ascii="Times New Roman" w:hAnsi="Times New Roman" w:cs="Times New Roman"/>
+        </w:rPr>
+      </w:pPr>
+    </w:p>
+    <w:p>
+      <w:pPr>
+        <w:tabs>
+          <w:tab w:val="left" w:pos="2298"/>
+        </w:tabs>
+        <w:rPr>
+          <w:rFonts w:ascii="Times New Roman" w:hAnsi="Times New Roman" w:cs="Times New Roman"/>
+        </w:rPr>
+      </w:pPr>
+    </w:p>
+    <w:p>
+      <w:pPr>
+        <w:tabs>
+          <w:tab w:val="left" w:pos="2298"/>
+        </w:tabs>
+        <w:rPr>
+          <w:rFonts w:ascii="Times New Roman" w:hAnsi="Times New Roman" w:cs="Times New Roman"/>
+        </w:rPr>
+      </w:pPr>
+    </w:p>
+    <w:p>
+      <w:pPr>
+        <w:tabs>
+          <w:tab w:val="left" w:pos="2298"/>
+        </w:tabs>
+        <w:rPr>
+          <w:rFonts w:ascii="Times New Roman" w:hAnsi="Times New Roman" w:cs="Times New Roman"/>
+        </w:rPr>
+      </w:pPr>
+    </w:p>
+    <w:p>
+      <w:pPr>
+        <w:tabs>
+          <w:tab w:val="left" w:pos="2298"/>
+        </w:tabs>
+        <w:rPr>
+          <w:rFonts w:ascii="Times New Roman" w:hAnsi="Times New Roman" w:cs="Times New Roman"/>
+        </w:rPr>
+      </w:pPr>
+    </w:p>
+    <w:p>
+      <w:pPr>
+        <w:shd w:val="clear" w:color="auto" w:fill="ED7D31" w:themeFill="accent2"/>
+        <w:tabs>
+          <w:tab w:val="left" w:pos="2298"/>
+        </w:tabs>
+        <w:rPr>
+          <w:rFonts w:ascii="Times New Roman" w:hAnsi="Times New Roman" w:cs="Times New Roman"/>
+          <w:b/>
+          <w:bCs/>
+        </w:rPr>
+      </w:pPr>
+      <w:r>
+        <w:rPr>
+          <w:rFonts w:ascii="Times New Roman" w:hAnsi="Times New Roman" w:cs="Times New Roman"/>
+          <w:b/>
+          <w:bCs/>
+        </w:rPr>
+        <w:t>1. Setup &amp; Configuration</w:t>
+      </w:r>
+    </w:p>
+    <w:tbl>
+      <w:tblPr>
+        <w:tblStyle w:val="TableGrid"/>
+        <w:tblW w:w="0" w:type="auto"/>
+        <w:tblLook w:val="04A0" w:firstRow="1" w:lastRow="0" w:firstColumn="1" w:lastColumn="0" w:noHBand="0" w:noVBand="1"/>
+      </w:tblPr>
+      <w:tblGrid>
+        <w:gridCol w:w="10620"/>
+      </w:tblGrid>
+      <w:tr>
+        <w:tc>
+          <w:tcPr>
+            <w:tcW w:w="10620" w:type="dxa"/>
+            <w:shd w:val="clear" w:color="auto" w:fill="FFF2CC" w:themeFill="accent4" w:themeFillTint="33"/>
+          </w:tcPr>
+          <w:p>
+            <w:pPr>
+              <w:tabs>
+                <w:tab w:val="left" w:pos="2298"/>
+              </w:tabs>
+              <w:spacing w:after="160" w:line="259" w:lineRule="auto"/>
+              <w:rPr>
+                <w:rFonts w:ascii="Times New Roman" w:hAnsi="Times New Roman" w:cs="Times New Roman"/>
+              </w:rPr>
+            </w:pPr>
+            <w:r>
+              <w:rPr>
+                <w:rFonts w:ascii="Times New Roman" w:hAnsi="Times New Roman" w:cs="Times New Roman"/>
+              </w:rPr>
+              <w:t>git config --global user.name "Your Name"</w:t>
+            </w:r>
+          </w:p>
+          <w:p>
+            <w:pPr>
+              <w:tabs>
+                <w:tab w:val="left" w:pos="2298"/>
+              </w:tabs>
+              <w:spacing w:after="160" w:line="259" w:lineRule="auto"/>
+              <w:rPr>
+                <w:rFonts w:ascii="Times New Roman" w:hAnsi="Times New Roman" w:cs="Times New Roman"/>
+              </w:rPr>
+            </w:pPr>
+            <w:r>
+              <w:rPr>
+                <w:rFonts w:ascii="Times New Roman" w:hAnsi="Times New Roman" w:cs="Times New Roman"/>
+              </w:rPr>
+              <w:t xml:space="preserve">git config --global </w:t>
+            </w:r>
+            <w:proofErr w:type="spellStart"/>
+            <w:proofErr w:type="gramStart"/>
+            <w:r>
+              <w:rPr>
+                <w:rFonts w:ascii="Times New Roman" w:hAnsi="Times New Roman" w:cs="Times New Roman"/>
+              </w:rPr>
+              <w:t>user.email</w:t>
+            </w:r>
+            <w:proofErr w:type="spellEnd"/>
+            <w:proofErr w:type="gramEnd"/>
+            <w:r>
+              <w:rPr>
+                <w:rFonts w:ascii="Times New Roman" w:hAnsi="Times New Roman" w:cs="Times New Roman"/>
+              </w:rPr>
+              <w:t xml:space="preserve"> "your.email@example.com"</w:t>
+            </w:r>
+          </w:p>
+          <w:p>
+            <w:pPr>
+              <w:tabs>
+                <w:tab w:val="left" w:pos="2298"/>
+              </w:tabs>
+              <w:spacing w:after="160" w:line="259" w:lineRule="auto"/>
+              <w:rPr>
+                <w:rFonts w:ascii="Times New Roman" w:hAnsi="Times New Roman" w:cs="Times New Roman"/>
+              </w:rPr>
+            </w:pPr>
+            <w:r>
+              <w:rPr>
+                <w:rFonts w:ascii="Times New Roman" w:hAnsi="Times New Roman" w:cs="Times New Roman"/>
+              </w:rPr>
+              <w:t xml:space="preserve">git config --global </w:t>
+            </w:r>
+            <w:proofErr w:type="spellStart"/>
+            <w:proofErr w:type="gramStart"/>
+            <w:r>
+              <w:rPr>
+                <w:rFonts w:ascii="Times New Roman" w:hAnsi="Times New Roman" w:cs="Times New Roman"/>
+              </w:rPr>
+              <w:t>init.defaultBranch</w:t>
+            </w:r>
+            <w:proofErr w:type="spellEnd"/>
+            <w:proofErr w:type="gramEnd"/>
+            <w:r>
+              <w:rPr>
+                <w:rFonts w:ascii="Times New Roman" w:hAnsi="Times New Roman" w:cs="Times New Roman"/>
+              </w:rPr>
+              <w:t xml:space="preserve"> main</w:t>
+            </w:r>
+          </w:p>
+        </w:tc>
+      </w:tr>
+    </w:tbl>
+    <w:p>
+      <w:pPr>
+        <w:tabs>
+          <w:tab w:val="left" w:pos="2298"/>
+        </w:tabs>
+        <w:rPr>
+          <w:rFonts w:ascii="Times New Roman" w:hAnsi="Times New Roman" w:cs="Times New Roman"/>
+        </w:rPr>
+      </w:pPr>
+    </w:p>
+    <w:p>
+      <w:pPr>
+        <w:shd w:val="clear" w:color="auto" w:fill="ED7D31" w:themeFill="accent2"/>
+        <w:tabs>
+          <w:tab w:val="left" w:pos="2298"/>
+        </w:tabs>
+        <w:rPr>
+          <w:rFonts w:ascii="Times New Roman" w:hAnsi="Times New Roman" w:cs="Times New Roman"/>
+          <w:b/>
+          <w:bCs/>
+        </w:rPr>
+      </w:pPr>
+      <w:r>
+        <w:rPr>
+          <w:rFonts w:ascii="Times New Roman" w:hAnsi="Times New Roman" w:cs="Times New Roman"/>
+          <w:b/>
+          <w:bCs/>
+        </w:rPr>
+        <w:t>2. Initialize a Repository</w:t>
+      </w:r>
+    </w:p>
+    <w:tbl>
+      <w:tblPr>
+        <w:tblStyle w:val="TableGrid"/>
+        <w:tblW w:w="0" w:type="auto"/>
+        <w:tblLook w:val="04A0" w:firstRow="1" w:lastRow="0" w:firstColumn="1" w:lastColumn="0" w:noHBand="0" w:noVBand="1"/>
+      </w:tblPr>
+      <w:tblGrid>
+        <w:gridCol w:w="10620"/>
+      </w:tblGrid>
+      <w:tr>
+        <w:tc>
+          <w:tcPr>
+            <w:tcW w:w="10620" w:type="dxa"/>
+            <w:shd w:val="clear" w:color="auto" w:fill="FFF2CC" w:themeFill="accent4" w:themeFillTint="33"/>
+          </w:tcPr>
+          <w:p>
+            <w:pPr>
+              <w:tabs>
+                <w:tab w:val="left" w:pos="2298"/>
+              </w:tabs>
+              <w:spacing w:after="160" w:line="259" w:lineRule="auto"/>
+              <w:rPr>
+                <w:rFonts w:ascii="Times New Roman" w:hAnsi="Times New Roman" w:cs="Times New Roman"/>
+              </w:rPr>
+            </w:pPr>
+            <w:r>
+              <w:rPr>
+                <w:rFonts w:ascii="Times New Roman" w:hAnsi="Times New Roman" w:cs="Times New Roman"/>
+              </w:rPr>
+              <w:t xml:space="preserve">git </w:t>
+            </w:r>
+            <w:proofErr w:type="spellStart"/>
+            <w:r>
+              <w:rPr>
+                <w:rFonts w:ascii="Times New Roman" w:hAnsi="Times New Roman" w:cs="Times New Roman"/>
+              </w:rPr>
+              <w:t>init</w:t>
+            </w:r>
+            <w:proofErr w:type="spellEnd"/>
+          </w:p>
+        </w:tc>
+      </w:tr>
+    </w:tbl>
+    <w:p>
+      <w:pPr>
+        <w:tabs>
+          <w:tab w:val="left" w:pos="2298"/>
+        </w:tabs>
+        <w:rPr>
+          <w:rFonts w:ascii="Times New Roman" w:hAnsi="Times New Roman" w:cs="Times New Roman"/>
+          <w:i/>
+          <w:iCs/>
+        </w:rPr>
+      </w:pPr>
+    </w:p>
+    <w:p>
+      <w:pPr>
+        <w:tabs>
+          <w:tab w:val="left" w:pos="2298"/>
+        </w:tabs>
+        <w:rPr>
+          <w:rFonts w:ascii="Times New Roman" w:hAnsi="Times New Roman" w:cs="Times New Roman"/>
+        </w:rPr>
+      </w:pPr>
+      <w:r>
+        <w:rPr>
+          <w:rFonts w:ascii="Times New Roman" w:hAnsi="Times New Roman" w:cs="Times New Roman"/>
+          <w:i/>
+          <w:iCs/>
+        </w:rPr>
+        <w:t>(Run this in the project folder to initialize a new Git repository.)</w:t>
+      </w:r>
+    </w:p>
+    <w:p>
+      <w:pPr>
+        <w:shd w:val="clear" w:color="auto" w:fill="ED7D31" w:themeFill="accent2"/>
+        <w:tabs>
+          <w:tab w:val="left" w:pos="2298"/>
+        </w:tabs>
+        <w:rPr>
+          <w:rFonts w:ascii="Times New Roman" w:hAnsi="Times New Roman" w:cs="Times New Roman"/>
+          <w:b/>
+          <w:bCs/>
+        </w:rPr>
+      </w:pPr>
+      <w:r>
+        <w:rPr>
+          <w:rFonts w:ascii="Times New Roman" w:hAnsi="Times New Roman" w:cs="Times New Roman"/>
+          <w:b/>
+          <w:bCs/>
+        </w:rPr>
+        <w:t>3. Check Repository Status</w:t>
+      </w:r>
+    </w:p>
+    <w:tbl>
+      <w:tblPr>
+        <w:tblStyle w:val="TableGrid"/>
+        <w:tblW w:w="0" w:type="auto"/>
+        <w:tblLook w:val="04A0" w:firstRow="1" w:lastRow="0" w:firstColumn="1" w:lastColumn="0" w:noHBand="0" w:noVBand="1"/>
+      </w:tblPr>
+      <w:tblGrid>
+        <w:gridCol w:w="10620"/>
+      </w:tblGrid>
+      <w:tr>
+        <w:tc>
+          <w:tcPr>
+            <w:tcW w:w="10620" w:type="dxa"/>
+            <w:shd w:val="clear" w:color="auto" w:fill="FFF2CC" w:themeFill="accent4" w:themeFillTint="33"/>
+          </w:tcPr>
+          <w:p>
+            <w:pPr>
+              <w:tabs>
+                <w:tab w:val="left" w:pos="2298"/>
+              </w:tabs>
+              <w:spacing w:after="160" w:line="259" w:lineRule="auto"/>
+              <w:rPr>
+                <w:rFonts w:ascii="Times New Roman" w:hAnsi="Times New Roman" w:cs="Times New Roman"/>
+              </w:rPr>
+            </w:pPr>
+            <w:r>
+              <w:rPr>
+                <w:rFonts w:ascii="Times New Roman" w:hAnsi="Times New Roman" w:cs="Times New Roman"/>
+              </w:rPr>
+              <w:t>git status</w:t>
+            </w:r>
+          </w:p>
+        </w:tc>
+      </w:tr>
+    </w:tbl>
+    <w:p>
+      <w:pPr>
+        <w:tabs>
+          <w:tab w:val="left" w:pos="2298"/>
+        </w:tabs>
+        <w:rPr>
+          <w:rFonts w:ascii="Times New Roman" w:hAnsi="Times New Roman" w:cs="Times New Roman"/>
+        </w:rPr>
+      </w:pPr>
+      <w:r>
+        <w:rPr>
+          <w:rFonts w:ascii="Times New Roman" w:hAnsi="Times New Roman" w:cs="Times New Roman"/>
+          <w:i/>
+          <w:iCs/>
+        </w:rPr>
+        <w:t>(Shows changes, staged files, and untracked files.)</w:t>
+      </w:r>
+    </w:p>
+    <w:p>
+      <w:pPr>
+        <w:shd w:val="clear" w:color="auto" w:fill="ED7D31" w:themeFill="accent2"/>
+        <w:tabs>
+          <w:tab w:val="left" w:pos="2298"/>
+        </w:tabs>
+        <w:rPr>
+          <w:rFonts w:ascii="Times New Roman" w:hAnsi="Times New Roman" w:cs="Times New Roman"/>
+          <w:b/>
+          <w:bCs/>
+        </w:rPr>
+      </w:pPr>
+      <w:r>
+        <w:rPr>
+          <w:rFonts w:ascii="Times New Roman" w:hAnsi="Times New Roman" w:cs="Times New Roman"/>
+          <w:b/>
+          <w:bCs/>
+        </w:rPr>
+        <w:t>4. Staging &amp; Committing Changes</w:t>
+      </w:r>
+    </w:p>
+    <w:tbl>
+      <w:tblPr>
+        <w:tblStyle w:val="TableGrid"/>
+        <w:tblW w:w="0" w:type="auto"/>
+        <w:tblLook w:val="04A0" w:firstRow="1" w:lastRow="0" w:firstColumn="1" w:lastColumn="0" w:noHBand="0" w:noVBand="1"/>
+      </w:tblPr>
+      <w:tblGrid>
+        <w:gridCol w:w="10620"/>
+      </w:tblGrid>
+      <w:tr>
+        <w:tc>
+          <w:tcPr>
+            <w:tcW w:w="10620" w:type="dxa"/>
+            <w:shd w:val="clear" w:color="auto" w:fill="FFF2CC" w:themeFill="accent4" w:themeFillTint="33"/>
+          </w:tcPr>
+          <w:p>
+            <w:pPr>
+              <w:tabs>
+                <w:tab w:val="left" w:pos="2298"/>
+              </w:tabs>
+              <w:spacing w:after="160" w:line="259" w:lineRule="auto"/>
+              <w:rPr>
+                <w:rFonts w:ascii="Times New Roman" w:hAnsi="Times New Roman" w:cs="Times New Roman"/>
+              </w:rPr>
+            </w:pPr>
+            <w:r>
+              <w:rPr>
+                <w:rFonts w:ascii="Times New Roman" w:hAnsi="Times New Roman" w:cs="Times New Roman"/>
+              </w:rPr>
+              <w:t xml:space="preserve">git </w:t>
+            </w:r>
+            <w:proofErr w:type="gramStart"/>
+            <w:r>
+              <w:rPr>
+                <w:rFonts w:ascii="Times New Roman" w:hAnsi="Times New Roman" w:cs="Times New Roman"/>
+              </w:rPr>
+              <w:t>add .</w:t>
+            </w:r>
+            <w:proofErr w:type="gramEnd"/>
+            <w:r>
+              <w:rPr>
+                <w:rFonts w:ascii="Times New Roman" w:hAnsi="Times New Roman" w:cs="Times New Roman"/>
+              </w:rPr>
+              <w:t xml:space="preserve">          # Adds all modified/new files to staging</w:t>
+            </w:r>
+          </w:p>
+          <w:p>
+            <w:pPr>
+              <w:tabs>
+                <w:tab w:val="left" w:pos="2298"/>
+              </w:tabs>
+              <w:spacing w:after="160" w:line="259" w:lineRule="auto"/>
+              <w:rPr>
+                <w:rFonts w:ascii="Times New Roman" w:hAnsi="Times New Roman" w:cs="Times New Roman"/>
+              </w:rPr>
+            </w:pPr>
+            <w:r>
+              <w:rPr>
+                <w:rFonts w:ascii="Times New Roman" w:hAnsi="Times New Roman" w:cs="Times New Roman"/>
+              </w:rPr>
+              <w:t>git add filename   # Adds a specific file to staging</w:t>
+            </w:r>
+          </w:p>
+          <w:p>
+            <w:pPr>
+              <w:tabs>
+                <w:tab w:val="left" w:pos="2298"/>
+              </w:tabs>
+              <w:spacing w:after="160" w:line="259" w:lineRule="auto"/>
+              <w:rPr>
+                <w:rFonts w:ascii="Times New Roman" w:hAnsi="Times New Roman" w:cs="Times New Roman"/>
+              </w:rPr>
+            </w:pPr>
+            <w:r>
+              <w:rPr>
+                <w:rFonts w:ascii="Times New Roman" w:hAnsi="Times New Roman" w:cs="Times New Roman"/>
+              </w:rPr>
+              <w:t>git commit -m "Your commit message"</w:t>
+            </w:r>
+          </w:p>
+        </w:tc>
+      </w:tr>
+    </w:tbl>
+    <w:p>
+      <w:pPr>
+        <w:tabs>
+          <w:tab w:val="left" w:pos="2298"/>
+        </w:tabs>
+        <w:rPr>
+          <w:rFonts w:ascii="Times New Roman" w:hAnsi="Times New Roman" w:cs="Times New Roman"/>
+        </w:rPr>
+      </w:pPr>
+      <w:r>
+        <w:rPr>
+          <w:rFonts w:ascii="Times New Roman" w:hAnsi="Times New Roman" w:cs="Times New Roman"/>
+          <w:i/>
+          <w:iCs/>
+        </w:rPr>
+        <w:t>(Commits changes with a message.)</w:t>
+      </w:r>
+    </w:p>
+    <w:p>
+      <w:pPr>
+        <w:shd w:val="clear" w:color="auto" w:fill="ED7D31" w:themeFill="accent2"/>
+        <w:tabs>
+          <w:tab w:val="left" w:pos="2298"/>
+        </w:tabs>
+        <w:rPr>
+          <w:rFonts w:ascii="Times New Roman" w:hAnsi="Times New Roman" w:cs="Times New Roman"/>
+          <w:b/>
+          <w:bCs/>
+        </w:rPr>
+      </w:pPr>
+      <w:r>
+        <w:rPr>
+          <w:rFonts w:ascii="Times New Roman" w:hAnsi="Times New Roman" w:cs="Times New Roman"/>
+          <w:b/>
+          <w:bCs/>
+        </w:rPr>
+        <w:t>5. Working with Branches</w:t>
+      </w:r>
+    </w:p>
+    <w:tbl>
+      <w:tblPr>
+        <w:tblStyle w:val="TableGrid"/>
+        <w:tblW w:w="0" w:type="auto"/>
+        <w:tblLook w:val="04A0" w:firstRow="1" w:lastRow="0" w:firstColumn="1" w:lastColumn="0" w:noHBand="0" w:noVBand="1"/>
+      </w:tblPr>
+      <w:tblGrid>
+        <w:gridCol w:w="10620"/>
+      </w:tblGrid>
+      <w:tr>
+        <w:tc>
+          <w:tcPr>
+            <w:tcW w:w="10620" w:type="dxa"/>
+            <w:shd w:val="clear" w:color="auto" w:fill="FFF2CC" w:themeFill="accent4" w:themeFillTint="33"/>
+          </w:tcPr>
+          <w:p>
+            <w:pPr>
+              <w:tabs>
+                <w:tab w:val="left" w:pos="2298"/>
+              </w:tabs>
+              <w:spacing w:after="160" w:line="259" w:lineRule="auto"/>
+              <w:rPr>
+                <w:rFonts w:ascii="Times New Roman" w:hAnsi="Times New Roman" w:cs="Times New Roman"/>
+              </w:rPr>
+            </w:pPr>
+            <w:r>
+              <w:rPr>
+                <w:rFonts w:ascii="Times New Roman" w:hAnsi="Times New Roman" w:cs="Times New Roman"/>
+              </w:rPr>
+              <w:t xml:space="preserve">git branch              # Lists all branches  </w:t>
+            </w:r>
+          </w:p>
+          <w:p>
+            <w:pPr>
+              <w:tabs>
+                <w:tab w:val="left" w:pos="2298"/>
+              </w:tabs>
+              <w:spacing w:after="160" w:line="259" w:lineRule="auto"/>
+              <w:rPr>
+                <w:rFonts w:ascii="Times New Roman" w:hAnsi="Times New Roman" w:cs="Times New Roman"/>
+              </w:rPr>
+            </w:pPr>
+            <w:r>
+              <w:rPr>
+                <w:rFonts w:ascii="Times New Roman" w:hAnsi="Times New Roman" w:cs="Times New Roman"/>
+              </w:rPr>
+              <w:t xml:space="preserve">git branch new-branch   # Creates a new branch  </w:t>
+            </w:r>
+          </w:p>
+          <w:p>
+            <w:pPr>
+              <w:tabs>
+                <w:tab w:val="left" w:pos="2298"/>
+              </w:tabs>
+              <w:spacing w:after="160" w:line="259" w:lineRule="auto"/>
+              <w:rPr>
+                <w:rFonts w:ascii="Times New Roman" w:hAnsi="Times New Roman" w:cs="Times New Roman"/>
+              </w:rPr>
+            </w:pPr>
+            <w:r>
+              <w:rPr>
+                <w:rFonts w:ascii="Times New Roman" w:hAnsi="Times New Roman" w:cs="Times New Roman"/>
+              </w:rPr>
+              <w:t xml:space="preserve">git checkout new-branch # Switches to the new branch  </w:t>
+            </w:r>
+          </w:p>
+          <w:p>
+            <w:pPr>
+              <w:tabs>
+                <w:tab w:val="left" w:pos="2298"/>
+              </w:tabs>
+              <w:spacing w:after="160" w:line="259" w:lineRule="auto"/>
+              <w:rPr>
+                <w:rFonts w:ascii="Times New Roman" w:hAnsi="Times New Roman" w:cs="Times New Roman"/>
+              </w:rPr>
+            </w:pPr>
+            <w:r>
+              <w:rPr>
+                <w:rFonts w:ascii="Times New Roman" w:hAnsi="Times New Roman" w:cs="Times New Roman"/>
+              </w:rPr>
+              <w:t>git checkout -b new-</w:t>
+            </w:r>
+            <w:proofErr w:type="gramStart"/>
+            <w:r>
+              <w:rPr>
+                <w:rFonts w:ascii="Times New Roman" w:hAnsi="Times New Roman" w:cs="Times New Roman"/>
+              </w:rPr>
+              <w:t>branch  #</w:t>
+            </w:r>
+            <w:proofErr w:type="gramEnd"/>
+            <w:r>
+              <w:rPr>
+                <w:rFonts w:ascii="Times New Roman" w:hAnsi="Times New Roman" w:cs="Times New Roman"/>
+              </w:rPr>
+              <w:t xml:space="preserve"> Creates and switches to new branch  </w:t>
+            </w:r>
+          </w:p>
+          <w:p>
+            <w:pPr>
+              <w:tabs>
+                <w:tab w:val="left" w:pos="2298"/>
+              </w:tabs>
+              <w:spacing w:after="160" w:line="259" w:lineRule="auto"/>
+              <w:rPr>
+                <w:rFonts w:ascii="Times New Roman" w:hAnsi="Times New Roman" w:cs="Times New Roman"/>
+              </w:rPr>
+            </w:pPr>
+            <w:r>
+              <w:rPr>
+                <w:rFonts w:ascii="Times New Roman" w:hAnsi="Times New Roman" w:cs="Times New Roman"/>
+              </w:rPr>
+              <w:t xml:space="preserve">git branch -d new-branch    # Deletes a branch  </w:t>
+            </w:r>
+          </w:p>
+        </w:tc>
+      </w:tr>
+    </w:tbl>
+    <w:p>
+      <w:pPr>
+        <w:tabs>
+          <w:tab w:val="left" w:pos="2298"/>
+        </w:tabs>
+        <w:rPr>
+          <w:rFonts w:ascii="Times New Roman" w:hAnsi="Times New Roman" w:cs="Times New Roman"/>
+        </w:rPr>
+      </w:pPr>
+    </w:p>
+    <w:p>
+      <w:pPr>
+        <w:shd w:val="clear" w:color="auto" w:fill="ED7D31" w:themeFill="accent2"/>
+        <w:tabs>
+          <w:tab w:val="left" w:pos="2298"/>
+        </w:tabs>
+        <w:rPr>
+          <w:rFonts w:ascii="Times New Roman" w:hAnsi="Times New Roman" w:cs="Times New Roman"/>
+          <w:b/>
+          <w:bCs/>
+        </w:rPr>
+      </w:pPr>
+      <w:r>
+        <w:rPr>
+          <w:rFonts w:ascii="Times New Roman" w:hAnsi="Times New Roman" w:cs="Times New Roman"/>
+          <w:b/>
+          <w:bCs/>
+        </w:rPr>
+        <w:t>6. Pushing to GitHub</w:t>
+      </w:r>
+    </w:p>
+    <w:tbl>
+      <w:tblPr>
+        <w:tblStyle w:val="TableGrid"/>
+        <w:tblW w:w="0" w:type="auto"/>
+        <w:tblLook w:val="04A0" w:firstRow="1" w:lastRow="0" w:firstColumn="1" w:lastColumn="0" w:noHBand="0" w:noVBand="1"/>
+      </w:tblPr>
+      <w:tblGrid>
+        <w:gridCol w:w="10620"/>
+      </w:tblGrid>
+      <w:tr>
+        <w:tc>
+          <w:tcPr>
+            <w:tcW w:w="10620" w:type="dxa"/>
+            <w:shd w:val="clear" w:color="auto" w:fill="FFF2CC" w:themeFill="accent4" w:themeFillTint="33"/>
+          </w:tcPr>
+          <w:p>
+            <w:pPr>
+              <w:tabs>
+                <w:tab w:val="left" w:pos="2298"/>
+              </w:tabs>
+              <w:spacing w:after="160" w:line="259" w:lineRule="auto"/>
+              <w:rPr>
+                <w:rFonts w:ascii="Times New Roman" w:hAnsi="Times New Roman" w:cs="Times New Roman"/>
+              </w:rPr>
+            </w:pPr>
+            <w:r>
+              <w:rPr>
+                <w:rFonts w:ascii="Times New Roman" w:hAnsi="Times New Roman" w:cs="Times New Roman"/>
+              </w:rPr>
+              <w:t xml:space="preserve">git remote add origin </w:t>
+            </w:r>
+            <w:proofErr w:type="gramStart"/>
+            <w:r>
+              <w:rPr>
+                <w:rFonts w:ascii="Times New Roman" w:hAnsi="Times New Roman" w:cs="Times New Roman"/>
+              </w:rPr>
+              <w:t>https://github.com/your-username/repository-name.git  #</w:t>
+            </w:r>
+            <w:proofErr w:type="gramEnd"/>
+            <w:r>
+              <w:rPr>
+                <w:rFonts w:ascii="Times New Roman" w:hAnsi="Times New Roman" w:cs="Times New Roman"/>
+              </w:rPr>
+              <w:t xml:space="preserve"> Connect to GitHub  </w:t>
+            </w:r>
+          </w:p>
+          <w:p>
+            <w:pPr>
+              <w:tabs>
+                <w:tab w:val="left" w:pos="2298"/>
+              </w:tabs>
+              <w:spacing w:after="160" w:line="259" w:lineRule="auto"/>
+              <w:rPr>
+                <w:rFonts w:ascii="Times New Roman" w:hAnsi="Times New Roman" w:cs="Times New Roman"/>
+              </w:rPr>
+            </w:pPr>
+            <w:r>
+              <w:rPr>
+                <w:rFonts w:ascii="Times New Roman" w:hAnsi="Times New Roman" w:cs="Times New Roman"/>
+              </w:rPr>
+              <w:t xml:space="preserve">git push -u origin </w:t>
+            </w:r>
+            <w:proofErr w:type="gramStart"/>
+            <w:r>
+              <w:rPr>
+                <w:rFonts w:ascii="Times New Roman" w:hAnsi="Times New Roman" w:cs="Times New Roman"/>
+              </w:rPr>
+              <w:t>main  #</w:t>
+            </w:r>
+            <w:proofErr w:type="gramEnd"/>
+            <w:r>
+              <w:rPr>
+                <w:rFonts w:ascii="Times New Roman" w:hAnsi="Times New Roman" w:cs="Times New Roman"/>
+              </w:rPr>
+              <w:t xml:space="preserve"> Push code to GitHub  </w:t>
+            </w:r>
+          </w:p>
+        </w:tc>
+      </w:tr>
+    </w:tbl>
+    <w:p>
+      <w:pPr>
+        <w:tabs>
+          <w:tab w:val="left" w:pos="2298"/>
+        </w:tabs>
+        <w:rPr>
+          <w:rFonts w:ascii="Times New Roman" w:hAnsi="Times New Roman" w:cs="Times New Roman"/>
+        </w:rPr>
+      </w:pPr>
+      <w:r>
+        <w:rPr>
+          <w:rFonts w:ascii="Times New Roman" w:hAnsi="Times New Roman" w:cs="Times New Roman"/>
+          <w:i/>
+          <w:iCs/>
+        </w:rPr>
+        <w:t>(First-time push: -u tracks the remote branch.)</w:t>
+      </w:r>
+    </w:p>
+    <w:p>
+      <w:pPr>
+        <w:shd w:val="clear" w:color="auto" w:fill="ED7D31" w:themeFill="accent2"/>
+        <w:tabs>
+          <w:tab w:val="left" w:pos="2298"/>
+        </w:tabs>
+        <w:rPr>
+          <w:rFonts w:ascii="Times New Roman" w:hAnsi="Times New Roman" w:cs="Times New Roman"/>
+          <w:b/>
+          <w:bCs/>
+        </w:rPr>
+      </w:pPr>
+      <w:r>
+        <w:rPr>
+          <w:rFonts w:ascii="Times New Roman" w:hAnsi="Times New Roman" w:cs="Times New Roman"/>
+          <w:b/>
+          <w:bCs/>
+        </w:rPr>
+        <w:t>7. Pulling &amp; Fetching Updates</w:t>
+      </w:r>
+    </w:p>
+    <w:tbl>
+      <w:tblPr>
+        <w:tblStyle w:val="TableGrid"/>
+        <w:tblW w:w="0" w:type="auto"/>
+        <w:tblLook w:val="04A0" w:firstRow="1" w:lastRow="0" w:firstColumn="1" w:lastColumn="0" w:noHBand="0" w:noVBand="1"/>
+      </w:tblPr>
+      <w:tblGrid>
+        <w:gridCol w:w="10620"/>
+      </w:tblGrid>
+      <w:tr>
+        <w:tc>
+          <w:tcPr>
+            <w:tcW w:w="10620" w:type="dxa"/>
+            <w:shd w:val="clear" w:color="auto" w:fill="FFF2CC" w:themeFill="accent4" w:themeFillTint="33"/>
+          </w:tcPr>
+          <w:p>
+            <w:pPr>
+              <w:tabs>
+                <w:tab w:val="left" w:pos="2298"/>
+              </w:tabs>
+              <w:spacing w:after="160" w:line="259" w:lineRule="auto"/>
+              <w:rPr>
+                <w:rFonts w:ascii="Times New Roman" w:hAnsi="Times New Roman" w:cs="Times New Roman"/>
+              </w:rPr>
+            </w:pPr>
+            <w:r>
+              <w:rPr>
+                <w:rFonts w:ascii="Times New Roman" w:hAnsi="Times New Roman" w:cs="Times New Roman"/>
+              </w:rPr>
+              <w:t xml:space="preserve">git pull origin </w:t>
+            </w:r>
+            <w:proofErr w:type="gramStart"/>
+            <w:r>
+              <w:rPr>
+                <w:rFonts w:ascii="Times New Roman" w:hAnsi="Times New Roman" w:cs="Times New Roman"/>
+              </w:rPr>
+              <w:t>main  #</w:t>
+            </w:r>
+            <w:proofErr w:type="gramEnd"/>
+            <w:r>
+              <w:rPr>
+                <w:rFonts w:ascii="Times New Roman" w:hAnsi="Times New Roman" w:cs="Times New Roman"/>
+              </w:rPr>
+              <w:t xml:space="preserve"> Pulls latest changes from GitHub  </w:t>
+            </w:r>
+          </w:p>
+          <w:p>
+            <w:pPr>
+              <w:tabs>
+                <w:tab w:val="left" w:pos="2298"/>
+              </w:tabs>
+              <w:spacing w:after="160" w:line="259" w:lineRule="auto"/>
+              <w:rPr>
+                <w:rFonts w:ascii="Times New Roman" w:hAnsi="Times New Roman" w:cs="Times New Roman"/>
+              </w:rPr>
+            </w:pPr>
+            <w:r>
+              <w:rPr>
+                <w:rFonts w:ascii="Times New Roman" w:hAnsi="Times New Roman" w:cs="Times New Roman"/>
+              </w:rPr>
+              <w:t xml:space="preserve">git fetch origin      # Fetches updates without merging  </w:t>
+            </w:r>
+          </w:p>
+        </w:tc>
+      </w:tr>
+    </w:tbl>
+    <w:p>
+      <w:pPr>
+        <w:tabs>
+          <w:tab w:val="left" w:pos="2298"/>
+        </w:tabs>
+        <w:rPr>
+          <w:rFonts w:ascii="Times New Roman" w:hAnsi="Times New Roman" w:cs="Times New Roman"/>
+        </w:rPr>
+      </w:pPr>
+    </w:p>
+    <w:p>
+      <w:pPr>
+        <w:shd w:val="clear" w:color="auto" w:fill="ED7D31" w:themeFill="accent2"/>
+        <w:tabs>
+          <w:tab w:val="left" w:pos="2298"/>
+        </w:tabs>
+        <w:rPr>
+          <w:rFonts w:ascii="Times New Roman" w:hAnsi="Times New Roman" w:cs="Times New Roman"/>
+          <w:b/>
+          <w:bCs/>
+        </w:rPr>
+      </w:pPr>
+      <w:r>
+        <w:rPr>
+          <w:rFonts w:ascii="Times New Roman" w:hAnsi="Times New Roman" w:cs="Times New Roman"/>
+          <w:b/>
+          <w:bCs/>
+        </w:rPr>
+        <w:t>8. Viewing Commit History</w:t>
+      </w:r>
+    </w:p>
+    <w:tbl>
+      <w:tblPr>
+        <w:tblStyle w:val="TableGrid"/>
+        <w:tblW w:w="0" w:type="auto"/>
+        <w:tblLook w:val="04A0" w:firstRow="1" w:lastRow="0" w:firstColumn="1" w:lastColumn="0" w:noHBand="0" w:noVBand="1"/>
+      </w:tblPr>
+      <w:tblGrid>
+        <w:gridCol w:w="10620"/>
+      </w:tblGrid>
+      <w:tr>
+        <w:tc>
+          <w:tcPr>
+            <w:tcW w:w="10620" w:type="dxa"/>
+            <w:shd w:val="clear" w:color="auto" w:fill="FFF2CC" w:themeFill="accent4" w:themeFillTint="33"/>
+          </w:tcPr>
+          <w:p>
+            <w:pPr>
+              <w:tabs>
+                <w:tab w:val="left" w:pos="2298"/>
+              </w:tabs>
+              <w:spacing w:after="160" w:line="259" w:lineRule="auto"/>
+              <w:rPr>
+                <w:rFonts w:ascii="Times New Roman" w:hAnsi="Times New Roman" w:cs="Times New Roman"/>
+              </w:rPr>
+            </w:pPr>
+            <w:r>
+              <w:rPr>
+                <w:rFonts w:ascii="Times New Roman" w:hAnsi="Times New Roman" w:cs="Times New Roman"/>
+              </w:rPr>
+              <w:t xml:space="preserve">git log        # Shows commit history  </w:t>
+            </w:r>
+          </w:p>
+          <w:p>
+            <w:pPr>
+              <w:tabs>
+                <w:tab w:val="left" w:pos="2298"/>
+              </w:tabs>
+              <w:spacing w:after="160" w:line="259" w:lineRule="auto"/>
+              <w:rPr>
+                <w:rFonts w:ascii="Times New Roman" w:hAnsi="Times New Roman" w:cs="Times New Roman"/>
+              </w:rPr>
+            </w:pPr>
+            <w:r>
+              <w:rPr>
+                <w:rFonts w:ascii="Times New Roman" w:hAnsi="Times New Roman" w:cs="Times New Roman"/>
+              </w:rPr>
+              <w:t>git log --</w:t>
+            </w:r>
+            <w:proofErr w:type="spellStart"/>
+            <w:r>
+              <w:rPr>
+                <w:rFonts w:ascii="Times New Roman" w:hAnsi="Times New Roman" w:cs="Times New Roman"/>
+              </w:rPr>
+              <w:t>oneline</w:t>
+            </w:r>
+            <w:proofErr w:type="spellEnd"/>
+            <w:r>
+              <w:rPr>
+                <w:rFonts w:ascii="Times New Roman" w:hAnsi="Times New Roman" w:cs="Times New Roman"/>
+              </w:rPr>
+              <w:t xml:space="preserve"> --graph --</w:t>
+            </w:r>
+            <w:proofErr w:type="gramStart"/>
+            <w:r>
+              <w:rPr>
+                <w:rFonts w:ascii="Times New Roman" w:hAnsi="Times New Roman" w:cs="Times New Roman"/>
+              </w:rPr>
+              <w:t>all  #</w:t>
+            </w:r>
+            <w:proofErr w:type="gramEnd"/>
+            <w:r>
+              <w:rPr>
+                <w:rFonts w:ascii="Times New Roman" w:hAnsi="Times New Roman" w:cs="Times New Roman"/>
+              </w:rPr>
+              <w:t xml:space="preserve"> Compact commit history  </w:t>
+            </w:r>
+          </w:p>
+        </w:tc>
+      </w:tr>
+    </w:tbl>
+    <w:p>
+      <w:pPr>
+        <w:tabs>
+          <w:tab w:val="left" w:pos="2298"/>
+        </w:tabs>
+        <w:rPr>
+          <w:rFonts w:ascii="Times New Roman" w:hAnsi="Times New Roman" w:cs="Times New Roman"/>
+        </w:rPr>
+      </w:pPr>
+    </w:p>
+    <w:p>
+      <w:pPr>
+        <w:shd w:val="clear" w:color="auto" w:fill="ED7D31" w:themeFill="accent2"/>
+        <w:tabs>
+          <w:tab w:val="left" w:pos="2298"/>
+        </w:tabs>
+        <w:rPr>
+          <w:rFonts w:ascii="Times New Roman" w:hAnsi="Times New Roman" w:cs="Times New Roman"/>
+          <w:b/>
+          <w:bCs/>
+        </w:rPr>
+      </w:pPr>
+      <w:r>
+        <w:rPr>
+          <w:rFonts w:ascii="Times New Roman" w:hAnsi="Times New Roman" w:cs="Times New Roman"/>
+          <w:b/>
+          <w:bCs/>
+        </w:rPr>
+        <w:t>9. Undoing Changes</w:t>
+      </w:r>
+    </w:p>
+    <w:tbl>
+      <w:tblPr>
+        <w:tblStyle w:val="TableGrid"/>
+        <w:tblW w:w="0" w:type="auto"/>
+        <w:tblLook w:val="04A0" w:firstRow="1" w:lastRow="0" w:firstColumn="1" w:lastColumn="0" w:noHBand="0" w:noVBand="1"/>
+      </w:tblPr>
+      <w:tblGrid>
+        <w:gridCol w:w="10620"/>
+      </w:tblGrid>
+      <w:tr>
+        <w:tc>
+          <w:tcPr>
+            <w:tcW w:w="10620" w:type="dxa"/>
+            <w:shd w:val="clear" w:color="auto" w:fill="FFF2CC" w:themeFill="accent4" w:themeFillTint="33"/>
+          </w:tcPr>
+          <w:p>
+            <w:pPr>
+              <w:tabs>
+                <w:tab w:val="left" w:pos="2298"/>
+              </w:tabs>
+              <w:spacing w:after="160" w:line="259" w:lineRule="auto"/>
+              <w:rPr>
+                <w:rFonts w:ascii="Times New Roman" w:hAnsi="Times New Roman" w:cs="Times New Roman"/>
+              </w:rPr>
+            </w:pPr>
+            <w:r>
+              <w:rPr>
+                <w:rFonts w:ascii="Times New Roman" w:hAnsi="Times New Roman" w:cs="Times New Roman"/>
+              </w:rPr>
+              <w:t xml:space="preserve">git checkout </w:t>
+            </w:r>
+            <w:proofErr w:type="gramStart"/>
+            <w:r>
+              <w:rPr>
+                <w:rFonts w:ascii="Times New Roman" w:hAnsi="Times New Roman" w:cs="Times New Roman"/>
+              </w:rPr>
+              <w:t>filename  #</w:t>
+            </w:r>
+            <w:proofErr w:type="gramEnd"/>
+            <w:r>
+              <w:rPr>
+                <w:rFonts w:ascii="Times New Roman" w:hAnsi="Times New Roman" w:cs="Times New Roman"/>
+              </w:rPr>
+              <w:t xml:space="preserve"> Reverts </w:t>
+            </w:r>
+            <w:proofErr w:type="spellStart"/>
+            <w:r>
+              <w:rPr>
+                <w:rFonts w:ascii="Times New Roman" w:hAnsi="Times New Roman" w:cs="Times New Roman"/>
+              </w:rPr>
+              <w:t>unstaged</w:t>
+            </w:r>
+            <w:proofErr w:type="spellEnd"/>
+            <w:r>
+              <w:rPr>
+                <w:rFonts w:ascii="Times New Roman" w:hAnsi="Times New Roman" w:cs="Times New Roman"/>
+              </w:rPr>
+              <w:t xml:space="preserve"> changes  </w:t>
+            </w:r>
+          </w:p>
+          <w:p>
+            <w:pPr>
+              <w:tabs>
+                <w:tab w:val="left" w:pos="2298"/>
+              </w:tabs>
+              <w:spacing w:after="160" w:line="259" w:lineRule="auto"/>
+              <w:rPr>
+                <w:rFonts w:ascii="Times New Roman" w:hAnsi="Times New Roman" w:cs="Times New Roman"/>
+              </w:rPr>
+            </w:pPr>
+            <w:r>
+              <w:rPr>
+                <w:rFonts w:ascii="Times New Roman" w:hAnsi="Times New Roman" w:cs="Times New Roman"/>
+              </w:rPr>
+              <w:t xml:space="preserve">git reset HEAD </w:t>
+            </w:r>
+            <w:proofErr w:type="gramStart"/>
+            <w:r>
+              <w:rPr>
+                <w:rFonts w:ascii="Times New Roman" w:hAnsi="Times New Roman" w:cs="Times New Roman"/>
+              </w:rPr>
+              <w:t>filename  #</w:t>
+            </w:r>
+            <w:proofErr w:type="gramEnd"/>
+            <w:r>
+              <w:rPr>
+                <w:rFonts w:ascii="Times New Roman" w:hAnsi="Times New Roman" w:cs="Times New Roman"/>
+              </w:rPr>
+              <w:t xml:space="preserve"> </w:t>
+            </w:r>
+            <w:proofErr w:type="spellStart"/>
+            <w:r>
+              <w:rPr>
+                <w:rFonts w:ascii="Times New Roman" w:hAnsi="Times New Roman" w:cs="Times New Roman"/>
+              </w:rPr>
+              <w:t>Unstages</w:t>
+            </w:r>
+            <w:proofErr w:type="spellEnd"/>
+            <w:r>
+              <w:rPr>
+                <w:rFonts w:ascii="Times New Roman" w:hAnsi="Times New Roman" w:cs="Times New Roman"/>
+              </w:rPr>
+              <w:t xml:space="preserve"> a file  </w:t>
+            </w:r>
+          </w:p>
+          <w:p>
+            <w:pPr>
+              <w:tabs>
+                <w:tab w:val="left" w:pos="2298"/>
+              </w:tabs>
+              <w:spacing w:after="160" w:line="259" w:lineRule="auto"/>
+              <w:rPr>
+                <w:rFonts w:ascii="Times New Roman" w:hAnsi="Times New Roman" w:cs="Times New Roman"/>
+              </w:rPr>
+            </w:pPr>
+            <w:r>
+              <w:rPr>
+                <w:rFonts w:ascii="Times New Roman" w:hAnsi="Times New Roman" w:cs="Times New Roman"/>
+              </w:rPr>
+              <w:t xml:space="preserve">git reset --hard </w:t>
+            </w:r>
+            <w:proofErr w:type="gramStart"/>
+            <w:r>
+              <w:rPr>
+                <w:rFonts w:ascii="Times New Roman" w:hAnsi="Times New Roman" w:cs="Times New Roman"/>
+              </w:rPr>
+              <w:t>HEAD  #</w:t>
+            </w:r>
+            <w:proofErr w:type="gramEnd"/>
+            <w:r>
+              <w:rPr>
+                <w:rFonts w:ascii="Times New Roman" w:hAnsi="Times New Roman" w:cs="Times New Roman"/>
+              </w:rPr>
+              <w:t xml:space="preserve"> Resets all changes (Caution!)  </w:t>
+            </w:r>
+          </w:p>
+        </w:tc>
+      </w:tr>
+    </w:tbl>
+    <w:p>
+      <w:pPr>
+        <w:shd w:val="clear" w:color="auto" w:fill="ED7D31" w:themeFill="accent2"/>
+        <w:tabs>
+          <w:tab w:val="left" w:pos="2298"/>
+        </w:tabs>
+        <w:rPr>
+          <w:rFonts w:ascii="Times New Roman" w:hAnsi="Times New Roman" w:cs="Times New Roman"/>
+          <w:b/>
+          <w:bCs/>
+        </w:rPr>
+      </w:pPr>
+      <w:r>
+        <w:rPr>
+          <w:rFonts w:ascii="Times New Roman" w:hAnsi="Times New Roman" w:cs="Times New Roman"/>
+          <w:b/>
+          <w:bCs/>
+        </w:rPr>
+        <w:t>10. Cloning a Repository</w:t>
+      </w:r>
+    </w:p>
+    <w:tbl>
+      <w:tblPr>
+        <w:tblStyle w:val="TableGrid"/>
+        <w:tblW w:w="0" w:type="auto"/>
+        <w:tblLook w:val="04A0" w:firstRow="1" w:lastRow="0" w:firstColumn="1" w:lastColumn="0" w:noHBand="0" w:noVBand="1"/>
+      </w:tblPr>
+      <w:tblGrid>
+        <w:gridCol w:w="10620"/>
+      </w:tblGrid>
+      <w:tr>
+        <w:tc>
+          <w:tcPr>
+            <w:tcW w:w="10620" w:type="dxa"/>
+            <w:shd w:val="clear" w:color="auto" w:fill="FFF2CC" w:themeFill="accent4" w:themeFillTint="33"/>
+          </w:tcPr>
+          <w:p>
+            <w:pPr>
+              <w:tabs>
+                <w:tab w:val="left" w:pos="2298"/>
+              </w:tabs>
+              <w:spacing w:after="160" w:line="259" w:lineRule="auto"/>
+              <w:rPr>
+                <w:rFonts w:ascii="Times New Roman" w:hAnsi="Times New Roman" w:cs="Times New Roman"/>
+              </w:rPr>
+            </w:pPr>
+            <w:r>
+              <w:rPr>
+                <w:rFonts w:ascii="Times New Roman" w:hAnsi="Times New Roman" w:cs="Times New Roman"/>
+              </w:rPr>
+              <w:t>git clone https://github.com/your-username/repository.git</w:t>
+            </w:r>
+          </w:p>
+        </w:tc>
+      </w:tr>
+    </w:tbl>
+    <w:p>
+      <w:pPr>
+        <w:tabs>
+          <w:tab w:val="left" w:pos="2298"/>
+        </w:tabs>
+        <w:rPr>
+          <w:rFonts w:ascii="Times New Roman" w:hAnsi="Times New Roman" w:cs="Times New Roman"/>
+        </w:rPr>
+      </w:pPr>
+      <w:r>
+        <w:rPr>
+          <w:rFonts w:ascii="Times New Roman" w:hAnsi="Times New Roman" w:cs="Times New Roman"/>
+          <w:i/>
+          <w:iCs/>
+        </w:rPr>
+        <w:t>(Creates a local copy of a remote repository.)</w:t>
+      </w:r>
+    </w:p>
+    <w:p>
+      <w:pPr>
+        <w:shd w:val="clear" w:color="auto" w:fill="ED7D31" w:themeFill="accent2"/>
+        <w:tabs>
+          <w:tab w:val="left" w:pos="2298"/>
+        </w:tabs>
+        <w:rPr>
+          <w:rFonts w:ascii="Times New Roman" w:hAnsi="Times New Roman" w:cs="Times New Roman"/>
+          <w:b/>
+          <w:bCs/>
+        </w:rPr>
+      </w:pPr>
+      <w:r>
+        <w:rPr>
+          <w:rFonts w:ascii="Times New Roman" w:hAnsi="Times New Roman" w:cs="Times New Roman"/>
+          <w:b/>
+          <w:bCs/>
+        </w:rPr>
+        <w:t>11. Merging &amp; Rebasing</w:t>
+      </w:r>
+    </w:p>
+    <w:tbl>
+      <w:tblPr>
+        <w:tblStyle w:val="TableGrid"/>
+        <w:tblW w:w="0" w:type="auto"/>
+        <w:tblLook w:val="04A0" w:firstRow="1" w:lastRow="0" w:firstColumn="1" w:lastColumn="0" w:noHBand="0" w:noVBand="1"/>
+      </w:tblPr>
+      <w:tblGrid>
+        <w:gridCol w:w="10620"/>
+      </w:tblGrid>
+      <w:tr>
+        <w:tc>
+          <w:tcPr>
+            <w:tcW w:w="10620" w:type="dxa"/>
+            <w:shd w:val="clear" w:color="auto" w:fill="FFF2CC" w:themeFill="accent4" w:themeFillTint="33"/>
+          </w:tcPr>
+          <w:p>
+            <w:pPr>
+              <w:tabs>
+                <w:tab w:val="left" w:pos="2298"/>
+              </w:tabs>
+              <w:spacing w:after="160" w:line="259" w:lineRule="auto"/>
+              <w:rPr>
+                <w:rFonts w:ascii="Times New Roman" w:hAnsi="Times New Roman" w:cs="Times New Roman"/>
+              </w:rPr>
+            </w:pPr>
+            <w:r>
+              <w:rPr>
+                <w:rFonts w:ascii="Times New Roman" w:hAnsi="Times New Roman" w:cs="Times New Roman"/>
+              </w:rPr>
+              <w:t>git merge branch-</w:t>
+            </w:r>
+            <w:proofErr w:type="gramStart"/>
+            <w:r>
+              <w:rPr>
+                <w:rFonts w:ascii="Times New Roman" w:hAnsi="Times New Roman" w:cs="Times New Roman"/>
+              </w:rPr>
+              <w:t>name  #</w:t>
+            </w:r>
+            <w:proofErr w:type="gramEnd"/>
+            <w:r>
+              <w:rPr>
+                <w:rFonts w:ascii="Times New Roman" w:hAnsi="Times New Roman" w:cs="Times New Roman"/>
+              </w:rPr>
+              <w:t xml:space="preserve"> Merges another branch into current  </w:t>
+            </w:r>
+          </w:p>
+          <w:p>
+            <w:pPr>
+              <w:tabs>
+                <w:tab w:val="left" w:pos="2298"/>
+              </w:tabs>
+              <w:spacing w:after="160" w:line="259" w:lineRule="auto"/>
+              <w:rPr>
+                <w:rFonts w:ascii="Times New Roman" w:hAnsi="Times New Roman" w:cs="Times New Roman"/>
+              </w:rPr>
+            </w:pPr>
+            <w:r>
+              <w:rPr>
+                <w:rFonts w:ascii="Times New Roman" w:hAnsi="Times New Roman" w:cs="Times New Roman"/>
+              </w:rPr>
+              <w:t>git rebase branch-</w:t>
+            </w:r>
+            <w:proofErr w:type="gramStart"/>
+            <w:r>
+              <w:rPr>
+                <w:rFonts w:ascii="Times New Roman" w:hAnsi="Times New Roman" w:cs="Times New Roman"/>
+              </w:rPr>
+              <w:t>name  #</w:t>
+            </w:r>
+            <w:proofErr w:type="gramEnd"/>
+            <w:r>
+              <w:rPr>
+                <w:rFonts w:ascii="Times New Roman" w:hAnsi="Times New Roman" w:cs="Times New Roman"/>
+              </w:rPr>
+              <w:t xml:space="preserve"> Reapplies commits on top of another branch  </w:t>
+            </w:r>
+          </w:p>
+        </w:tc>
+      </w:tr>
+    </w:tbl>
+    <w:p>
+      <w:pPr>
+        <w:shd w:val="clear" w:color="auto" w:fill="ED7D31" w:themeFill="accent2"/>
+        <w:tabs>
+          <w:tab w:val="left" w:pos="2298"/>
+        </w:tabs>
+        <w:rPr>
+          <w:rFonts w:ascii="Times New Roman" w:hAnsi="Times New Roman" w:cs="Times New Roman"/>
+          <w:b/>
+          <w:bCs/>
+        </w:rPr>
+      </w:pPr>
+      <w:r>
+        <w:rPr>
+          <w:rFonts w:ascii="Times New Roman" w:hAnsi="Times New Roman" w:cs="Times New Roman"/>
+          <w:b/>
+          <w:bCs/>
+        </w:rPr>
+        <w:t>12. Deleting Files in Git</w:t>
+      </w:r>
+    </w:p>
+    <w:tbl>
+      <w:tblPr>
+        <w:tblStyle w:val="TableGrid"/>
+        <w:tblW w:w="0" w:type="auto"/>
+        <w:tblLook w:val="04A0" w:firstRow="1" w:lastRow="0" w:firstColumn="1" w:lastColumn="0" w:noHBand="0" w:noVBand="1"/>
+      </w:tblPr>
+      <w:tblGrid>
+        <w:gridCol w:w="10620"/>
+      </w:tblGrid>
+      <w:tr>
+        <w:tc>
+          <w:tcPr>
+            <w:tcW w:w="10620" w:type="dxa"/>
+            <w:shd w:val="clear" w:color="auto" w:fill="FFF2CC" w:themeFill="accent4" w:themeFillTint="33"/>
+          </w:tcPr>
+          <w:p>
+            <w:pPr>
+              <w:tabs>
+                <w:tab w:val="left" w:pos="2298"/>
+              </w:tabs>
+              <w:spacing w:after="160" w:line="259" w:lineRule="auto"/>
+              <w:rPr>
+                <w:rFonts w:ascii="Times New Roman" w:hAnsi="Times New Roman" w:cs="Times New Roman"/>
+              </w:rPr>
+            </w:pPr>
+            <w:r>
+              <w:rPr>
+                <w:rFonts w:ascii="Times New Roman" w:hAnsi="Times New Roman" w:cs="Times New Roman"/>
+              </w:rPr>
+              <w:t>git merge branch-</w:t>
+            </w:r>
+            <w:proofErr w:type="gramStart"/>
+            <w:r>
+              <w:rPr>
+                <w:rFonts w:ascii="Times New Roman" w:hAnsi="Times New Roman" w:cs="Times New Roman"/>
+              </w:rPr>
+              <w:t>name  #</w:t>
+            </w:r>
+            <w:proofErr w:type="gramEnd"/>
+            <w:r>
+              <w:rPr>
+                <w:rFonts w:ascii="Times New Roman" w:hAnsi="Times New Roman" w:cs="Times New Roman"/>
+              </w:rPr>
+              <w:t xml:space="preserve"> Merges another branch into current  </w:t>
+            </w:r>
+          </w:p>
+          <w:p>
+            <w:pPr>
+              <w:tabs>
+                <w:tab w:val="left" w:pos="2298"/>
+              </w:tabs>
+              <w:spacing w:after="160" w:line="259" w:lineRule="auto"/>
+              <w:rPr>
+                <w:rFonts w:ascii="Times New Roman" w:hAnsi="Times New Roman" w:cs="Times New Roman"/>
+              </w:rPr>
+            </w:pPr>
+            <w:r>
+              <w:rPr>
+                <w:rFonts w:ascii="Times New Roman" w:hAnsi="Times New Roman" w:cs="Times New Roman"/>
+              </w:rPr>
+              <w:t>git rebase branch-</w:t>
+            </w:r>
+            <w:proofErr w:type="gramStart"/>
+            <w:r>
+              <w:rPr>
+                <w:rFonts w:ascii="Times New Roman" w:hAnsi="Times New Roman" w:cs="Times New Roman"/>
+              </w:rPr>
+              <w:t>name  #</w:t>
+            </w:r>
+            <w:proofErr w:type="gramEnd"/>
+            <w:r>
+              <w:rPr>
+                <w:rFonts w:ascii="Times New Roman" w:hAnsi="Times New Roman" w:cs="Times New Roman"/>
+              </w:rPr>
+              <w:t xml:space="preserve"> Reapplies commits on top of another branch  </w:t>
+            </w:r>
+          </w:p>
+        </w:tc>
+      </w:tr>
+    </w:tbl>
+    <w:p>
+      <w:pPr>
+        <w:shd w:val="clear" w:color="auto" w:fill="ED7D31" w:themeFill="accent2"/>
+        <w:tabs>
+          <w:tab w:val="left" w:pos="2298"/>
+        </w:tabs>
+        <w:rPr>
+          <w:rFonts w:ascii="Times New Roman" w:hAnsi="Times New Roman" w:cs="Times New Roman"/>
+          <w:b/>
+          <w:bCs/>
+        </w:rPr>
+      </w:pPr>
+      <w:r>
+        <w:rPr>
+          <w:rFonts w:ascii="Times New Roman" w:hAnsi="Times New Roman" w:cs="Times New Roman"/>
+          <w:b/>
+          <w:bCs/>
+        </w:rPr>
+        <w:t>13. Fixing Mistakes</w:t>
+      </w:r>
+    </w:p>
+    <w:tbl>
+      <w:tblPr>
+        <w:tblStyle w:val="TableGrid"/>
+        <w:tblW w:w="0" w:type="auto"/>
+        <w:tblLook w:val="04A0" w:firstRow="1" w:lastRow="0" w:firstColumn="1" w:lastColumn="0" w:noHBand="0" w:noVBand="1"/>
+      </w:tblPr>
+      <w:tblGrid>
+        <w:gridCol w:w="10620"/>
+      </w:tblGrid>
+      <w:tr>
+        <w:tc>
+          <w:tcPr>
+            <w:tcW w:w="10620" w:type="dxa"/>
+            <w:shd w:val="clear" w:color="auto" w:fill="FFF2CC" w:themeFill="accent4" w:themeFillTint="33"/>
+          </w:tcPr>
+          <w:p>
+            <w:pPr>
+              <w:tabs>
+                <w:tab w:val="left" w:pos="2298"/>
+              </w:tabs>
+              <w:spacing w:after="160" w:line="259" w:lineRule="auto"/>
+              <w:rPr>
+                <w:rFonts w:ascii="Times New Roman" w:hAnsi="Times New Roman" w:cs="Times New Roman"/>
+              </w:rPr>
+            </w:pPr>
+            <w:r>
+              <w:rPr>
+                <w:rFonts w:ascii="Times New Roman" w:hAnsi="Times New Roman" w:cs="Times New Roman"/>
+              </w:rPr>
+              <w:t>git commit --amend -m "New commit message</w:t>
+            </w:r>
+            <w:proofErr w:type="gramStart"/>
+            <w:r>
+              <w:rPr>
+                <w:rFonts w:ascii="Times New Roman" w:hAnsi="Times New Roman" w:cs="Times New Roman"/>
+              </w:rPr>
+              <w:t>"  #</w:t>
+            </w:r>
+            <w:proofErr w:type="gramEnd"/>
+            <w:r>
+              <w:rPr>
+                <w:rFonts w:ascii="Times New Roman" w:hAnsi="Times New Roman" w:cs="Times New Roman"/>
+              </w:rPr>
+              <w:t xml:space="preserve"> Edit last commit  </w:t>
+            </w:r>
+          </w:p>
+          <w:p>
+            <w:pPr>
+              <w:tabs>
+                <w:tab w:val="left" w:pos="2298"/>
+              </w:tabs>
+              <w:spacing w:after="160" w:line="259" w:lineRule="auto"/>
+              <w:rPr>
+                <w:rFonts w:ascii="Times New Roman" w:hAnsi="Times New Roman" w:cs="Times New Roman"/>
+              </w:rPr>
+            </w:pPr>
+            <w:r>
+              <w:rPr>
+                <w:rFonts w:ascii="Times New Roman" w:hAnsi="Times New Roman" w:cs="Times New Roman"/>
+              </w:rPr>
+              <w:t>git revert commit-</w:t>
+            </w:r>
+            <w:proofErr w:type="gramStart"/>
+            <w:r>
+              <w:rPr>
+                <w:rFonts w:ascii="Times New Roman" w:hAnsi="Times New Roman" w:cs="Times New Roman"/>
+              </w:rPr>
+              <w:t>id  #</w:t>
+            </w:r>
+            <w:proofErr w:type="gramEnd"/>
+            <w:r>
+              <w:rPr>
+                <w:rFonts w:ascii="Times New Roman" w:hAnsi="Times New Roman" w:cs="Times New Roman"/>
+              </w:rPr>
+              <w:t xml:space="preserve"> Undo a specific commit  </w:t>
+            </w:r>
+          </w:p>
+          <w:p>
+            <w:pPr>
+              <w:tabs>
+                <w:tab w:val="left" w:pos="2298"/>
+              </w:tabs>
+              <w:spacing w:after="160" w:line="259" w:lineRule="auto"/>
+              <w:rPr>
+                <w:rFonts w:ascii="Times New Roman" w:hAnsi="Times New Roman" w:cs="Times New Roman"/>
+              </w:rPr>
+            </w:pPr>
+            <w:r>
+              <w:rPr>
+                <w:rFonts w:ascii="Times New Roman" w:hAnsi="Times New Roman" w:cs="Times New Roman"/>
+              </w:rPr>
+              <w:t>git reset --hard HEAD~</w:t>
+            </w:r>
+            <w:proofErr w:type="gramStart"/>
+            <w:r>
+              <w:rPr>
+                <w:rFonts w:ascii="Times New Roman" w:hAnsi="Times New Roman" w:cs="Times New Roman"/>
+              </w:rPr>
+              <w:t>1  #</w:t>
+            </w:r>
+            <w:proofErr w:type="gramEnd"/>
+            <w:r>
+              <w:rPr>
+                <w:rFonts w:ascii="Times New Roman" w:hAnsi="Times New Roman" w:cs="Times New Roman"/>
+              </w:rPr>
+              <w:t xml:space="preserve"> Remove the last commit (Caution!)  </w:t>
+            </w:r>
+          </w:p>
+        </w:tc>
+      </w:tr>
+    </w:tbl>
+    <w:p>
+      <w:pPr>
+        <w:shd w:val="clear" w:color="auto" w:fill="ED7D31" w:themeFill="accent2"/>
+        <w:tabs>
+          <w:tab w:val="left" w:pos="2298"/>
+        </w:tabs>
+        <w:rPr>
+          <w:rFonts w:ascii="Times New Roman" w:hAnsi="Times New Roman" w:cs="Times New Roman"/>
+          <w:b/>
+          <w:bCs/>
+        </w:rPr>
+      </w:pPr>
+      <w:r>
+        <w:rPr>
+          <w:rFonts w:ascii="Times New Roman" w:hAnsi="Times New Roman" w:cs="Times New Roman"/>
+          <w:b/>
+          <w:bCs/>
+        </w:rPr>
+        <w:t>14. Stashing Changes (Temporary Save)</w:t>
+      </w:r>
+    </w:p>
+    <w:tbl>
+      <w:tblPr>
+        <w:tblStyle w:val="TableGrid"/>
+        <w:tblW w:w="0" w:type="auto"/>
+        <w:tblLook w:val="04A0" w:firstRow="1" w:lastRow="0" w:firstColumn="1" w:lastColumn="0" w:noHBand="0" w:noVBand="1"/>
+      </w:tblPr>
+      <w:tblGrid>
+        <w:gridCol w:w="10620"/>
+      </w:tblGrid>
+      <w:tr>
+        <w:tc>
+          <w:tcPr>
+            <w:tcW w:w="10620" w:type="dxa"/>
+            <w:shd w:val="clear" w:color="auto" w:fill="FFF2CC" w:themeFill="accent4" w:themeFillTint="33"/>
+          </w:tcPr>
+          <w:p>
+            <w:pPr>
+              <w:tabs>
+                <w:tab w:val="left" w:pos="2298"/>
+              </w:tabs>
+              <w:spacing w:after="160" w:line="259" w:lineRule="auto"/>
+              <w:rPr>
+                <w:rFonts w:ascii="Times New Roman" w:hAnsi="Times New Roman" w:cs="Times New Roman"/>
+              </w:rPr>
+            </w:pPr>
+            <w:r>
+              <w:rPr>
+                <w:rFonts w:ascii="Times New Roman" w:hAnsi="Times New Roman" w:cs="Times New Roman"/>
+              </w:rPr>
+              <w:t xml:space="preserve">git stash          # Stashes current changes  </w:t>
+            </w:r>
+          </w:p>
+          <w:p>
+            <w:pPr>
+              <w:tabs>
+                <w:tab w:val="left" w:pos="2298"/>
+              </w:tabs>
+              <w:spacing w:after="160" w:line="259" w:lineRule="auto"/>
+              <w:rPr>
+                <w:rFonts w:ascii="Times New Roman" w:hAnsi="Times New Roman" w:cs="Times New Roman"/>
+              </w:rPr>
+            </w:pPr>
+            <w:r>
+              <w:rPr>
+                <w:rFonts w:ascii="Times New Roman" w:hAnsi="Times New Roman" w:cs="Times New Roman"/>
+              </w:rPr>
+              <w:t xml:space="preserve">git stash pop      # Restores stashed changes  </w:t>
+            </w:r>
+          </w:p>
+          <w:p>
+            <w:pPr>
+              <w:tabs>
+                <w:tab w:val="left" w:pos="2298"/>
+              </w:tabs>
+              <w:spacing w:after="160" w:line="259" w:lineRule="auto"/>
+              <w:rPr>
+                <w:rFonts w:ascii="Times New Roman" w:hAnsi="Times New Roman" w:cs="Times New Roman"/>
+              </w:rPr>
+            </w:pPr>
+            <w:r>
+              <w:rPr>
+                <w:rFonts w:ascii="Times New Roman" w:hAnsi="Times New Roman" w:cs="Times New Roman"/>
+              </w:rPr>
+              <w:t xml:space="preserve">git stash list     # Lists stashed changes  </w:t>
+            </w:r>
+          </w:p>
+          <w:p>
+            <w:pPr>
+              <w:tabs>
+                <w:tab w:val="left" w:pos="2298"/>
+              </w:tabs>
+              <w:spacing w:after="160" w:line="259" w:lineRule="auto"/>
+              <w:rPr>
+                <w:rFonts w:ascii="Times New Roman" w:hAnsi="Times New Roman" w:cs="Times New Roman"/>
+              </w:rPr>
+            </w:pPr>
+            <w:r>
+              <w:rPr>
+                <w:rFonts w:ascii="Times New Roman" w:hAnsi="Times New Roman" w:cs="Times New Roman"/>
+              </w:rPr>
+              <w:t xml:space="preserve">git stash drop     # Deletes the last stash  </w:t>
+            </w:r>
+          </w:p>
+        </w:tc>
+      </w:tr>
+    </w:tbl>
+    <w:p>
+      <w:pPr>
+        <w:tabs>
+          <w:tab w:val="left" w:pos="2298"/>
+        </w:tabs>
+        <w:rPr>
+          <w:rFonts w:ascii="Times New Roman" w:hAnsi="Times New Roman" w:cs="Times New Roman"/>
+        </w:rPr>
+      </w:pPr>
+    </w:p>
+    <w:p>
+      <w:pPr>
+        <w:shd w:val="clear" w:color="auto" w:fill="FFD966" w:themeFill="accent4" w:themeFillTint="99"/>
+        <w:tabs>
+          <w:tab w:val="left" w:pos="2298"/>
+        </w:tabs>
+        <w:rPr>
+          <w:rFonts w:ascii="Times New Roman" w:hAnsi="Times New Roman" w:cs="Times New Roman"/>
+          <w:b/>
+          <w:bCs/>
+          <w:sz w:val="32"/>
+          <w:szCs w:val="32"/>
+        </w:rPr>
+      </w:pPr>
+      <w:r>
+        <w:rPr>
+          <w:rFonts w:ascii="Times New Roman" w:hAnsi="Times New Roman" w:cs="Times New Roman"/>
+          <w:b/>
+          <w:bCs/>
+          <w:sz w:val="32"/>
+          <w:szCs w:val="32"/>
+        </w:rPr>
+        <w:t>ls Commands in Linux/Windows (PowerShell)</w:t>
+      </w:r>
+    </w:p>
+    <w:p>
+      <w:pPr>
+        <w:tabs>
+          <w:tab w:val="left" w:pos="2298"/>
+        </w:tabs>
+        <w:rPr>
+          <w:rFonts w:ascii="Times New Roman" w:hAnsi="Times New Roman" w:cs="Times New Roman"/>
+        </w:rPr>
+      </w:pPr>
+      <w:r>
+        <w:rPr>
+          <w:rFonts w:ascii="Times New Roman" w:hAnsi="Times New Roman" w:cs="Times New Roman"/>
+        </w:rPr>
+        <w:t xml:space="preserve">The ls command is used to </w:t>
+      </w:r>
+      <w:r>
+        <w:rPr>
+          <w:rFonts w:ascii="Times New Roman" w:hAnsi="Times New Roman" w:cs="Times New Roman"/>
+          <w:b/>
+          <w:bCs/>
+        </w:rPr>
+        <w:t>list files and directories</w:t>
+      </w:r>
+      <w:r>
+        <w:rPr>
+          <w:rFonts w:ascii="Times New Roman" w:hAnsi="Times New Roman" w:cs="Times New Roman"/>
+        </w:rPr>
+        <w:t xml:space="preserve"> in a directory.</w:t>
+      </w:r>
+    </w:p>
+    <w:p>
+      <w:pPr>
+        <w:shd w:val="clear" w:color="auto" w:fill="F4B083" w:themeFill="accent2" w:themeFillTint="99"/>
+        <w:tabs>
+          <w:tab w:val="left" w:pos="2298"/>
+        </w:tabs>
+        <w:rPr>
+          <w:rFonts w:ascii="Times New Roman" w:hAnsi="Times New Roman" w:cs="Times New Roman"/>
+          <w:b/>
+          <w:bCs/>
+        </w:rPr>
+      </w:pPr>
+      <w:r>
+        <w:rPr>
+          <w:rFonts w:ascii="Times New Roman" w:hAnsi="Times New Roman" w:cs="Times New Roman"/>
+          <w:b/>
+          <w:bCs/>
+        </w:rPr>
+        <w:t>1. Basic ls Commands</w:t>
+      </w:r>
+    </w:p>
+    <w:tbl>
+      <w:tblPr>
+        <w:tblStyle w:val="TableGrid"/>
+        <w:tblW w:w="0" w:type="auto"/>
+        <w:tblLook w:val="04A0" w:firstRow="1" w:lastRow="0" w:firstColumn="1" w:lastColumn="0" w:noHBand="0" w:noVBand="1"/>
+      </w:tblPr>
+      <w:tblGrid>
+        <w:gridCol w:w="10620"/>
+      </w:tblGrid>
+      <w:tr>
+        <w:tc>
+          <w:tcPr>
+            <w:tcW w:w="10620" w:type="dxa"/>
+            <w:shd w:val="clear" w:color="auto" w:fill="E2EFD9" w:themeFill="accent6" w:themeFillTint="33"/>
+          </w:tcPr>
+          <w:p>
+            <w:pPr>
+              <w:tabs>
+                <w:tab w:val="left" w:pos="2298"/>
+              </w:tabs>
+              <w:spacing w:after="160" w:line="259" w:lineRule="auto"/>
+              <w:rPr>
+                <w:rFonts w:ascii="Times New Roman" w:hAnsi="Times New Roman" w:cs="Times New Roman"/>
+              </w:rPr>
+            </w:pPr>
+            <w:r>
+              <w:rPr>
+                <w:rFonts w:ascii="Times New Roman" w:hAnsi="Times New Roman" w:cs="Times New Roman"/>
+              </w:rPr>
+              <w:t>ls                # Lists files and folders in the current directory</w:t>
+            </w:r>
+          </w:p>
+          <w:p>
+            <w:pPr>
+              <w:tabs>
+                <w:tab w:val="left" w:pos="2298"/>
+              </w:tabs>
+              <w:spacing w:after="160" w:line="259" w:lineRule="auto"/>
+              <w:rPr>
+                <w:rFonts w:ascii="Times New Roman" w:hAnsi="Times New Roman" w:cs="Times New Roman"/>
+              </w:rPr>
+            </w:pPr>
+            <w:r>
+              <w:rPr>
+                <w:rFonts w:ascii="Times New Roman" w:hAnsi="Times New Roman" w:cs="Times New Roman"/>
+              </w:rPr>
+              <w:t>ls -l             # Lists files with details (permissions, owner, size, date)</w:t>
+            </w:r>
+          </w:p>
+          <w:p>
+            <w:pPr>
+              <w:tabs>
+                <w:tab w:val="left" w:pos="2298"/>
+              </w:tabs>
+              <w:spacing w:after="160" w:line="259" w:lineRule="auto"/>
+              <w:rPr>
+                <w:rFonts w:ascii="Times New Roman" w:hAnsi="Times New Roman" w:cs="Times New Roman"/>
+              </w:rPr>
+            </w:pPr>
+            <w:r>
+              <w:rPr>
+                <w:rFonts w:ascii="Times New Roman" w:hAnsi="Times New Roman" w:cs="Times New Roman"/>
+              </w:rPr>
+              <w:t xml:space="preserve">ls -a             # Lists all files, including hidden ones (starting with </w:t>
+            </w:r>
+            <w:proofErr w:type="gramStart"/>
+            <w:r>
+              <w:rPr>
+                <w:rFonts w:ascii="Times New Roman" w:hAnsi="Times New Roman" w:cs="Times New Roman"/>
+              </w:rPr>
+              <w:t>`.`</w:t>
+            </w:r>
+            <w:proofErr w:type="gramEnd"/>
+            <w:r>
+              <w:rPr>
+                <w:rFonts w:ascii="Times New Roman" w:hAnsi="Times New Roman" w:cs="Times New Roman"/>
+              </w:rPr>
+              <w:t>)</w:t>
+            </w:r>
+          </w:p>
+          <w:p>
+            <w:pPr>
+              <w:tabs>
+                <w:tab w:val="left" w:pos="2298"/>
+              </w:tabs>
+              <w:spacing w:after="160" w:line="259" w:lineRule="auto"/>
+              <w:rPr>
+                <w:rFonts w:ascii="Times New Roman" w:hAnsi="Times New Roman" w:cs="Times New Roman"/>
+              </w:rPr>
+            </w:pPr>
+            <w:r>
+              <w:rPr>
+                <w:rFonts w:ascii="Times New Roman" w:hAnsi="Times New Roman" w:cs="Times New Roman"/>
+              </w:rPr>
+              <w:t>ls -</w:t>
+            </w:r>
+            <w:proofErr w:type="spellStart"/>
+            <w:r>
+              <w:rPr>
+                <w:rFonts w:ascii="Times New Roman" w:hAnsi="Times New Roman" w:cs="Times New Roman"/>
+              </w:rPr>
+              <w:t>lh</w:t>
+            </w:r>
+            <w:proofErr w:type="spellEnd"/>
+            <w:r>
+              <w:rPr>
+                <w:rFonts w:ascii="Times New Roman" w:hAnsi="Times New Roman" w:cs="Times New Roman"/>
+              </w:rPr>
+              <w:t xml:space="preserve">            # Lists files in human-readable format (sizes like KB, MB)</w:t>
+            </w:r>
+          </w:p>
+          <w:p>
+            <w:pPr>
+              <w:tabs>
+                <w:tab w:val="left" w:pos="2298"/>
+              </w:tabs>
+              <w:spacing w:after="160" w:line="259" w:lineRule="auto"/>
+              <w:rPr>
+                <w:rFonts w:ascii="Times New Roman" w:hAnsi="Times New Roman" w:cs="Times New Roman"/>
+              </w:rPr>
+            </w:pPr>
+            <w:r>
+              <w:rPr>
+                <w:rFonts w:ascii="Times New Roman" w:hAnsi="Times New Roman" w:cs="Times New Roman"/>
+              </w:rPr>
+              <w:t>ls -R             # Lists files recursively (including subdirectories)</w:t>
+            </w:r>
+          </w:p>
+          <w:p>
+            <w:pPr>
+              <w:tabs>
+                <w:tab w:val="left" w:pos="2298"/>
+              </w:tabs>
+              <w:spacing w:after="160" w:line="259" w:lineRule="auto"/>
+              <w:rPr>
+                <w:rFonts w:ascii="Times New Roman" w:hAnsi="Times New Roman" w:cs="Times New Roman"/>
+              </w:rPr>
+            </w:pPr>
+            <w:r>
+              <w:rPr>
+                <w:rFonts w:ascii="Times New Roman" w:hAnsi="Times New Roman" w:cs="Times New Roman"/>
+              </w:rPr>
+              <w:t>ls -F             # Adds `/` for directories, `*` for executables</w:t>
+            </w:r>
+          </w:p>
+        </w:tc>
+      </w:tr>
+    </w:tbl>
+    <w:p>
+      <w:pPr>
+        <w:shd w:val="clear" w:color="auto" w:fill="F4B083" w:themeFill="accent2" w:themeFillTint="99"/>
+        <w:tabs>
+          <w:tab w:val="left" w:pos="2298"/>
+        </w:tabs>
+        <w:rPr>
+          <w:rFonts w:ascii="Times New Roman" w:hAnsi="Times New Roman" w:cs="Times New Roman"/>
+          <w:b/>
+          <w:bCs/>
+        </w:rPr>
+      </w:pPr>
+      <w:r>
+        <w:rPr>
+          <w:rFonts w:ascii="Times New Roman" w:hAnsi="Times New Roman" w:cs="Times New Roman"/>
+          <w:b/>
+          <w:bCs/>
+        </w:rPr>
+        <w:t>2. Sorting Options</w:t>
+      </w:r>
+    </w:p>
+    <w:tbl>
+      <w:tblPr>
+        <w:tblStyle w:val="TableGrid"/>
+        <w:tblW w:w="0" w:type="auto"/>
+        <w:tblLook w:val="04A0" w:firstRow="1" w:lastRow="0" w:firstColumn="1" w:lastColumn="0" w:noHBand="0" w:noVBand="1"/>
+      </w:tblPr>
+      <w:tblGrid>
+        <w:gridCol w:w="10620"/>
+      </w:tblGrid>
+      <w:tr>
+        <w:tc>
+          <w:tcPr>
+            <w:tcW w:w="10620" w:type="dxa"/>
+            <w:shd w:val="clear" w:color="auto" w:fill="E2EFD9" w:themeFill="accent6" w:themeFillTint="33"/>
+          </w:tcPr>
+          <w:p>
+            <w:pPr>
+              <w:tabs>
+                <w:tab w:val="left" w:pos="2298"/>
+              </w:tabs>
+              <w:spacing w:after="160" w:line="259" w:lineRule="auto"/>
+              <w:rPr>
+                <w:rFonts w:ascii="Times New Roman" w:hAnsi="Times New Roman" w:cs="Times New Roman"/>
+              </w:rPr>
+            </w:pPr>
+            <w:r>
+              <w:rPr>
+                <w:rFonts w:ascii="Times New Roman" w:hAnsi="Times New Roman" w:cs="Times New Roman"/>
+              </w:rPr>
+              <w:t>ls -t             # Sorts files by modification time (newest first)</w:t>
+            </w:r>
+          </w:p>
+          <w:p>
+            <w:pPr>
+              <w:tabs>
+                <w:tab w:val="left" w:pos="2298"/>
+              </w:tabs>
+              <w:spacing w:after="160" w:line="259" w:lineRule="auto"/>
+              <w:rPr>
+                <w:rFonts w:ascii="Times New Roman" w:hAnsi="Times New Roman" w:cs="Times New Roman"/>
+              </w:rPr>
+            </w:pPr>
+            <w:r>
+              <w:rPr>
+                <w:rFonts w:ascii="Times New Roman" w:hAnsi="Times New Roman" w:cs="Times New Roman"/>
+              </w:rPr>
+              <w:t>ls -S             # Sorts by file size (largest first)</w:t>
+            </w:r>
+          </w:p>
+          <w:p>
+            <w:pPr>
+              <w:tabs>
+                <w:tab w:val="left" w:pos="2298"/>
+              </w:tabs>
+              <w:spacing w:after="160" w:line="259" w:lineRule="auto"/>
+              <w:rPr>
+                <w:rFonts w:ascii="Times New Roman" w:hAnsi="Times New Roman" w:cs="Times New Roman"/>
+              </w:rPr>
+            </w:pPr>
+            <w:r>
+              <w:rPr>
+                <w:rFonts w:ascii="Times New Roman" w:hAnsi="Times New Roman" w:cs="Times New Roman"/>
+              </w:rPr>
+              <w:t>ls -X             # Sorts by file extension</w:t>
+            </w:r>
+          </w:p>
+          <w:p>
+            <w:pPr>
+              <w:tabs>
+                <w:tab w:val="left" w:pos="2298"/>
+              </w:tabs>
+              <w:spacing w:after="160" w:line="259" w:lineRule="auto"/>
+              <w:rPr>
+                <w:rFonts w:ascii="Times New Roman" w:hAnsi="Times New Roman" w:cs="Times New Roman"/>
+              </w:rPr>
+            </w:pPr>
+            <w:r>
+              <w:rPr>
+                <w:rFonts w:ascii="Times New Roman" w:hAnsi="Times New Roman" w:cs="Times New Roman"/>
+              </w:rPr>
+              <w:t>ls -r             # Reverses sorting order</w:t>
+            </w:r>
+          </w:p>
+        </w:tc>
+      </w:tr>
+    </w:tbl>
+    <w:p>
+      <w:pPr>
+        <w:shd w:val="clear" w:color="auto" w:fill="F4B083" w:themeFill="accent2" w:themeFillTint="99"/>
+        <w:tabs>
+          <w:tab w:val="left" w:pos="2298"/>
+        </w:tabs>
+        <w:rPr>
+          <w:rFonts w:ascii="Times New Roman" w:hAnsi="Times New Roman" w:cs="Times New Roman"/>
+          <w:b/>
+          <w:bCs/>
+        </w:rPr>
+      </w:pPr>
+      <w:r>
+        <w:rPr>
+          <w:rFonts w:ascii="Times New Roman" w:hAnsi="Times New Roman" w:cs="Times New Roman"/>
+          <w:b/>
+          <w:bCs/>
+        </w:rPr>
+        <w:t>3. Combining Options</w:t>
+      </w:r>
+    </w:p>
+    <w:tbl>
+      <w:tblPr>
+        <w:tblStyle w:val="TableGrid"/>
+        <w:tblW w:w="0" w:type="auto"/>
+        <w:tblLook w:val="04A0" w:firstRow="1" w:lastRow="0" w:firstColumn="1" w:lastColumn="0" w:noHBand="0" w:noVBand="1"/>
+      </w:tblPr>
+      <w:tblGrid>
+        <w:gridCol w:w="10620"/>
+      </w:tblGrid>
+      <w:tr>
+        <w:tc>
+          <w:tcPr>
+            <w:tcW w:w="10620" w:type="dxa"/>
+            <w:shd w:val="clear" w:color="auto" w:fill="E2EFD9" w:themeFill="accent6" w:themeFillTint="33"/>
+          </w:tcPr>
+          <w:p>
+            <w:pPr>
+              <w:tabs>
+                <w:tab w:val="left" w:pos="2298"/>
+              </w:tabs>
+              <w:spacing w:after="160" w:line="259" w:lineRule="auto"/>
+              <w:rPr>
+                <w:rFonts w:ascii="Times New Roman" w:hAnsi="Times New Roman" w:cs="Times New Roman"/>
+              </w:rPr>
+            </w:pPr>
+            <w:r>
+              <w:rPr>
+                <w:rFonts w:ascii="Times New Roman" w:hAnsi="Times New Roman" w:cs="Times New Roman"/>
+              </w:rPr>
+              <w:t>ls -</w:t>
+            </w:r>
+            <w:proofErr w:type="spellStart"/>
+            <w:r>
+              <w:rPr>
+                <w:rFonts w:ascii="Times New Roman" w:hAnsi="Times New Roman" w:cs="Times New Roman"/>
+              </w:rPr>
+              <w:t>lah</w:t>
+            </w:r>
+            <w:proofErr w:type="spellEnd"/>
+            <w:r>
+              <w:rPr>
+                <w:rFonts w:ascii="Times New Roman" w:hAnsi="Times New Roman" w:cs="Times New Roman"/>
+              </w:rPr>
+              <w:t xml:space="preserve">           # Lists all files, detailed, human-readable format</w:t>
+            </w:r>
+          </w:p>
+          <w:p>
+            <w:pPr>
+              <w:tabs>
+                <w:tab w:val="left" w:pos="2298"/>
+              </w:tabs>
+              <w:spacing w:after="160" w:line="259" w:lineRule="auto"/>
+              <w:rPr>
+                <w:rFonts w:ascii="Times New Roman" w:hAnsi="Times New Roman" w:cs="Times New Roman"/>
+              </w:rPr>
+            </w:pPr>
+            <w:r>
+              <w:rPr>
+                <w:rFonts w:ascii="Times New Roman" w:hAnsi="Times New Roman" w:cs="Times New Roman"/>
+              </w:rPr>
+              <w:t>ls -</w:t>
+            </w:r>
+            <w:proofErr w:type="spellStart"/>
+            <w:r>
+              <w:rPr>
+                <w:rFonts w:ascii="Times New Roman" w:hAnsi="Times New Roman" w:cs="Times New Roman"/>
+              </w:rPr>
+              <w:t>ltr</w:t>
+            </w:r>
+            <w:proofErr w:type="spellEnd"/>
+            <w:r>
+              <w:rPr>
+                <w:rFonts w:ascii="Times New Roman" w:hAnsi="Times New Roman" w:cs="Times New Roman"/>
+              </w:rPr>
+              <w:t xml:space="preserve">           # Lists files sorted by date, oldest first</w:t>
+            </w:r>
+          </w:p>
+          <w:p>
+            <w:pPr>
+              <w:tabs>
+                <w:tab w:val="left" w:pos="2298"/>
+              </w:tabs>
+              <w:spacing w:after="160" w:line="259" w:lineRule="auto"/>
+              <w:rPr>
+                <w:rFonts w:ascii="Times New Roman" w:hAnsi="Times New Roman" w:cs="Times New Roman"/>
+              </w:rPr>
+            </w:pPr>
+            <w:r>
+              <w:rPr>
+                <w:rFonts w:ascii="Times New Roman" w:hAnsi="Times New Roman" w:cs="Times New Roman"/>
+              </w:rPr>
+              <w:t>ls -</w:t>
+            </w:r>
+            <w:proofErr w:type="spellStart"/>
+            <w:r>
+              <w:rPr>
+                <w:rFonts w:ascii="Times New Roman" w:hAnsi="Times New Roman" w:cs="Times New Roman"/>
+              </w:rPr>
+              <w:t>lhS</w:t>
+            </w:r>
+            <w:proofErr w:type="spellEnd"/>
+            <w:r>
+              <w:rPr>
+                <w:rFonts w:ascii="Times New Roman" w:hAnsi="Times New Roman" w:cs="Times New Roman"/>
+              </w:rPr>
+              <w:t xml:space="preserve">           # Lists files by size in human-readable format</w:t>
+            </w:r>
+          </w:p>
+        </w:tc>
+      </w:tr>
+    </w:tbl>
+    <w:p>
+      <w:pPr>
+        <w:shd w:val="clear" w:color="auto" w:fill="F4B083" w:themeFill="accent2" w:themeFillTint="99"/>
+        <w:tabs>
+          <w:tab w:val="left" w:pos="2298"/>
+        </w:tabs>
+        <w:rPr>
+          <w:rFonts w:ascii="Times New Roman" w:hAnsi="Times New Roman" w:cs="Times New Roman"/>
+          <w:b/>
+          <w:bCs/>
+        </w:rPr>
+      </w:pPr>
+      <w:r>
+        <w:rPr>
+          <w:rFonts w:ascii="Times New Roman" w:hAnsi="Times New Roman" w:cs="Times New Roman"/>
+          <w:b/>
+          <w:bCs/>
+        </w:rPr>
+        <w:t>4. List Files in Specific Directory</w:t>
+      </w:r>
+    </w:p>
+    <w:tbl>
+      <w:tblPr>
+        <w:tblStyle w:val="TableGrid"/>
+        <w:tblW w:w="0" w:type="auto"/>
+        <w:tblLook w:val="04A0" w:firstRow="1" w:lastRow="0" w:firstColumn="1" w:lastColumn="0" w:noHBand="0" w:noVBand="1"/>
+      </w:tblPr>
+      <w:tblGrid>
+        <w:gridCol w:w="10620"/>
+      </w:tblGrid>
+      <w:tr>
+        <w:tc>
+          <w:tcPr>
+            <w:tcW w:w="10620" w:type="dxa"/>
+            <w:shd w:val="clear" w:color="auto" w:fill="E2EFD9" w:themeFill="accent6" w:themeFillTint="33"/>
+          </w:tcPr>
+          <w:p>
+            <w:pPr>
+              <w:tabs>
+                <w:tab w:val="left" w:pos="2298"/>
+              </w:tabs>
+              <w:spacing w:after="160" w:line="259" w:lineRule="auto"/>
+              <w:rPr>
+                <w:rFonts w:ascii="Times New Roman" w:hAnsi="Times New Roman" w:cs="Times New Roman"/>
+              </w:rPr>
+            </w:pPr>
+            <w:r>
+              <w:rPr>
+                <w:rFonts w:ascii="Times New Roman" w:hAnsi="Times New Roman" w:cs="Times New Roman"/>
+              </w:rPr>
+              <w:t>ls /home/user     # Lists files in `/home/user`</w:t>
+            </w:r>
+          </w:p>
+          <w:p>
+            <w:pPr>
+              <w:tabs>
+                <w:tab w:val="left" w:pos="2298"/>
+              </w:tabs>
+              <w:spacing w:after="160" w:line="259" w:lineRule="auto"/>
+              <w:rPr>
+                <w:rFonts w:ascii="Times New Roman" w:hAnsi="Times New Roman" w:cs="Times New Roman"/>
+              </w:rPr>
+            </w:pPr>
+            <w:r>
+              <w:rPr>
+                <w:rFonts w:ascii="Times New Roman" w:hAnsi="Times New Roman" w:cs="Times New Roman"/>
+              </w:rPr>
+              <w:t>ls ~/Documents    # Lists files in `Documents` directory</w:t>
+            </w:r>
+          </w:p>
+          <w:p>
+            <w:pPr>
+              <w:tabs>
+                <w:tab w:val="left" w:pos="2298"/>
+              </w:tabs>
+              <w:spacing w:after="160" w:line="259" w:lineRule="auto"/>
+              <w:rPr>
+                <w:rFonts w:ascii="Times New Roman" w:hAnsi="Times New Roman" w:cs="Times New Roman"/>
+              </w:rPr>
+            </w:pPr>
+            <w:r>
+              <w:rPr>
+                <w:rFonts w:ascii="Times New Roman" w:hAnsi="Times New Roman" w:cs="Times New Roman"/>
+              </w:rPr>
+              <w:t>ls</w:t>
+            </w:r>
+            <w:proofErr w:type="gramStart"/>
+            <w:r>
+              <w:rPr>
+                <w:rFonts w:ascii="Times New Roman" w:hAnsi="Times New Roman" w:cs="Times New Roman"/>
+              </w:rPr>
+              <w:t xml:space="preserve"> ..</w:t>
+            </w:r>
+            <w:proofErr w:type="gramEnd"/>
+            <w:r>
+              <w:rPr>
+                <w:rFonts w:ascii="Times New Roman" w:hAnsi="Times New Roman" w:cs="Times New Roman"/>
+              </w:rPr>
+              <w:t xml:space="preserve">             # Lists files in the parent directory</w:t>
+            </w:r>
+          </w:p>
+        </w:tc>
+      </w:tr>
+    </w:tbl>
+    <w:p>
+      <w:pPr>
+        <w:shd w:val="clear" w:color="auto" w:fill="F4B083" w:themeFill="accent2" w:themeFillTint="99"/>
+        <w:tabs>
+          <w:tab w:val="left" w:pos="2298"/>
+        </w:tabs>
+        <w:rPr>
+          <w:rFonts w:ascii="Times New Roman" w:hAnsi="Times New Roman" w:cs="Times New Roman"/>
+          <w:b/>
+          <w:bCs/>
+        </w:rPr>
+      </w:pPr>
+      <w:r>
+        <w:rPr>
+          <w:rFonts w:ascii="Times New Roman" w:hAnsi="Times New Roman" w:cs="Times New Roman"/>
+          <w:b/>
+          <w:bCs/>
+        </w:rPr>
+        <w:t>5. Filtering Files</w:t>
+      </w:r>
+    </w:p>
+    <w:tbl>
+      <w:tblPr>
+        <w:tblStyle w:val="TableGrid"/>
+        <w:tblW w:w="0" w:type="auto"/>
+        <w:tblLook w:val="04A0" w:firstRow="1" w:lastRow="0" w:firstColumn="1" w:lastColumn="0" w:noHBand="0" w:noVBand="1"/>
+      </w:tblPr>
+      <w:tblGrid>
+        <w:gridCol w:w="10620"/>
+      </w:tblGrid>
+      <w:tr>
+        <w:tc>
+          <w:tcPr>
+            <w:tcW w:w="10620" w:type="dxa"/>
+            <w:shd w:val="clear" w:color="auto" w:fill="E2EFD9" w:themeFill="accent6" w:themeFillTint="33"/>
+          </w:tcPr>
+          <w:p>
+            <w:pPr>
+              <w:tabs>
+                <w:tab w:val="left" w:pos="2298"/>
+              </w:tabs>
+              <w:spacing w:after="160" w:line="259" w:lineRule="auto"/>
+              <w:rPr>
+                <w:rFonts w:ascii="Times New Roman" w:hAnsi="Times New Roman" w:cs="Times New Roman"/>
+              </w:rPr>
+            </w:pPr>
+            <w:r>
+              <w:rPr>
+                <w:rFonts w:ascii="Times New Roman" w:hAnsi="Times New Roman" w:cs="Times New Roman"/>
+              </w:rPr>
+              <w:t>ls *.txt          # Lists all `.txt` files</w:t>
+            </w:r>
+          </w:p>
+          <w:p>
+            <w:pPr>
+              <w:tabs>
+                <w:tab w:val="left" w:pos="2298"/>
+              </w:tabs>
+              <w:spacing w:after="160" w:line="259" w:lineRule="auto"/>
+              <w:rPr>
+                <w:rFonts w:ascii="Times New Roman" w:hAnsi="Times New Roman" w:cs="Times New Roman"/>
+              </w:rPr>
+            </w:pPr>
+            <w:r>
+              <w:rPr>
+                <w:rFonts w:ascii="Times New Roman" w:hAnsi="Times New Roman" w:cs="Times New Roman"/>
+              </w:rPr>
+              <w:t>ls *2024*         # Lists files containing "2024" in the name</w:t>
+            </w:r>
+          </w:p>
+          <w:p>
+            <w:pPr>
+              <w:tabs>
+                <w:tab w:val="left" w:pos="2298"/>
+              </w:tabs>
+              <w:spacing w:after="160" w:line="259" w:lineRule="auto"/>
+              <w:rPr>
+                <w:rFonts w:ascii="Times New Roman" w:hAnsi="Times New Roman" w:cs="Times New Roman"/>
+              </w:rPr>
+            </w:pPr>
+            <w:r>
+              <w:rPr>
+                <w:rFonts w:ascii="Times New Roman" w:hAnsi="Times New Roman" w:cs="Times New Roman"/>
+              </w:rPr>
+              <w:t>ls -l | grep "log" # Lists files containing "log"</w:t>
+            </w:r>
+          </w:p>
+        </w:tc>
+      </w:tr>
+    </w:tbl>
+    <w:p>
+      <w:pPr>
+        <w:shd w:val="clear" w:color="auto" w:fill="F4B083" w:themeFill="accent2" w:themeFillTint="99"/>
+        <w:tabs>
+          <w:tab w:val="left" w:pos="2298"/>
+        </w:tabs>
+        <w:rPr>
+          <w:rFonts w:ascii="Times New Roman" w:hAnsi="Times New Roman" w:cs="Times New Roman"/>
+          <w:b/>
+          <w:bCs/>
+        </w:rPr>
+      </w:pPr>
+      <w:r>
+        <w:rPr>
+          <w:rFonts w:ascii="Times New Roman" w:hAnsi="Times New Roman" w:cs="Times New Roman"/>
+          <w:b/>
+          <w:bCs/>
+        </w:rPr>
+        <w:t>6. PowerShell (ls Equivalent)</w:t>
+      </w:r>
+    </w:p>
+    <w:p>
+      <w:pPr>
+        <w:tabs>
+          <w:tab w:val="left" w:pos="2298"/>
+        </w:tabs>
+        <w:rPr>
+          <w:rFonts w:ascii="Times New Roman" w:hAnsi="Times New Roman" w:cs="Times New Roman"/>
+        </w:rPr>
+      </w:pPr>
+      <w:r>
+        <w:rPr>
+          <w:rFonts w:ascii="Times New Roman" w:hAnsi="Times New Roman" w:cs="Times New Roman"/>
+        </w:rPr>
+        <w:t xml:space="preserve">In </w:t>
+      </w:r>
+      <w:r>
+        <w:rPr>
+          <w:rFonts w:ascii="Times New Roman" w:hAnsi="Times New Roman" w:cs="Times New Roman"/>
+          <w:b/>
+          <w:bCs/>
+        </w:rPr>
+        <w:t>Windows PowerShell</w:t>
+      </w:r>
+      <w:r>
+        <w:rPr>
+          <w:rFonts w:ascii="Times New Roman" w:hAnsi="Times New Roman" w:cs="Times New Roman"/>
+        </w:rPr>
+        <w:t>, ls is an alias for Get-</w:t>
+      </w:r>
+      <w:proofErr w:type="spellStart"/>
+      <w:r>
+        <w:rPr>
+          <w:rFonts w:ascii="Times New Roman" w:hAnsi="Times New Roman" w:cs="Times New Roman"/>
+        </w:rPr>
+        <w:t>ChildItem</w:t>
+      </w:r>
+      <w:proofErr w:type="spellEnd"/>
+      <w:r>
+        <w:rPr>
+          <w:rFonts w:ascii="Times New Roman" w:hAnsi="Times New Roman" w:cs="Times New Roman"/>
+        </w:rPr>
+        <w:t>:</w:t>
+      </w:r>
+    </w:p>
+    <w:tbl>
+      <w:tblPr>
+        <w:tblStyle w:val="TableGrid"/>
+        <w:tblW w:w="0" w:type="auto"/>
+        <w:tblLook w:val="04A0" w:firstRow="1" w:lastRow="0" w:firstColumn="1" w:lastColumn="0" w:noHBand="0" w:noVBand="1"/>
+      </w:tblPr>
+      <w:tblGrid>
+        <w:gridCol w:w="10620"/>
+      </w:tblGrid>
+      <w:tr>
+        <w:tc>
+          <w:tcPr>
+            <w:tcW w:w="10620" w:type="dxa"/>
+            <w:shd w:val="clear" w:color="auto" w:fill="E2EFD9" w:themeFill="accent6" w:themeFillTint="33"/>
+          </w:tcPr>
+          <w:p>
+            <w:pPr>
+              <w:tabs>
+                <w:tab w:val="left" w:pos="2298"/>
+              </w:tabs>
+              <w:spacing w:after="160" w:line="259" w:lineRule="auto"/>
+              <w:rPr>
+                <w:rFonts w:ascii="Times New Roman" w:hAnsi="Times New Roman" w:cs="Times New Roman"/>
+              </w:rPr>
+            </w:pPr>
+            <w:r>
+              <w:rPr>
+                <w:rFonts w:ascii="Times New Roman" w:hAnsi="Times New Roman" w:cs="Times New Roman"/>
+              </w:rPr>
+              <w:t>ls                # Lists files in PowerShell</w:t>
+            </w:r>
+          </w:p>
+          <w:p>
+            <w:pPr>
+              <w:tabs>
+                <w:tab w:val="left" w:pos="2298"/>
+              </w:tabs>
+              <w:spacing w:after="160" w:line="259" w:lineRule="auto"/>
+              <w:rPr>
+                <w:rFonts w:ascii="Times New Roman" w:hAnsi="Times New Roman" w:cs="Times New Roman"/>
+              </w:rPr>
+            </w:pPr>
+            <w:r>
+              <w:rPr>
+                <w:rFonts w:ascii="Times New Roman" w:hAnsi="Times New Roman" w:cs="Times New Roman"/>
+              </w:rPr>
+              <w:t>Get-</w:t>
+            </w:r>
+            <w:proofErr w:type="spellStart"/>
+            <w:r>
+              <w:rPr>
+                <w:rFonts w:ascii="Times New Roman" w:hAnsi="Times New Roman" w:cs="Times New Roman"/>
+              </w:rPr>
+              <w:t>ChildItem</w:t>
+            </w:r>
+            <w:proofErr w:type="spellEnd"/>
+            <w:r>
+              <w:rPr>
+                <w:rFonts w:ascii="Times New Roman" w:hAnsi="Times New Roman" w:cs="Times New Roman"/>
+              </w:rPr>
+              <w:t xml:space="preserve"> -Path C:\Users -</w:t>
+            </w:r>
+            <w:proofErr w:type="gramStart"/>
+            <w:r>
+              <w:rPr>
+                <w:rFonts w:ascii="Times New Roman" w:hAnsi="Times New Roman" w:cs="Times New Roman"/>
+              </w:rPr>
+              <w:t>Force  #</w:t>
+            </w:r>
+            <w:proofErr w:type="gramEnd"/>
+            <w:r>
+              <w:rPr>
+                <w:rFonts w:ascii="Times New Roman" w:hAnsi="Times New Roman" w:cs="Times New Roman"/>
+              </w:rPr>
+              <w:t xml:space="preserve"> Lists all, including hidden files</w:t>
+            </w:r>
+          </w:p>
+          <w:p>
+            <w:pPr>
+              <w:tabs>
+                <w:tab w:val="left" w:pos="2298"/>
+              </w:tabs>
+              <w:spacing w:after="160" w:line="259" w:lineRule="auto"/>
+              <w:rPr>
+                <w:rFonts w:ascii="Times New Roman" w:hAnsi="Times New Roman" w:cs="Times New Roman"/>
+              </w:rPr>
+            </w:pPr>
+            <w:r>
+              <w:rPr>
+                <w:rFonts w:ascii="Times New Roman" w:hAnsi="Times New Roman" w:cs="Times New Roman"/>
+              </w:rPr>
+              <w:t>Get-</w:t>
+            </w:r>
+            <w:proofErr w:type="spellStart"/>
+            <w:r>
+              <w:rPr>
+                <w:rFonts w:ascii="Times New Roman" w:hAnsi="Times New Roman" w:cs="Times New Roman"/>
+              </w:rPr>
+              <w:t>ChildItem</w:t>
+            </w:r>
+            <w:proofErr w:type="spellEnd"/>
+            <w:r>
+              <w:rPr>
+                <w:rFonts w:ascii="Times New Roman" w:hAnsi="Times New Roman" w:cs="Times New Roman"/>
+              </w:rPr>
+              <w:t xml:space="preserve"> -Recurse               # Recursively lists files</w:t>
+            </w:r>
+          </w:p>
+        </w:tc>
+      </w:tr>
+    </w:tbl>
+    <w:p>
+      <w:pPr>
+        <w:shd w:val="clear" w:color="auto" w:fill="F4B083" w:themeFill="accent2" w:themeFillTint="99"/>
+        <w:tabs>
+          <w:tab w:val="left" w:pos="2298"/>
+        </w:tabs>
+        <w:rPr>
+          <w:rFonts w:ascii="Times New Roman" w:hAnsi="Times New Roman" w:cs="Times New Roman"/>
+          <w:b/>
+          <w:bCs/>
+        </w:rPr>
+      </w:pPr>
+      <w:r>
+        <w:rPr>
+          <w:rFonts w:ascii="Times New Roman" w:hAnsi="Times New Roman" w:cs="Times New Roman"/>
+          <w:b/>
+          <w:bCs/>
+        </w:rPr>
+        <w:t>7. Special ls Commands</w:t>
+      </w:r>
+    </w:p>
+    <w:tbl>
+      <w:tblPr>
+        <w:tblStyle w:val="TableGrid"/>
+        <w:tblW w:w="0" w:type="auto"/>
+        <w:tblLook w:val="04A0" w:firstRow="1" w:lastRow="0" w:firstColumn="1" w:lastColumn="0" w:noHBand="0" w:noVBand="1"/>
+      </w:tblPr>
+      <w:tblGrid>
+        <w:gridCol w:w="10620"/>
+      </w:tblGrid>
+      <w:tr>
+        <w:tc>
+          <w:tcPr>
+            <w:tcW w:w="10620" w:type="dxa"/>
+            <w:shd w:val="clear" w:color="auto" w:fill="E2EFD9" w:themeFill="accent6" w:themeFillTint="33"/>
+          </w:tcPr>
+          <w:p>
+            <w:pPr>
+              <w:tabs>
+                <w:tab w:val="left" w:pos="2298"/>
+              </w:tabs>
+              <w:spacing w:after="160" w:line="259" w:lineRule="auto"/>
+              <w:rPr>
+                <w:rFonts w:ascii="Times New Roman" w:hAnsi="Times New Roman" w:cs="Times New Roman"/>
+              </w:rPr>
+            </w:pPr>
+            <w:r>
+              <w:rPr>
+                <w:rFonts w:ascii="Times New Roman" w:hAnsi="Times New Roman" w:cs="Times New Roman"/>
+              </w:rPr>
+              <w:t>ls --</w:t>
+            </w:r>
+            <w:proofErr w:type="spellStart"/>
+            <w:r>
+              <w:rPr>
+                <w:rFonts w:ascii="Times New Roman" w:hAnsi="Times New Roman" w:cs="Times New Roman"/>
+              </w:rPr>
+              <w:t>color</w:t>
+            </w:r>
+            <w:proofErr w:type="spellEnd"/>
+            <w:r>
+              <w:rPr>
+                <w:rFonts w:ascii="Times New Roman" w:hAnsi="Times New Roman" w:cs="Times New Roman"/>
+              </w:rPr>
+              <w:t xml:space="preserve">=auto   # Enables </w:t>
+            </w:r>
+            <w:proofErr w:type="spellStart"/>
+            <w:r>
+              <w:rPr>
+                <w:rFonts w:ascii="Times New Roman" w:hAnsi="Times New Roman" w:cs="Times New Roman"/>
+              </w:rPr>
+              <w:t>colored</w:t>
+            </w:r>
+            <w:proofErr w:type="spellEnd"/>
+            <w:r>
+              <w:rPr>
+                <w:rFonts w:ascii="Times New Roman" w:hAnsi="Times New Roman" w:cs="Times New Roman"/>
+              </w:rPr>
+              <w:t xml:space="preserve"> output (Linux)</w:t>
+            </w:r>
+          </w:p>
+          <w:p>
+            <w:pPr>
+              <w:tabs>
+                <w:tab w:val="left" w:pos="2298"/>
+              </w:tabs>
+              <w:spacing w:after="160" w:line="259" w:lineRule="auto"/>
+              <w:rPr>
+                <w:rFonts w:ascii="Times New Roman" w:hAnsi="Times New Roman" w:cs="Times New Roman"/>
+              </w:rPr>
+            </w:pPr>
+            <w:r>
+              <w:rPr>
+                <w:rFonts w:ascii="Times New Roman" w:hAnsi="Times New Roman" w:cs="Times New Roman"/>
+              </w:rPr>
+              <w:t>ls --help         # Shows help for `</w:t>
+            </w:r>
+            <w:proofErr w:type="spellStart"/>
+            <w:r>
+              <w:rPr>
+                <w:rFonts w:ascii="Times New Roman" w:hAnsi="Times New Roman" w:cs="Times New Roman"/>
+              </w:rPr>
+              <w:t>ls`</w:t>
+            </w:r>
+            <w:proofErr w:type="spellEnd"/>
+          </w:p>
+        </w:tc>
+      </w:tr>
+    </w:tbl>
     <w:p>
       <w:pPr>
         <w:tabs>

</xml_diff>

<commit_message>
10/3 : python basics: revesion
</commit_message>
<xml_diff>
--- a/Notes/Git and gitHub.docx
+++ b/Notes/Git and gitHub.docx
@@ -10848,6 +10848,1843 @@
         </w:rPr>
       </w:pPr>
     </w:p>
+    <w:p>
+      <w:pPr>
+        <w:shd w:val="clear" w:color="auto" w:fill="C45911" w:themeFill="accent2" w:themeFillShade="BF"/>
+        <w:tabs>
+          <w:tab w:val="left" w:pos="2298"/>
+        </w:tabs>
+        <w:rPr>
+          <w:rFonts w:ascii="Times New Roman" w:hAnsi="Times New Roman" w:cs="Times New Roman"/>
+          <w:b/>
+          <w:bCs/>
+          <w:sz w:val="28"/>
+          <w:szCs w:val="28"/>
+        </w:rPr>
+      </w:pPr>
+      <w:r>
+        <w:rPr>
+          <w:rFonts w:ascii="Segoe UI Emoji" w:hAnsi="Segoe UI Emoji" w:cs="Segoe UI Emoji"/>
+          <w:b/>
+          <w:bCs/>
+          <w:sz w:val="28"/>
+          <w:szCs w:val="28"/>
+        </w:rPr>
+        <w:t>🔑</w:t>
+      </w:r>
+      <w:r>
+        <w:rPr>
+          <w:rFonts w:ascii="Times New Roman" w:hAnsi="Times New Roman" w:cs="Times New Roman"/>
+          <w:b/>
+          <w:bCs/>
+          <w:sz w:val="28"/>
+          <w:szCs w:val="28"/>
+        </w:rPr>
+        <w:t xml:space="preserve"> Key Branches in </w:t>
+      </w:r>
+      <w:proofErr w:type="spellStart"/>
+      <w:r>
+        <w:rPr>
+          <w:rFonts w:ascii="Times New Roman" w:hAnsi="Times New Roman" w:cs="Times New Roman"/>
+          <w:b/>
+          <w:bCs/>
+          <w:sz w:val="28"/>
+          <w:szCs w:val="28"/>
+        </w:rPr>
+        <w:t>Gitflow</w:t>
+      </w:r>
+      <w:proofErr w:type="spellEnd"/>
+    </w:p>
+    <w:p>
+      <w:pPr>
+        <w:numPr>
+          <w:ilvl w:val="0"/>
+          <w:numId w:val="19"/>
+        </w:numPr>
+        <w:shd w:val="clear" w:color="auto" w:fill="FFD966" w:themeFill="accent4" w:themeFillTint="99"/>
+        <w:tabs>
+          <w:tab w:val="left" w:pos="2298"/>
+        </w:tabs>
+        <w:rPr>
+          <w:rFonts w:ascii="Times New Roman" w:hAnsi="Times New Roman" w:cs="Times New Roman"/>
+          <w:sz w:val="24"/>
+          <w:szCs w:val="24"/>
+        </w:rPr>
+      </w:pPr>
+      <w:r>
+        <w:rPr>
+          <w:rFonts w:ascii="Times New Roman" w:hAnsi="Times New Roman" w:cs="Times New Roman"/>
+          <w:b/>
+          <w:bCs/>
+          <w:sz w:val="24"/>
+          <w:szCs w:val="24"/>
+        </w:rPr>
+        <w:t>main (Stable Releases)</w:t>
+      </w:r>
+    </w:p>
+    <w:p>
+      <w:pPr>
+        <w:numPr>
+          <w:ilvl w:val="1"/>
+          <w:numId w:val="19"/>
+        </w:numPr>
+        <w:tabs>
+          <w:tab w:val="left" w:pos="2298"/>
+        </w:tabs>
+        <w:rPr>
+          <w:rFonts w:ascii="Times New Roman" w:hAnsi="Times New Roman" w:cs="Times New Roman"/>
+          <w:sz w:val="24"/>
+          <w:szCs w:val="24"/>
+        </w:rPr>
+      </w:pPr>
+      <w:r>
+        <w:rPr>
+          <w:rFonts w:ascii="Times New Roman" w:hAnsi="Times New Roman" w:cs="Times New Roman"/>
+          <w:sz w:val="24"/>
+          <w:szCs w:val="24"/>
+        </w:rPr>
+        <w:t xml:space="preserve">Holds </w:t>
+      </w:r>
+      <w:r>
+        <w:rPr>
+          <w:rFonts w:ascii="Times New Roman" w:hAnsi="Times New Roman" w:cs="Times New Roman"/>
+          <w:b/>
+          <w:bCs/>
+          <w:sz w:val="24"/>
+          <w:szCs w:val="24"/>
+        </w:rPr>
+        <w:t>production-ready</w:t>
+      </w:r>
+      <w:r>
+        <w:rPr>
+          <w:rFonts w:ascii="Times New Roman" w:hAnsi="Times New Roman" w:cs="Times New Roman"/>
+          <w:sz w:val="24"/>
+          <w:szCs w:val="24"/>
+        </w:rPr>
+        <w:t xml:space="preserve"> code.</w:t>
+      </w:r>
+    </w:p>
+    <w:p>
+      <w:pPr>
+        <w:numPr>
+          <w:ilvl w:val="1"/>
+          <w:numId w:val="19"/>
+        </w:numPr>
+        <w:tabs>
+          <w:tab w:val="left" w:pos="2298"/>
+        </w:tabs>
+        <w:rPr>
+          <w:rFonts w:ascii="Times New Roman" w:hAnsi="Times New Roman" w:cs="Times New Roman"/>
+          <w:sz w:val="24"/>
+          <w:szCs w:val="24"/>
+        </w:rPr>
+      </w:pPr>
+      <w:r>
+        <w:rPr>
+          <w:rFonts w:ascii="Times New Roman" w:hAnsi="Times New Roman" w:cs="Times New Roman"/>
+          <w:sz w:val="24"/>
+          <w:szCs w:val="24"/>
+        </w:rPr>
+        <w:t xml:space="preserve">Every commit in main represents a </w:t>
+      </w:r>
+      <w:r>
+        <w:rPr>
+          <w:rFonts w:ascii="Times New Roman" w:hAnsi="Times New Roman" w:cs="Times New Roman"/>
+          <w:b/>
+          <w:bCs/>
+          <w:sz w:val="24"/>
+          <w:szCs w:val="24"/>
+        </w:rPr>
+        <w:t>release version</w:t>
+      </w:r>
+      <w:r>
+        <w:rPr>
+          <w:rFonts w:ascii="Times New Roman" w:hAnsi="Times New Roman" w:cs="Times New Roman"/>
+          <w:sz w:val="24"/>
+          <w:szCs w:val="24"/>
+        </w:rPr>
+        <w:t>.</w:t>
+      </w:r>
+    </w:p>
+    <w:p>
+      <w:pPr>
+        <w:numPr>
+          <w:ilvl w:val="1"/>
+          <w:numId w:val="19"/>
+        </w:numPr>
+        <w:tabs>
+          <w:tab w:val="left" w:pos="2298"/>
+        </w:tabs>
+        <w:rPr>
+          <w:rFonts w:ascii="Times New Roman" w:hAnsi="Times New Roman" w:cs="Times New Roman"/>
+          <w:sz w:val="24"/>
+          <w:szCs w:val="24"/>
+        </w:rPr>
+      </w:pPr>
+      <w:r>
+        <w:rPr>
+          <w:rFonts w:ascii="Times New Roman" w:hAnsi="Times New Roman" w:cs="Times New Roman"/>
+          <w:sz w:val="24"/>
+          <w:szCs w:val="24"/>
+        </w:rPr>
+        <w:t xml:space="preserve">Only updated through </w:t>
+      </w:r>
+      <w:r>
+        <w:rPr>
+          <w:rFonts w:ascii="Times New Roman" w:hAnsi="Times New Roman" w:cs="Times New Roman"/>
+          <w:b/>
+          <w:bCs/>
+          <w:sz w:val="24"/>
+          <w:szCs w:val="24"/>
+        </w:rPr>
+        <w:t>merge from develop</w:t>
+      </w:r>
+      <w:r>
+        <w:rPr>
+          <w:rFonts w:ascii="Times New Roman" w:hAnsi="Times New Roman" w:cs="Times New Roman"/>
+          <w:sz w:val="24"/>
+          <w:szCs w:val="24"/>
+        </w:rPr>
+        <w:t xml:space="preserve"> or hotfixes.</w:t>
+      </w:r>
+    </w:p>
+    <w:p>
+      <w:pPr>
+        <w:numPr>
+          <w:ilvl w:val="0"/>
+          <w:numId w:val="19"/>
+        </w:numPr>
+        <w:shd w:val="clear" w:color="auto" w:fill="FFD966" w:themeFill="accent4" w:themeFillTint="99"/>
+        <w:tabs>
+          <w:tab w:val="left" w:pos="2298"/>
+        </w:tabs>
+        <w:rPr>
+          <w:rFonts w:ascii="Times New Roman" w:hAnsi="Times New Roman" w:cs="Times New Roman"/>
+          <w:sz w:val="24"/>
+          <w:szCs w:val="24"/>
+        </w:rPr>
+      </w:pPr>
+      <w:r>
+        <w:rPr>
+          <w:rFonts w:ascii="Times New Roman" w:hAnsi="Times New Roman" w:cs="Times New Roman"/>
+          <w:b/>
+          <w:bCs/>
+          <w:sz w:val="24"/>
+          <w:szCs w:val="24"/>
+        </w:rPr>
+        <w:t>develop (Integration of Features)</w:t>
+      </w:r>
+    </w:p>
+    <w:p>
+      <w:pPr>
+        <w:numPr>
+          <w:ilvl w:val="1"/>
+          <w:numId w:val="19"/>
+        </w:numPr>
+        <w:tabs>
+          <w:tab w:val="left" w:pos="2298"/>
+        </w:tabs>
+        <w:rPr>
+          <w:rFonts w:ascii="Times New Roman" w:hAnsi="Times New Roman" w:cs="Times New Roman"/>
+          <w:sz w:val="24"/>
+          <w:szCs w:val="24"/>
+        </w:rPr>
+      </w:pPr>
+      <w:r>
+        <w:rPr>
+          <w:rFonts w:ascii="Times New Roman" w:hAnsi="Times New Roman" w:cs="Times New Roman"/>
+          <w:sz w:val="24"/>
+          <w:szCs w:val="24"/>
+        </w:rPr>
+        <w:t>The main working branch where features are merged.</w:t>
+      </w:r>
+    </w:p>
+    <w:p>
+      <w:pPr>
+        <w:numPr>
+          <w:ilvl w:val="1"/>
+          <w:numId w:val="19"/>
+        </w:numPr>
+        <w:tabs>
+          <w:tab w:val="left" w:pos="2298"/>
+        </w:tabs>
+        <w:rPr>
+          <w:rFonts w:ascii="Times New Roman" w:hAnsi="Times New Roman" w:cs="Times New Roman"/>
+          <w:sz w:val="24"/>
+          <w:szCs w:val="24"/>
+        </w:rPr>
+      </w:pPr>
+      <w:r>
+        <w:rPr>
+          <w:rFonts w:ascii="Times New Roman" w:hAnsi="Times New Roman" w:cs="Times New Roman"/>
+          <w:sz w:val="24"/>
+          <w:szCs w:val="24"/>
+        </w:rPr>
+        <w:t xml:space="preserve">Always reflects the latest </w:t>
+      </w:r>
+      <w:r>
+        <w:rPr>
+          <w:rFonts w:ascii="Times New Roman" w:hAnsi="Times New Roman" w:cs="Times New Roman"/>
+          <w:b/>
+          <w:bCs/>
+          <w:sz w:val="24"/>
+          <w:szCs w:val="24"/>
+        </w:rPr>
+        <w:t>completed</w:t>
+      </w:r>
+      <w:r>
+        <w:rPr>
+          <w:rFonts w:ascii="Times New Roman" w:hAnsi="Times New Roman" w:cs="Times New Roman"/>
+          <w:sz w:val="24"/>
+          <w:szCs w:val="24"/>
+        </w:rPr>
+        <w:t xml:space="preserve"> developments.</w:t>
+      </w:r>
+    </w:p>
+    <w:p>
+      <w:pPr>
+        <w:numPr>
+          <w:ilvl w:val="1"/>
+          <w:numId w:val="19"/>
+        </w:numPr>
+        <w:tabs>
+          <w:tab w:val="left" w:pos="2298"/>
+        </w:tabs>
+        <w:rPr>
+          <w:rFonts w:ascii="Times New Roman" w:hAnsi="Times New Roman" w:cs="Times New Roman"/>
+          <w:sz w:val="24"/>
+          <w:szCs w:val="24"/>
+        </w:rPr>
+      </w:pPr>
+      <w:r>
+        <w:rPr>
+          <w:rFonts w:ascii="Times New Roman" w:hAnsi="Times New Roman" w:cs="Times New Roman"/>
+          <w:sz w:val="24"/>
+          <w:szCs w:val="24"/>
+        </w:rPr>
+        <w:t xml:space="preserve">Used for </w:t>
+      </w:r>
+      <w:r>
+        <w:rPr>
+          <w:rFonts w:ascii="Times New Roman" w:hAnsi="Times New Roman" w:cs="Times New Roman"/>
+          <w:b/>
+          <w:bCs/>
+          <w:sz w:val="24"/>
+          <w:szCs w:val="24"/>
+        </w:rPr>
+        <w:t>QA/testing</w:t>
+      </w:r>
+      <w:r>
+        <w:rPr>
+          <w:rFonts w:ascii="Times New Roman" w:hAnsi="Times New Roman" w:cs="Times New Roman"/>
+          <w:sz w:val="24"/>
+          <w:szCs w:val="24"/>
+        </w:rPr>
+        <w:t xml:space="preserve"> before merging into main.</w:t>
+      </w:r>
+    </w:p>
+    <w:p>
+      <w:pPr>
+        <w:numPr>
+          <w:ilvl w:val="0"/>
+          <w:numId w:val="19"/>
+        </w:numPr>
+        <w:shd w:val="clear" w:color="auto" w:fill="FFD966" w:themeFill="accent4" w:themeFillTint="99"/>
+        <w:tabs>
+          <w:tab w:val="left" w:pos="2298"/>
+        </w:tabs>
+        <w:rPr>
+          <w:rFonts w:ascii="Times New Roman" w:hAnsi="Times New Roman" w:cs="Times New Roman"/>
+          <w:sz w:val="24"/>
+          <w:szCs w:val="24"/>
+        </w:rPr>
+      </w:pPr>
+      <w:r>
+        <w:rPr>
+          <w:rFonts w:ascii="Times New Roman" w:hAnsi="Times New Roman" w:cs="Times New Roman"/>
+          <w:b/>
+          <w:bCs/>
+          <w:sz w:val="24"/>
+          <w:szCs w:val="24"/>
+        </w:rPr>
+        <w:t>feature (New Features Development)</w:t>
+      </w:r>
+    </w:p>
+    <w:p>
+      <w:pPr>
+        <w:numPr>
+          <w:ilvl w:val="1"/>
+          <w:numId w:val="19"/>
+        </w:numPr>
+        <w:tabs>
+          <w:tab w:val="left" w:pos="2298"/>
+        </w:tabs>
+        <w:rPr>
+          <w:rFonts w:ascii="Times New Roman" w:hAnsi="Times New Roman" w:cs="Times New Roman"/>
+          <w:sz w:val="24"/>
+          <w:szCs w:val="24"/>
+        </w:rPr>
+      </w:pPr>
+      <w:r>
+        <w:rPr>
+          <w:rFonts w:ascii="Times New Roman" w:hAnsi="Times New Roman" w:cs="Times New Roman"/>
+          <w:sz w:val="24"/>
+          <w:szCs w:val="24"/>
+        </w:rPr>
+        <w:t>Each feature has its own branch: feature/feature-name.</w:t>
+      </w:r>
+    </w:p>
+    <w:p>
+      <w:pPr>
+        <w:numPr>
+          <w:ilvl w:val="1"/>
+          <w:numId w:val="19"/>
+        </w:numPr>
+        <w:tabs>
+          <w:tab w:val="left" w:pos="2298"/>
+        </w:tabs>
+        <w:rPr>
+          <w:rFonts w:ascii="Times New Roman" w:hAnsi="Times New Roman" w:cs="Times New Roman"/>
+          <w:sz w:val="24"/>
+          <w:szCs w:val="24"/>
+        </w:rPr>
+      </w:pPr>
+      <w:r>
+        <w:rPr>
+          <w:rFonts w:ascii="Times New Roman" w:hAnsi="Times New Roman" w:cs="Times New Roman"/>
+          <w:sz w:val="24"/>
+          <w:szCs w:val="24"/>
+        </w:rPr>
+        <w:t>Created from develop, merged back into develop.</w:t>
+      </w:r>
+    </w:p>
+    <w:p>
+      <w:pPr>
+        <w:numPr>
+          <w:ilvl w:val="1"/>
+          <w:numId w:val="19"/>
+        </w:numPr>
+        <w:tabs>
+          <w:tab w:val="left" w:pos="2298"/>
+        </w:tabs>
+        <w:rPr>
+          <w:rFonts w:ascii="Times New Roman" w:hAnsi="Times New Roman" w:cs="Times New Roman"/>
+          <w:sz w:val="24"/>
+          <w:szCs w:val="24"/>
+        </w:rPr>
+      </w:pPr>
+      <w:r>
+        <w:rPr>
+          <w:rFonts w:ascii="Times New Roman" w:hAnsi="Times New Roman" w:cs="Times New Roman"/>
+          <w:sz w:val="24"/>
+          <w:szCs w:val="24"/>
+        </w:rPr>
+        <w:t>Once complete, it’s removed to keep the repository clean.</w:t>
+      </w:r>
+    </w:p>
+    <w:p>
+      <w:pPr>
+        <w:numPr>
+          <w:ilvl w:val="0"/>
+          <w:numId w:val="19"/>
+        </w:numPr>
+        <w:shd w:val="clear" w:color="auto" w:fill="FFD966" w:themeFill="accent4" w:themeFillTint="99"/>
+        <w:tabs>
+          <w:tab w:val="left" w:pos="2298"/>
+        </w:tabs>
+        <w:rPr>
+          <w:rFonts w:ascii="Times New Roman" w:hAnsi="Times New Roman" w:cs="Times New Roman"/>
+          <w:sz w:val="24"/>
+          <w:szCs w:val="24"/>
+        </w:rPr>
+      </w:pPr>
+      <w:r>
+        <w:rPr>
+          <w:rFonts w:ascii="Times New Roman" w:hAnsi="Times New Roman" w:cs="Times New Roman"/>
+          <w:b/>
+          <w:bCs/>
+          <w:sz w:val="24"/>
+          <w:szCs w:val="24"/>
+        </w:rPr>
+        <w:t>release (Preparing for Deployment)</w:t>
+      </w:r>
+    </w:p>
+    <w:p>
+      <w:pPr>
+        <w:numPr>
+          <w:ilvl w:val="1"/>
+          <w:numId w:val="19"/>
+        </w:numPr>
+        <w:tabs>
+          <w:tab w:val="left" w:pos="2298"/>
+        </w:tabs>
+        <w:rPr>
+          <w:rFonts w:ascii="Times New Roman" w:hAnsi="Times New Roman" w:cs="Times New Roman"/>
+          <w:sz w:val="24"/>
+          <w:szCs w:val="24"/>
+        </w:rPr>
+      </w:pPr>
+      <w:r>
+        <w:rPr>
+          <w:rFonts w:ascii="Times New Roman" w:hAnsi="Times New Roman" w:cs="Times New Roman"/>
+          <w:sz w:val="24"/>
+          <w:szCs w:val="24"/>
+        </w:rPr>
+        <w:t xml:space="preserve">Used to </w:t>
+      </w:r>
+      <w:r>
+        <w:rPr>
+          <w:rFonts w:ascii="Times New Roman" w:hAnsi="Times New Roman" w:cs="Times New Roman"/>
+          <w:b/>
+          <w:bCs/>
+          <w:sz w:val="24"/>
+          <w:szCs w:val="24"/>
+        </w:rPr>
+        <w:t>prepare for a new stable version</w:t>
+      </w:r>
+      <w:r>
+        <w:rPr>
+          <w:rFonts w:ascii="Times New Roman" w:hAnsi="Times New Roman" w:cs="Times New Roman"/>
+          <w:sz w:val="24"/>
+          <w:szCs w:val="24"/>
+        </w:rPr>
+        <w:t>.</w:t>
+      </w:r>
+    </w:p>
+    <w:p>
+      <w:pPr>
+        <w:numPr>
+          <w:ilvl w:val="1"/>
+          <w:numId w:val="19"/>
+        </w:numPr>
+        <w:tabs>
+          <w:tab w:val="left" w:pos="2298"/>
+        </w:tabs>
+        <w:rPr>
+          <w:rFonts w:ascii="Times New Roman" w:hAnsi="Times New Roman" w:cs="Times New Roman"/>
+          <w:sz w:val="24"/>
+          <w:szCs w:val="24"/>
+        </w:rPr>
+      </w:pPr>
+      <w:r>
+        <w:rPr>
+          <w:rFonts w:ascii="Times New Roman" w:hAnsi="Times New Roman" w:cs="Times New Roman"/>
+          <w:sz w:val="24"/>
+          <w:szCs w:val="24"/>
+        </w:rPr>
+        <w:t>Branched from develop, merged into main and develop.</w:t>
+      </w:r>
+    </w:p>
+    <w:p>
+      <w:pPr>
+        <w:numPr>
+          <w:ilvl w:val="1"/>
+          <w:numId w:val="19"/>
+        </w:numPr>
+        <w:tabs>
+          <w:tab w:val="left" w:pos="2298"/>
+        </w:tabs>
+        <w:rPr>
+          <w:rFonts w:ascii="Times New Roman" w:hAnsi="Times New Roman" w:cs="Times New Roman"/>
+          <w:sz w:val="24"/>
+          <w:szCs w:val="24"/>
+        </w:rPr>
+      </w:pPr>
+      <w:r>
+        <w:rPr>
+          <w:rFonts w:ascii="Times New Roman" w:hAnsi="Times New Roman" w:cs="Times New Roman"/>
+          <w:sz w:val="24"/>
+          <w:szCs w:val="24"/>
+        </w:rPr>
+        <w:t>Allows final bug fixes, documentation, and testing.</w:t>
+      </w:r>
+    </w:p>
+    <w:p>
+      <w:pPr>
+        <w:numPr>
+          <w:ilvl w:val="0"/>
+          <w:numId w:val="19"/>
+        </w:numPr>
+        <w:shd w:val="clear" w:color="auto" w:fill="FFD966" w:themeFill="accent4" w:themeFillTint="99"/>
+        <w:tabs>
+          <w:tab w:val="left" w:pos="2298"/>
+        </w:tabs>
+        <w:rPr>
+          <w:rFonts w:ascii="Times New Roman" w:hAnsi="Times New Roman" w:cs="Times New Roman"/>
+          <w:sz w:val="24"/>
+          <w:szCs w:val="24"/>
+        </w:rPr>
+      </w:pPr>
+      <w:r>
+        <w:rPr>
+          <w:rFonts w:ascii="Times New Roman" w:hAnsi="Times New Roman" w:cs="Times New Roman"/>
+          <w:b/>
+          <w:bCs/>
+          <w:sz w:val="24"/>
+          <w:szCs w:val="24"/>
+        </w:rPr>
+        <w:t>hotfix (Urgent Bug Fixes in Production)</w:t>
+      </w:r>
+    </w:p>
+    <w:p>
+      <w:pPr>
+        <w:numPr>
+          <w:ilvl w:val="1"/>
+          <w:numId w:val="19"/>
+        </w:numPr>
+        <w:tabs>
+          <w:tab w:val="left" w:pos="2298"/>
+        </w:tabs>
+        <w:rPr>
+          <w:rFonts w:ascii="Times New Roman" w:hAnsi="Times New Roman" w:cs="Times New Roman"/>
+          <w:sz w:val="24"/>
+          <w:szCs w:val="24"/>
+        </w:rPr>
+      </w:pPr>
+      <w:r>
+        <w:rPr>
+          <w:rFonts w:ascii="Times New Roman" w:hAnsi="Times New Roman" w:cs="Times New Roman"/>
+          <w:sz w:val="24"/>
+          <w:szCs w:val="24"/>
+        </w:rPr>
+        <w:t xml:space="preserve">Used to fix </w:t>
+      </w:r>
+      <w:r>
+        <w:rPr>
+          <w:rFonts w:ascii="Times New Roman" w:hAnsi="Times New Roman" w:cs="Times New Roman"/>
+          <w:b/>
+          <w:bCs/>
+          <w:sz w:val="24"/>
+          <w:szCs w:val="24"/>
+        </w:rPr>
+        <w:t>critical issues</w:t>
+      </w:r>
+      <w:r>
+        <w:rPr>
+          <w:rFonts w:ascii="Times New Roman" w:hAnsi="Times New Roman" w:cs="Times New Roman"/>
+          <w:sz w:val="24"/>
+          <w:szCs w:val="24"/>
+        </w:rPr>
+        <w:t xml:space="preserve"> in main without waiting for a full release.</w:t>
+      </w:r>
+    </w:p>
+    <w:p>
+      <w:pPr>
+        <w:numPr>
+          <w:ilvl w:val="1"/>
+          <w:numId w:val="19"/>
+        </w:numPr>
+        <w:tabs>
+          <w:tab w:val="left" w:pos="2298"/>
+        </w:tabs>
+        <w:rPr>
+          <w:rFonts w:ascii="Times New Roman" w:hAnsi="Times New Roman" w:cs="Times New Roman"/>
+          <w:sz w:val="24"/>
+          <w:szCs w:val="24"/>
+        </w:rPr>
+      </w:pPr>
+      <w:r>
+        <w:rPr>
+          <w:rFonts w:ascii="Times New Roman" w:hAnsi="Times New Roman" w:cs="Times New Roman"/>
+          <w:sz w:val="24"/>
+          <w:szCs w:val="24"/>
+        </w:rPr>
+        <w:t>Created from main, merged back into main and develop.</w:t>
+      </w:r>
+    </w:p>
+    <w:p>
+      <w:pPr>
+        <w:shd w:val="clear" w:color="auto" w:fill="C5E0B3" w:themeFill="accent6" w:themeFillTint="66"/>
+        <w:tabs>
+          <w:tab w:val="left" w:pos="2298"/>
+        </w:tabs>
+        <w:rPr>
+          <w:rFonts w:ascii="Times New Roman" w:hAnsi="Times New Roman" w:cs="Times New Roman"/>
+          <w:b/>
+          <w:bCs/>
+          <w:sz w:val="28"/>
+          <w:szCs w:val="28"/>
+        </w:rPr>
+      </w:pPr>
+      <w:r>
+        <w:rPr>
+          <w:rFonts w:ascii="Segoe UI Emoji" w:hAnsi="Segoe UI Emoji" w:cs="Segoe UI Emoji"/>
+          <w:b/>
+          <w:bCs/>
+          <w:sz w:val="28"/>
+          <w:szCs w:val="28"/>
+        </w:rPr>
+        <w:t>🌱</w:t>
+      </w:r>
+      <w:r>
+        <w:rPr>
+          <w:rFonts w:ascii="Times New Roman" w:hAnsi="Times New Roman" w:cs="Times New Roman"/>
+          <w:b/>
+          <w:bCs/>
+          <w:sz w:val="28"/>
+          <w:szCs w:val="28"/>
+        </w:rPr>
+        <w:t xml:space="preserve"> </w:t>
+      </w:r>
+      <w:proofErr w:type="spellStart"/>
+      <w:r>
+        <w:rPr>
+          <w:rFonts w:ascii="Times New Roman" w:hAnsi="Times New Roman" w:cs="Times New Roman"/>
+          <w:b/>
+          <w:bCs/>
+          <w:sz w:val="28"/>
+          <w:szCs w:val="28"/>
+        </w:rPr>
+        <w:t>Gitflow</w:t>
+      </w:r>
+      <w:proofErr w:type="spellEnd"/>
+      <w:r>
+        <w:rPr>
+          <w:rFonts w:ascii="Times New Roman" w:hAnsi="Times New Roman" w:cs="Times New Roman"/>
+          <w:b/>
+          <w:bCs/>
+          <w:sz w:val="28"/>
+          <w:szCs w:val="28"/>
+        </w:rPr>
+        <w:t xml:space="preserve"> Workflow</w:t>
+      </w:r>
+    </w:p>
+    <w:p>
+      <w:pPr>
+        <w:shd w:val="clear" w:color="auto" w:fill="F7CAAC" w:themeFill="accent2" w:themeFillTint="66"/>
+        <w:tabs>
+          <w:tab w:val="left" w:pos="2298"/>
+        </w:tabs>
+        <w:rPr>
+          <w:rFonts w:ascii="Times New Roman" w:hAnsi="Times New Roman" w:cs="Times New Roman"/>
+          <w:b/>
+          <w:bCs/>
+          <w:sz w:val="28"/>
+          <w:szCs w:val="28"/>
+        </w:rPr>
+      </w:pPr>
+      <w:r>
+        <w:rPr>
+          <w:rFonts w:ascii="Times New Roman" w:hAnsi="Times New Roman" w:cs="Times New Roman"/>
+          <w:b/>
+          <w:bCs/>
+          <w:sz w:val="28"/>
+          <w:szCs w:val="28"/>
+        </w:rPr>
+        <w:t>1</w:t>
+      </w:r>
+      <w:r>
+        <w:rPr>
+          <w:rFonts w:ascii="Times New Roman" w:hAnsi="Times New Roman" w:cs="Times New Roman"/>
+          <w:b/>
+          <w:bCs/>
+          <w:sz w:val="28"/>
+          <w:szCs w:val="28"/>
+        </w:rPr>
+        <w:t>️</w:t>
+      </w:r>
+      <w:r>
+        <w:rPr>
+          <w:rFonts w:ascii="Segoe UI Symbol" w:hAnsi="Segoe UI Symbol" w:cs="Segoe UI Symbol"/>
+          <w:b/>
+          <w:bCs/>
+          <w:sz w:val="28"/>
+          <w:szCs w:val="28"/>
+        </w:rPr>
+        <w:t>.</w:t>
+      </w:r>
+      <w:r>
+        <w:rPr>
+          <w:rFonts w:ascii="Times New Roman" w:hAnsi="Times New Roman" w:cs="Times New Roman"/>
+          <w:b/>
+          <w:bCs/>
+          <w:sz w:val="28"/>
+          <w:szCs w:val="28"/>
+        </w:rPr>
+        <w:t xml:space="preserve"> Start</w:t>
+      </w:r>
+      <w:r>
+        <w:rPr>
+          <w:rFonts w:ascii="Times New Roman" w:hAnsi="Times New Roman" w:cs="Times New Roman"/>
+          <w:b/>
+          <w:bCs/>
+          <w:sz w:val="28"/>
+          <w:szCs w:val="28"/>
+        </w:rPr>
+        <w:t xml:space="preserve"> a New Feature</w:t>
+      </w:r>
+    </w:p>
+    <w:p>
+      <w:pPr>
+        <w:pBdr>
+          <w:top w:val="single" w:sz="4" w:space="1" w:color="auto"/>
+          <w:left w:val="single" w:sz="4" w:space="4" w:color="auto"/>
+          <w:bottom w:val="single" w:sz="4" w:space="1" w:color="auto"/>
+          <w:right w:val="single" w:sz="4" w:space="4" w:color="auto"/>
+        </w:pBdr>
+        <w:shd w:val="clear" w:color="auto" w:fill="E2EFD9" w:themeFill="accent6" w:themeFillTint="33"/>
+        <w:tabs>
+          <w:tab w:val="left" w:pos="2298"/>
+        </w:tabs>
+        <w:rPr>
+          <w:rFonts w:ascii="Times New Roman" w:hAnsi="Times New Roman" w:cs="Times New Roman"/>
+        </w:rPr>
+      </w:pPr>
+      <w:r>
+        <w:rPr>
+          <w:rFonts w:ascii="Times New Roman" w:hAnsi="Times New Roman" w:cs="Times New Roman"/>
+        </w:rPr>
+        <w:t xml:space="preserve">git checkout </w:t>
+      </w:r>
+      <w:proofErr w:type="gramStart"/>
+      <w:r>
+        <w:rPr>
+          <w:rFonts w:ascii="Times New Roman" w:hAnsi="Times New Roman" w:cs="Times New Roman"/>
+        </w:rPr>
+        <w:t>develop</w:t>
+      </w:r>
+      <w:proofErr w:type="gramEnd"/>
+    </w:p>
+    <w:p>
+      <w:pPr>
+        <w:pBdr>
+          <w:top w:val="single" w:sz="4" w:space="1" w:color="auto"/>
+          <w:left w:val="single" w:sz="4" w:space="4" w:color="auto"/>
+          <w:bottom w:val="single" w:sz="4" w:space="1" w:color="auto"/>
+          <w:right w:val="single" w:sz="4" w:space="4" w:color="auto"/>
+        </w:pBdr>
+        <w:shd w:val="clear" w:color="auto" w:fill="E2EFD9" w:themeFill="accent6" w:themeFillTint="33"/>
+        <w:tabs>
+          <w:tab w:val="left" w:pos="2298"/>
+        </w:tabs>
+        <w:rPr>
+          <w:rFonts w:ascii="Times New Roman" w:hAnsi="Times New Roman" w:cs="Times New Roman"/>
+        </w:rPr>
+      </w:pPr>
+      <w:r>
+        <w:rPr>
+          <w:rFonts w:ascii="Times New Roman" w:hAnsi="Times New Roman" w:cs="Times New Roman"/>
+        </w:rPr>
+        <w:t>git pull origin develop</w:t>
+      </w:r>
+    </w:p>
+    <w:p>
+      <w:pPr>
+        <w:pBdr>
+          <w:top w:val="single" w:sz="4" w:space="1" w:color="auto"/>
+          <w:left w:val="single" w:sz="4" w:space="4" w:color="auto"/>
+          <w:bottom w:val="single" w:sz="4" w:space="1" w:color="auto"/>
+          <w:right w:val="single" w:sz="4" w:space="4" w:color="auto"/>
+        </w:pBdr>
+        <w:shd w:val="clear" w:color="auto" w:fill="E2EFD9" w:themeFill="accent6" w:themeFillTint="33"/>
+        <w:tabs>
+          <w:tab w:val="left" w:pos="2298"/>
+        </w:tabs>
+        <w:rPr>
+          <w:rFonts w:ascii="Times New Roman" w:hAnsi="Times New Roman" w:cs="Times New Roman"/>
+        </w:rPr>
+      </w:pPr>
+      <w:r>
+        <w:rPr>
+          <w:rFonts w:ascii="Times New Roman" w:hAnsi="Times New Roman" w:cs="Times New Roman"/>
+        </w:rPr>
+        <w:t>git checkout -b feature/new-feature</w:t>
+      </w:r>
+    </w:p>
+    <w:p>
+      <w:pPr>
+        <w:pBdr>
+          <w:top w:val="single" w:sz="4" w:space="1" w:color="auto"/>
+          <w:left w:val="single" w:sz="4" w:space="4" w:color="auto"/>
+          <w:bottom w:val="single" w:sz="4" w:space="1" w:color="auto"/>
+          <w:right w:val="single" w:sz="4" w:space="4" w:color="auto"/>
+        </w:pBdr>
+        <w:shd w:val="clear" w:color="auto" w:fill="E2EFD9" w:themeFill="accent6" w:themeFillTint="33"/>
+        <w:tabs>
+          <w:tab w:val="left" w:pos="2298"/>
+        </w:tabs>
+        <w:rPr>
+          <w:rFonts w:ascii="Times New Roman" w:hAnsi="Times New Roman" w:cs="Times New Roman"/>
+        </w:rPr>
+      </w:pPr>
+      <w:r>
+        <w:rPr>
+          <w:rFonts w:ascii="Times New Roman" w:hAnsi="Times New Roman" w:cs="Times New Roman"/>
+        </w:rPr>
+        <w:t># Work on feature, commit changes</w:t>
+      </w:r>
+    </w:p>
+    <w:p>
+      <w:pPr>
+        <w:pBdr>
+          <w:top w:val="single" w:sz="4" w:space="1" w:color="auto"/>
+          <w:left w:val="single" w:sz="4" w:space="4" w:color="auto"/>
+          <w:bottom w:val="single" w:sz="4" w:space="1" w:color="auto"/>
+          <w:right w:val="single" w:sz="4" w:space="4" w:color="auto"/>
+        </w:pBdr>
+        <w:shd w:val="clear" w:color="auto" w:fill="E2EFD9" w:themeFill="accent6" w:themeFillTint="33"/>
+        <w:tabs>
+          <w:tab w:val="left" w:pos="2298"/>
+        </w:tabs>
+        <w:rPr>
+          <w:rFonts w:ascii="Times New Roman" w:hAnsi="Times New Roman" w:cs="Times New Roman"/>
+        </w:rPr>
+      </w:pPr>
+      <w:r>
+        <w:rPr>
+          <w:rFonts w:ascii="Times New Roman" w:hAnsi="Times New Roman" w:cs="Times New Roman"/>
+        </w:rPr>
+        <w:t xml:space="preserve">git </w:t>
+      </w:r>
+      <w:proofErr w:type="gramStart"/>
+      <w:r>
+        <w:rPr>
+          <w:rFonts w:ascii="Times New Roman" w:hAnsi="Times New Roman" w:cs="Times New Roman"/>
+        </w:rPr>
+        <w:t>add .</w:t>
+      </w:r>
+      <w:proofErr w:type="gramEnd"/>
+    </w:p>
+    <w:p>
+      <w:pPr>
+        <w:pBdr>
+          <w:top w:val="single" w:sz="4" w:space="1" w:color="auto"/>
+          <w:left w:val="single" w:sz="4" w:space="4" w:color="auto"/>
+          <w:bottom w:val="single" w:sz="4" w:space="1" w:color="auto"/>
+          <w:right w:val="single" w:sz="4" w:space="4" w:color="auto"/>
+        </w:pBdr>
+        <w:shd w:val="clear" w:color="auto" w:fill="E2EFD9" w:themeFill="accent6" w:themeFillTint="33"/>
+        <w:tabs>
+          <w:tab w:val="left" w:pos="2298"/>
+        </w:tabs>
+        <w:rPr>
+          <w:rFonts w:ascii="Times New Roman" w:hAnsi="Times New Roman" w:cs="Times New Roman"/>
+        </w:rPr>
+      </w:pPr>
+      <w:r>
+        <w:rPr>
+          <w:rFonts w:ascii="Times New Roman" w:hAnsi="Times New Roman" w:cs="Times New Roman"/>
+        </w:rPr>
+        <w:t>git commit -m "Implemented new feature"</w:t>
+      </w:r>
+    </w:p>
+    <w:p>
+      <w:pPr>
+        <w:tabs>
+          <w:tab w:val="left" w:pos="2298"/>
+        </w:tabs>
+        <w:rPr>
+          <w:rFonts w:ascii="Times New Roman" w:hAnsi="Times New Roman" w:cs="Times New Roman"/>
+          <w:b/>
+          <w:bCs/>
+          <w:sz w:val="28"/>
+          <w:szCs w:val="28"/>
+        </w:rPr>
+      </w:pPr>
+      <w:r>
+        <w:rPr>
+          <w:rFonts w:ascii="Times New Roman" w:hAnsi="Times New Roman" w:cs="Times New Roman"/>
+          <w:b/>
+          <w:bCs/>
+          <w:sz w:val="28"/>
+          <w:szCs w:val="28"/>
+        </w:rPr>
+        <w:t>After finishing, merge back:</w:t>
+      </w:r>
+    </w:p>
+    <w:p>
+      <w:pPr>
+        <w:pBdr>
+          <w:top w:val="single" w:sz="4" w:space="1" w:color="auto"/>
+          <w:left w:val="single" w:sz="4" w:space="4" w:color="auto"/>
+          <w:bottom w:val="single" w:sz="4" w:space="1" w:color="auto"/>
+          <w:right w:val="single" w:sz="4" w:space="4" w:color="auto"/>
+        </w:pBdr>
+        <w:shd w:val="clear" w:color="auto" w:fill="E2EFD9" w:themeFill="accent6" w:themeFillTint="33"/>
+        <w:tabs>
+          <w:tab w:val="left" w:pos="2298"/>
+        </w:tabs>
+        <w:rPr>
+          <w:rFonts w:ascii="Times New Roman" w:hAnsi="Times New Roman" w:cs="Times New Roman"/>
+          <w:sz w:val="24"/>
+          <w:szCs w:val="24"/>
+        </w:rPr>
+      </w:pPr>
+      <w:r>
+        <w:rPr>
+          <w:rFonts w:ascii="Times New Roman" w:hAnsi="Times New Roman" w:cs="Times New Roman"/>
+          <w:sz w:val="24"/>
+          <w:szCs w:val="24"/>
+        </w:rPr>
+        <w:t xml:space="preserve">git checkout </w:t>
+      </w:r>
+      <w:proofErr w:type="gramStart"/>
+      <w:r>
+        <w:rPr>
+          <w:rFonts w:ascii="Times New Roman" w:hAnsi="Times New Roman" w:cs="Times New Roman"/>
+          <w:sz w:val="24"/>
+          <w:szCs w:val="24"/>
+        </w:rPr>
+        <w:t>develop</w:t>
+      </w:r>
+      <w:proofErr w:type="gramEnd"/>
+    </w:p>
+    <w:p>
+      <w:pPr>
+        <w:pBdr>
+          <w:top w:val="single" w:sz="4" w:space="1" w:color="auto"/>
+          <w:left w:val="single" w:sz="4" w:space="4" w:color="auto"/>
+          <w:bottom w:val="single" w:sz="4" w:space="1" w:color="auto"/>
+          <w:right w:val="single" w:sz="4" w:space="4" w:color="auto"/>
+        </w:pBdr>
+        <w:shd w:val="clear" w:color="auto" w:fill="E2EFD9" w:themeFill="accent6" w:themeFillTint="33"/>
+        <w:tabs>
+          <w:tab w:val="left" w:pos="2298"/>
+        </w:tabs>
+        <w:rPr>
+          <w:rFonts w:ascii="Times New Roman" w:hAnsi="Times New Roman" w:cs="Times New Roman"/>
+          <w:sz w:val="24"/>
+          <w:szCs w:val="24"/>
+        </w:rPr>
+      </w:pPr>
+      <w:r>
+        <w:rPr>
+          <w:rFonts w:ascii="Times New Roman" w:hAnsi="Times New Roman" w:cs="Times New Roman"/>
+          <w:sz w:val="24"/>
+          <w:szCs w:val="24"/>
+        </w:rPr>
+        <w:t>git merge feature/new-feature</w:t>
+      </w:r>
+    </w:p>
+    <w:p>
+      <w:pPr>
+        <w:pBdr>
+          <w:top w:val="single" w:sz="4" w:space="1" w:color="auto"/>
+          <w:left w:val="single" w:sz="4" w:space="4" w:color="auto"/>
+          <w:bottom w:val="single" w:sz="4" w:space="1" w:color="auto"/>
+          <w:right w:val="single" w:sz="4" w:space="4" w:color="auto"/>
+        </w:pBdr>
+        <w:shd w:val="clear" w:color="auto" w:fill="E2EFD9" w:themeFill="accent6" w:themeFillTint="33"/>
+        <w:tabs>
+          <w:tab w:val="left" w:pos="2298"/>
+        </w:tabs>
+        <w:rPr>
+          <w:rFonts w:ascii="Times New Roman" w:hAnsi="Times New Roman" w:cs="Times New Roman"/>
+          <w:sz w:val="24"/>
+          <w:szCs w:val="24"/>
+        </w:rPr>
+      </w:pPr>
+      <w:r>
+        <w:rPr>
+          <w:rFonts w:ascii="Times New Roman" w:hAnsi="Times New Roman" w:cs="Times New Roman"/>
+          <w:sz w:val="24"/>
+          <w:szCs w:val="24"/>
+        </w:rPr>
+        <w:t>git branch -d feature/new-feature</w:t>
+      </w:r>
+    </w:p>
+    <w:p>
+      <w:pPr>
+        <w:pBdr>
+          <w:top w:val="single" w:sz="4" w:space="1" w:color="auto"/>
+          <w:left w:val="single" w:sz="4" w:space="4" w:color="auto"/>
+          <w:bottom w:val="single" w:sz="4" w:space="1" w:color="auto"/>
+          <w:right w:val="single" w:sz="4" w:space="4" w:color="auto"/>
+        </w:pBdr>
+        <w:shd w:val="clear" w:color="auto" w:fill="E2EFD9" w:themeFill="accent6" w:themeFillTint="33"/>
+        <w:tabs>
+          <w:tab w:val="left" w:pos="2298"/>
+        </w:tabs>
+        <w:rPr>
+          <w:rFonts w:ascii="Times New Roman" w:hAnsi="Times New Roman" w:cs="Times New Roman"/>
+          <w:sz w:val="24"/>
+          <w:szCs w:val="24"/>
+        </w:rPr>
+      </w:pPr>
+      <w:r>
+        <w:rPr>
+          <w:rFonts w:ascii="Times New Roman" w:hAnsi="Times New Roman" w:cs="Times New Roman"/>
+          <w:sz w:val="24"/>
+          <w:szCs w:val="24"/>
+        </w:rPr>
+        <w:t>git push origin develop</w:t>
+      </w:r>
+    </w:p>
+    <w:p>
+      <w:pPr>
+        <w:shd w:val="clear" w:color="auto" w:fill="F7CAAC" w:themeFill="accent2" w:themeFillTint="66"/>
+        <w:tabs>
+          <w:tab w:val="left" w:pos="2298"/>
+        </w:tabs>
+        <w:rPr>
+          <w:rFonts w:ascii="Times New Roman" w:hAnsi="Times New Roman" w:cs="Times New Roman"/>
+          <w:b/>
+          <w:bCs/>
+          <w:sz w:val="28"/>
+          <w:szCs w:val="28"/>
+        </w:rPr>
+      </w:pPr>
+      <w:r>
+        <w:rPr>
+          <w:rFonts w:ascii="Times New Roman" w:hAnsi="Times New Roman" w:cs="Times New Roman"/>
+          <w:b/>
+          <w:bCs/>
+          <w:sz w:val="28"/>
+          <w:szCs w:val="28"/>
+        </w:rPr>
+        <w:t>2</w:t>
+      </w:r>
+      <w:r>
+        <w:rPr>
+          <w:rFonts w:ascii="Times New Roman" w:hAnsi="Times New Roman" w:cs="Times New Roman"/>
+          <w:b/>
+          <w:bCs/>
+          <w:sz w:val="28"/>
+          <w:szCs w:val="28"/>
+        </w:rPr>
+        <w:t>️</w:t>
+      </w:r>
+      <w:r>
+        <w:rPr>
+          <w:rFonts w:ascii="Segoe UI Symbol" w:hAnsi="Segoe UI Symbol" w:cs="Segoe UI Symbol"/>
+          <w:b/>
+          <w:bCs/>
+          <w:sz w:val="28"/>
+          <w:szCs w:val="28"/>
+        </w:rPr>
+        <w:t>.</w:t>
+      </w:r>
+      <w:r>
+        <w:rPr>
+          <w:rFonts w:ascii="Times New Roman" w:hAnsi="Times New Roman" w:cs="Times New Roman"/>
+          <w:b/>
+          <w:bCs/>
+          <w:sz w:val="28"/>
+          <w:szCs w:val="28"/>
+        </w:rPr>
+        <w:t xml:space="preserve"> Start</w:t>
+      </w:r>
+      <w:r>
+        <w:rPr>
+          <w:rFonts w:ascii="Times New Roman" w:hAnsi="Times New Roman" w:cs="Times New Roman"/>
+          <w:b/>
+          <w:bCs/>
+          <w:sz w:val="28"/>
+          <w:szCs w:val="28"/>
+        </w:rPr>
+        <w:t xml:space="preserve"> a Release</w:t>
+      </w:r>
+    </w:p>
+    <w:p>
+      <w:pPr>
+        <w:pBdr>
+          <w:top w:val="single" w:sz="4" w:space="1" w:color="auto"/>
+          <w:left w:val="single" w:sz="4" w:space="4" w:color="auto"/>
+          <w:bottom w:val="single" w:sz="4" w:space="1" w:color="auto"/>
+          <w:right w:val="single" w:sz="4" w:space="4" w:color="auto"/>
+        </w:pBdr>
+        <w:shd w:val="clear" w:color="auto" w:fill="E2EFD9" w:themeFill="accent6" w:themeFillTint="33"/>
+        <w:tabs>
+          <w:tab w:val="left" w:pos="2298"/>
+        </w:tabs>
+        <w:rPr>
+          <w:rFonts w:ascii="Times New Roman" w:hAnsi="Times New Roman" w:cs="Times New Roman"/>
+        </w:rPr>
+      </w:pPr>
+      <w:r>
+        <w:rPr>
+          <w:rFonts w:ascii="Times New Roman" w:hAnsi="Times New Roman" w:cs="Times New Roman"/>
+        </w:rPr>
+        <w:t xml:space="preserve">git checkout </w:t>
+      </w:r>
+      <w:proofErr w:type="gramStart"/>
+      <w:r>
+        <w:rPr>
+          <w:rFonts w:ascii="Times New Roman" w:hAnsi="Times New Roman" w:cs="Times New Roman"/>
+        </w:rPr>
+        <w:t>develop</w:t>
+      </w:r>
+      <w:proofErr w:type="gramEnd"/>
+    </w:p>
+    <w:p>
+      <w:pPr>
+        <w:pBdr>
+          <w:top w:val="single" w:sz="4" w:space="1" w:color="auto"/>
+          <w:left w:val="single" w:sz="4" w:space="4" w:color="auto"/>
+          <w:bottom w:val="single" w:sz="4" w:space="1" w:color="auto"/>
+          <w:right w:val="single" w:sz="4" w:space="4" w:color="auto"/>
+        </w:pBdr>
+        <w:shd w:val="clear" w:color="auto" w:fill="E2EFD9" w:themeFill="accent6" w:themeFillTint="33"/>
+        <w:tabs>
+          <w:tab w:val="left" w:pos="2298"/>
+        </w:tabs>
+        <w:rPr>
+          <w:rFonts w:ascii="Times New Roman" w:hAnsi="Times New Roman" w:cs="Times New Roman"/>
+        </w:rPr>
+      </w:pPr>
+      <w:r>
+        <w:rPr>
+          <w:rFonts w:ascii="Times New Roman" w:hAnsi="Times New Roman" w:cs="Times New Roman"/>
+        </w:rPr>
+        <w:t>git checkout -b release/v1.0.0</w:t>
+      </w:r>
+    </w:p>
+    <w:p>
+      <w:pPr>
+        <w:pBdr>
+          <w:top w:val="single" w:sz="4" w:space="1" w:color="auto"/>
+          <w:left w:val="single" w:sz="4" w:space="4" w:color="auto"/>
+          <w:bottom w:val="single" w:sz="4" w:space="1" w:color="auto"/>
+          <w:right w:val="single" w:sz="4" w:space="4" w:color="auto"/>
+        </w:pBdr>
+        <w:shd w:val="clear" w:color="auto" w:fill="E2EFD9" w:themeFill="accent6" w:themeFillTint="33"/>
+        <w:tabs>
+          <w:tab w:val="left" w:pos="2298"/>
+        </w:tabs>
+        <w:rPr>
+          <w:rFonts w:ascii="Times New Roman" w:hAnsi="Times New Roman" w:cs="Times New Roman"/>
+        </w:rPr>
+      </w:pPr>
+      <w:r>
+        <w:rPr>
+          <w:rFonts w:ascii="Times New Roman" w:hAnsi="Times New Roman" w:cs="Times New Roman"/>
+        </w:rPr>
+        <w:t># Perform final testing, bug fixes</w:t>
+      </w:r>
+    </w:p>
+    <w:p>
+      <w:pPr>
+        <w:pBdr>
+          <w:top w:val="single" w:sz="4" w:space="1" w:color="auto"/>
+          <w:left w:val="single" w:sz="4" w:space="4" w:color="auto"/>
+          <w:bottom w:val="single" w:sz="4" w:space="1" w:color="auto"/>
+          <w:right w:val="single" w:sz="4" w:space="4" w:color="auto"/>
+        </w:pBdr>
+        <w:shd w:val="clear" w:color="auto" w:fill="E2EFD9" w:themeFill="accent6" w:themeFillTint="33"/>
+        <w:tabs>
+          <w:tab w:val="left" w:pos="2298"/>
+        </w:tabs>
+        <w:rPr>
+          <w:rFonts w:ascii="Times New Roman" w:hAnsi="Times New Roman" w:cs="Times New Roman"/>
+        </w:rPr>
+      </w:pPr>
+      <w:r>
+        <w:rPr>
+          <w:rFonts w:ascii="Times New Roman" w:hAnsi="Times New Roman" w:cs="Times New Roman"/>
+        </w:rPr>
+        <w:t xml:space="preserve">git </w:t>
+      </w:r>
+      <w:proofErr w:type="gramStart"/>
+      <w:r>
+        <w:rPr>
+          <w:rFonts w:ascii="Times New Roman" w:hAnsi="Times New Roman" w:cs="Times New Roman"/>
+        </w:rPr>
+        <w:t>add .</w:t>
+      </w:r>
+      <w:proofErr w:type="gramEnd"/>
+    </w:p>
+    <w:p>
+      <w:pPr>
+        <w:pBdr>
+          <w:top w:val="single" w:sz="4" w:space="1" w:color="auto"/>
+          <w:left w:val="single" w:sz="4" w:space="4" w:color="auto"/>
+          <w:bottom w:val="single" w:sz="4" w:space="1" w:color="auto"/>
+          <w:right w:val="single" w:sz="4" w:space="4" w:color="auto"/>
+        </w:pBdr>
+        <w:shd w:val="clear" w:color="auto" w:fill="E2EFD9" w:themeFill="accent6" w:themeFillTint="33"/>
+        <w:tabs>
+          <w:tab w:val="left" w:pos="2298"/>
+        </w:tabs>
+        <w:rPr>
+          <w:rFonts w:ascii="Times New Roman" w:hAnsi="Times New Roman" w:cs="Times New Roman"/>
+        </w:rPr>
+      </w:pPr>
+      <w:r>
+        <w:rPr>
+          <w:rFonts w:ascii="Times New Roman" w:hAnsi="Times New Roman" w:cs="Times New Roman"/>
+        </w:rPr>
+        <w:t>git commit -m "Release preparation"</w:t>
+      </w:r>
+    </w:p>
+    <w:p>
+      <w:pPr>
+        <w:tabs>
+          <w:tab w:val="left" w:pos="2298"/>
+        </w:tabs>
+        <w:rPr>
+          <w:rFonts w:ascii="Times New Roman" w:hAnsi="Times New Roman" w:cs="Times New Roman"/>
+          <w:b/>
+          <w:bCs/>
+          <w:sz w:val="24"/>
+          <w:szCs w:val="24"/>
+        </w:rPr>
+      </w:pPr>
+      <w:r>
+        <w:rPr>
+          <w:rFonts w:ascii="Times New Roman" w:hAnsi="Times New Roman" w:cs="Times New Roman"/>
+          <w:b/>
+          <w:bCs/>
+          <w:sz w:val="24"/>
+          <w:szCs w:val="24"/>
+        </w:rPr>
+        <w:t>When ready:</w:t>
+      </w:r>
+    </w:p>
+    <w:p>
+      <w:pPr>
+        <w:shd w:val="clear" w:color="auto" w:fill="E2EFD9" w:themeFill="accent6" w:themeFillTint="33"/>
+        <w:tabs>
+          <w:tab w:val="left" w:pos="2298"/>
+        </w:tabs>
+        <w:rPr>
+          <w:rFonts w:ascii="Times New Roman" w:hAnsi="Times New Roman" w:cs="Times New Roman"/>
+        </w:rPr>
+      </w:pPr>
+      <w:r>
+        <w:rPr>
+          <w:rFonts w:ascii="Times New Roman" w:hAnsi="Times New Roman" w:cs="Times New Roman"/>
+        </w:rPr>
+        <w:t>git checkout main</w:t>
+      </w:r>
+    </w:p>
+    <w:p>
+      <w:pPr>
+        <w:shd w:val="clear" w:color="auto" w:fill="E2EFD9" w:themeFill="accent6" w:themeFillTint="33"/>
+        <w:tabs>
+          <w:tab w:val="left" w:pos="2298"/>
+        </w:tabs>
+        <w:rPr>
+          <w:rFonts w:ascii="Times New Roman" w:hAnsi="Times New Roman" w:cs="Times New Roman"/>
+        </w:rPr>
+      </w:pPr>
+      <w:r>
+        <w:rPr>
+          <w:rFonts w:ascii="Times New Roman" w:hAnsi="Times New Roman" w:cs="Times New Roman"/>
+        </w:rPr>
+        <w:t>git merge release/v1.0.0</w:t>
+      </w:r>
+    </w:p>
+    <w:p>
+      <w:pPr>
+        <w:shd w:val="clear" w:color="auto" w:fill="E2EFD9" w:themeFill="accent6" w:themeFillTint="33"/>
+        <w:tabs>
+          <w:tab w:val="left" w:pos="2298"/>
+        </w:tabs>
+        <w:rPr>
+          <w:rFonts w:ascii="Times New Roman" w:hAnsi="Times New Roman" w:cs="Times New Roman"/>
+        </w:rPr>
+      </w:pPr>
+      <w:r>
+        <w:rPr>
+          <w:rFonts w:ascii="Times New Roman" w:hAnsi="Times New Roman" w:cs="Times New Roman"/>
+        </w:rPr>
+        <w:t xml:space="preserve">git tag </w:t>
+      </w:r>
+      <w:proofErr w:type="gramStart"/>
+      <w:r>
+        <w:rPr>
+          <w:rFonts w:ascii="Times New Roman" w:hAnsi="Times New Roman" w:cs="Times New Roman"/>
+        </w:rPr>
+        <w:t>v1.0.0  #</w:t>
+      </w:r>
+      <w:proofErr w:type="gramEnd"/>
+      <w:r>
+        <w:rPr>
+          <w:rFonts w:ascii="Times New Roman" w:hAnsi="Times New Roman" w:cs="Times New Roman"/>
+        </w:rPr>
+        <w:t xml:space="preserve"> Optional: Tagging the version</w:t>
+      </w:r>
+    </w:p>
+    <w:p>
+      <w:pPr>
+        <w:shd w:val="clear" w:color="auto" w:fill="E2EFD9" w:themeFill="accent6" w:themeFillTint="33"/>
+        <w:tabs>
+          <w:tab w:val="left" w:pos="2298"/>
+        </w:tabs>
+        <w:rPr>
+          <w:rFonts w:ascii="Times New Roman" w:hAnsi="Times New Roman" w:cs="Times New Roman"/>
+        </w:rPr>
+      </w:pPr>
+      <w:r>
+        <w:rPr>
+          <w:rFonts w:ascii="Times New Roman" w:hAnsi="Times New Roman" w:cs="Times New Roman"/>
+        </w:rPr>
+        <w:t>git push origin main --tags</w:t>
+      </w:r>
+    </w:p>
+    <w:p>
+      <w:pPr>
+        <w:shd w:val="clear" w:color="auto" w:fill="FFFFFF" w:themeFill="background1"/>
+        <w:tabs>
+          <w:tab w:val="left" w:pos="2298"/>
+        </w:tabs>
+        <w:rPr>
+          <w:rFonts w:ascii="Times New Roman" w:hAnsi="Times New Roman" w:cs="Times New Roman"/>
+        </w:rPr>
+      </w:pPr>
+    </w:p>
+    <w:p>
+      <w:pPr>
+        <w:shd w:val="clear" w:color="auto" w:fill="FFFFFF" w:themeFill="background1"/>
+        <w:tabs>
+          <w:tab w:val="left" w:pos="2298"/>
+        </w:tabs>
+        <w:rPr>
+          <w:rFonts w:ascii="Times New Roman" w:hAnsi="Times New Roman" w:cs="Times New Roman"/>
+        </w:rPr>
+      </w:pPr>
+    </w:p>
+    <w:p>
+      <w:pPr>
+        <w:shd w:val="clear" w:color="auto" w:fill="FFFFFF" w:themeFill="background1"/>
+        <w:tabs>
+          <w:tab w:val="left" w:pos="2298"/>
+        </w:tabs>
+        <w:rPr>
+          <w:rFonts w:ascii="Times New Roman" w:hAnsi="Times New Roman" w:cs="Times New Roman"/>
+        </w:rPr>
+      </w:pPr>
+    </w:p>
+    <w:p>
+      <w:pPr>
+        <w:shd w:val="clear" w:color="auto" w:fill="FFFFFF" w:themeFill="background1"/>
+        <w:tabs>
+          <w:tab w:val="left" w:pos="2298"/>
+        </w:tabs>
+        <w:rPr>
+          <w:rFonts w:ascii="Times New Roman" w:hAnsi="Times New Roman" w:cs="Times New Roman"/>
+          <w:b/>
+          <w:bCs/>
+          <w:sz w:val="24"/>
+          <w:szCs w:val="24"/>
+        </w:rPr>
+      </w:pPr>
+      <w:r>
+        <w:rPr>
+          <w:rFonts w:ascii="Times New Roman" w:hAnsi="Times New Roman" w:cs="Times New Roman"/>
+          <w:b/>
+          <w:bCs/>
+          <w:sz w:val="24"/>
+          <w:szCs w:val="24"/>
+        </w:rPr>
+        <w:t>Then, merge back into develop:</w:t>
+      </w:r>
+    </w:p>
+    <w:p>
+      <w:pPr>
+        <w:pBdr>
+          <w:top w:val="single" w:sz="4" w:space="1" w:color="auto"/>
+          <w:left w:val="single" w:sz="4" w:space="4" w:color="auto"/>
+          <w:bottom w:val="single" w:sz="4" w:space="1" w:color="auto"/>
+          <w:right w:val="single" w:sz="4" w:space="4" w:color="auto"/>
+        </w:pBdr>
+        <w:shd w:val="clear" w:color="auto" w:fill="E2EFD9" w:themeFill="accent6" w:themeFillTint="33"/>
+        <w:tabs>
+          <w:tab w:val="left" w:pos="2298"/>
+        </w:tabs>
+        <w:rPr>
+          <w:rFonts w:ascii="Times New Roman" w:hAnsi="Times New Roman" w:cs="Times New Roman"/>
+        </w:rPr>
+      </w:pPr>
+      <w:r>
+        <w:rPr>
+          <w:rFonts w:ascii="Times New Roman" w:hAnsi="Times New Roman" w:cs="Times New Roman"/>
+        </w:rPr>
+        <w:t xml:space="preserve">git checkout </w:t>
+      </w:r>
+      <w:proofErr w:type="gramStart"/>
+      <w:r>
+        <w:rPr>
+          <w:rFonts w:ascii="Times New Roman" w:hAnsi="Times New Roman" w:cs="Times New Roman"/>
+        </w:rPr>
+        <w:t>develop</w:t>
+      </w:r>
+      <w:proofErr w:type="gramEnd"/>
+    </w:p>
+    <w:p>
+      <w:pPr>
+        <w:pBdr>
+          <w:top w:val="single" w:sz="4" w:space="1" w:color="auto"/>
+          <w:left w:val="single" w:sz="4" w:space="4" w:color="auto"/>
+          <w:bottom w:val="single" w:sz="4" w:space="1" w:color="auto"/>
+          <w:right w:val="single" w:sz="4" w:space="4" w:color="auto"/>
+        </w:pBdr>
+        <w:shd w:val="clear" w:color="auto" w:fill="E2EFD9" w:themeFill="accent6" w:themeFillTint="33"/>
+        <w:tabs>
+          <w:tab w:val="left" w:pos="2298"/>
+        </w:tabs>
+        <w:rPr>
+          <w:rFonts w:ascii="Times New Roman" w:hAnsi="Times New Roman" w:cs="Times New Roman"/>
+        </w:rPr>
+      </w:pPr>
+      <w:r>
+        <w:rPr>
+          <w:rFonts w:ascii="Times New Roman" w:hAnsi="Times New Roman" w:cs="Times New Roman"/>
+        </w:rPr>
+        <w:t>git merge release/v1.0.0</w:t>
+      </w:r>
+    </w:p>
+    <w:p>
+      <w:pPr>
+        <w:pBdr>
+          <w:top w:val="single" w:sz="4" w:space="1" w:color="auto"/>
+          <w:left w:val="single" w:sz="4" w:space="4" w:color="auto"/>
+          <w:bottom w:val="single" w:sz="4" w:space="1" w:color="auto"/>
+          <w:right w:val="single" w:sz="4" w:space="4" w:color="auto"/>
+        </w:pBdr>
+        <w:shd w:val="clear" w:color="auto" w:fill="E2EFD9" w:themeFill="accent6" w:themeFillTint="33"/>
+        <w:tabs>
+          <w:tab w:val="left" w:pos="2298"/>
+        </w:tabs>
+        <w:rPr>
+          <w:rFonts w:ascii="Times New Roman" w:hAnsi="Times New Roman" w:cs="Times New Roman"/>
+        </w:rPr>
+      </w:pPr>
+      <w:r>
+        <w:rPr>
+          <w:rFonts w:ascii="Times New Roman" w:hAnsi="Times New Roman" w:cs="Times New Roman"/>
+        </w:rPr>
+        <w:t>git branch -d release/v1.0.0</w:t>
+      </w:r>
+    </w:p>
+    <w:p>
+      <w:pPr>
+        <w:pBdr>
+          <w:top w:val="single" w:sz="4" w:space="1" w:color="auto"/>
+          <w:left w:val="single" w:sz="4" w:space="4" w:color="auto"/>
+          <w:bottom w:val="single" w:sz="4" w:space="1" w:color="auto"/>
+          <w:right w:val="single" w:sz="4" w:space="4" w:color="auto"/>
+        </w:pBdr>
+        <w:shd w:val="clear" w:color="auto" w:fill="E2EFD9" w:themeFill="accent6" w:themeFillTint="33"/>
+        <w:tabs>
+          <w:tab w:val="left" w:pos="2298"/>
+        </w:tabs>
+        <w:rPr>
+          <w:rFonts w:ascii="Times New Roman" w:hAnsi="Times New Roman" w:cs="Times New Roman"/>
+        </w:rPr>
+      </w:pPr>
+      <w:r>
+        <w:rPr>
+          <w:rFonts w:ascii="Times New Roman" w:hAnsi="Times New Roman" w:cs="Times New Roman"/>
+        </w:rPr>
+        <w:t>git push origin develop</w:t>
+      </w:r>
+    </w:p>
+    <w:p>
+      <w:pPr>
+        <w:shd w:val="clear" w:color="auto" w:fill="F4B083" w:themeFill="accent2" w:themeFillTint="99"/>
+        <w:tabs>
+          <w:tab w:val="left" w:pos="2298"/>
+        </w:tabs>
+        <w:rPr>
+          <w:rFonts w:ascii="Times New Roman" w:hAnsi="Times New Roman" w:cs="Times New Roman"/>
+          <w:b/>
+          <w:bCs/>
+          <w:sz w:val="24"/>
+          <w:szCs w:val="24"/>
+        </w:rPr>
+      </w:pPr>
+      <w:r>
+        <w:rPr>
+          <w:rFonts w:ascii="Times New Roman" w:hAnsi="Times New Roman" w:cs="Times New Roman"/>
+          <w:b/>
+          <w:bCs/>
+          <w:sz w:val="24"/>
+          <w:szCs w:val="24"/>
+        </w:rPr>
+        <w:t>3</w:t>
+      </w:r>
+      <w:r>
+        <w:rPr>
+          <w:rFonts w:ascii="Times New Roman" w:hAnsi="Times New Roman" w:cs="Times New Roman"/>
+          <w:b/>
+          <w:bCs/>
+          <w:sz w:val="24"/>
+          <w:szCs w:val="24"/>
+        </w:rPr>
+        <w:t>️. Hotfix</w:t>
+      </w:r>
+      <w:r>
+        <w:rPr>
+          <w:rFonts w:ascii="Times New Roman" w:hAnsi="Times New Roman" w:cs="Times New Roman"/>
+          <w:b/>
+          <w:bCs/>
+          <w:sz w:val="24"/>
+          <w:szCs w:val="24"/>
+        </w:rPr>
+        <w:t xml:space="preserve"> an Issue in Production</w:t>
+      </w:r>
+    </w:p>
+    <w:p>
+      <w:pPr>
+        <w:pBdr>
+          <w:top w:val="single" w:sz="4" w:space="1" w:color="auto"/>
+          <w:left w:val="single" w:sz="4" w:space="4" w:color="auto"/>
+          <w:bottom w:val="single" w:sz="4" w:space="1" w:color="auto"/>
+          <w:right w:val="single" w:sz="4" w:space="4" w:color="auto"/>
+        </w:pBdr>
+        <w:shd w:val="clear" w:color="auto" w:fill="C5E0B3" w:themeFill="accent6" w:themeFillTint="66"/>
+        <w:tabs>
+          <w:tab w:val="left" w:pos="2298"/>
+        </w:tabs>
+        <w:rPr>
+          <w:rFonts w:ascii="Times New Roman" w:hAnsi="Times New Roman" w:cs="Times New Roman"/>
+        </w:rPr>
+      </w:pPr>
+      <w:r>
+        <w:rPr>
+          <w:rFonts w:ascii="Times New Roman" w:hAnsi="Times New Roman" w:cs="Times New Roman"/>
+        </w:rPr>
+        <w:t>git checkout main</w:t>
+      </w:r>
+    </w:p>
+    <w:p>
+      <w:pPr>
+        <w:pBdr>
+          <w:top w:val="single" w:sz="4" w:space="1" w:color="auto"/>
+          <w:left w:val="single" w:sz="4" w:space="4" w:color="auto"/>
+          <w:bottom w:val="single" w:sz="4" w:space="1" w:color="auto"/>
+          <w:right w:val="single" w:sz="4" w:space="4" w:color="auto"/>
+        </w:pBdr>
+        <w:shd w:val="clear" w:color="auto" w:fill="C5E0B3" w:themeFill="accent6" w:themeFillTint="66"/>
+        <w:tabs>
+          <w:tab w:val="left" w:pos="2298"/>
+        </w:tabs>
+        <w:rPr>
+          <w:rFonts w:ascii="Times New Roman" w:hAnsi="Times New Roman" w:cs="Times New Roman"/>
+        </w:rPr>
+      </w:pPr>
+      <w:r>
+        <w:rPr>
+          <w:rFonts w:ascii="Times New Roman" w:hAnsi="Times New Roman" w:cs="Times New Roman"/>
+        </w:rPr>
+        <w:t>git checkout -b hotfix/critical-bug</w:t>
+      </w:r>
+    </w:p>
+    <w:p>
+      <w:pPr>
+        <w:tabs>
+          <w:tab w:val="left" w:pos="2298"/>
+        </w:tabs>
+        <w:rPr>
+          <w:rFonts w:ascii="Times New Roman" w:hAnsi="Times New Roman" w:cs="Times New Roman"/>
+          <w:b/>
+          <w:bCs/>
+          <w:sz w:val="24"/>
+          <w:szCs w:val="24"/>
+        </w:rPr>
+      </w:pPr>
+      <w:r>
+        <w:rPr>
+          <w:rFonts w:ascii="Times New Roman" w:hAnsi="Times New Roman" w:cs="Times New Roman"/>
+          <w:b/>
+          <w:bCs/>
+          <w:sz w:val="24"/>
+          <w:szCs w:val="24"/>
+        </w:rPr>
+        <w:t># Fix the bug</w:t>
+      </w:r>
+    </w:p>
+    <w:p>
+      <w:pPr>
+        <w:pBdr>
+          <w:top w:val="single" w:sz="4" w:space="1" w:color="auto"/>
+          <w:left w:val="single" w:sz="4" w:space="4" w:color="auto"/>
+          <w:bottom w:val="single" w:sz="4" w:space="1" w:color="auto"/>
+          <w:right w:val="single" w:sz="4" w:space="4" w:color="auto"/>
+        </w:pBdr>
+        <w:shd w:val="clear" w:color="auto" w:fill="C5E0B3" w:themeFill="accent6" w:themeFillTint="66"/>
+        <w:tabs>
+          <w:tab w:val="left" w:pos="2298"/>
+        </w:tabs>
+        <w:rPr>
+          <w:rFonts w:ascii="Times New Roman" w:hAnsi="Times New Roman" w:cs="Times New Roman"/>
+        </w:rPr>
+      </w:pPr>
+      <w:r>
+        <w:rPr>
+          <w:rFonts w:ascii="Times New Roman" w:hAnsi="Times New Roman" w:cs="Times New Roman"/>
+        </w:rPr>
+        <w:t xml:space="preserve">git </w:t>
+      </w:r>
+      <w:proofErr w:type="gramStart"/>
+      <w:r>
+        <w:rPr>
+          <w:rFonts w:ascii="Times New Roman" w:hAnsi="Times New Roman" w:cs="Times New Roman"/>
+        </w:rPr>
+        <w:t>add .</w:t>
+      </w:r>
+      <w:proofErr w:type="gramEnd"/>
+    </w:p>
+    <w:p>
+      <w:pPr>
+        <w:pBdr>
+          <w:top w:val="single" w:sz="4" w:space="1" w:color="auto"/>
+          <w:left w:val="single" w:sz="4" w:space="4" w:color="auto"/>
+          <w:bottom w:val="single" w:sz="4" w:space="1" w:color="auto"/>
+          <w:right w:val="single" w:sz="4" w:space="4" w:color="auto"/>
+        </w:pBdr>
+        <w:shd w:val="clear" w:color="auto" w:fill="C5E0B3" w:themeFill="accent6" w:themeFillTint="66"/>
+        <w:tabs>
+          <w:tab w:val="left" w:pos="2298"/>
+        </w:tabs>
+        <w:rPr>
+          <w:rFonts w:ascii="Times New Roman" w:hAnsi="Times New Roman" w:cs="Times New Roman"/>
+        </w:rPr>
+      </w:pPr>
+      <w:r>
+        <w:rPr>
+          <w:rFonts w:ascii="Times New Roman" w:hAnsi="Times New Roman" w:cs="Times New Roman"/>
+        </w:rPr>
+        <w:t>git commit -m "Fixed critical bug"</w:t>
+      </w:r>
+    </w:p>
+    <w:p>
+      <w:pPr>
+        <w:pBdr>
+          <w:top w:val="single" w:sz="4" w:space="1" w:color="auto"/>
+          <w:left w:val="single" w:sz="4" w:space="4" w:color="auto"/>
+          <w:bottom w:val="single" w:sz="4" w:space="1" w:color="auto"/>
+          <w:right w:val="single" w:sz="4" w:space="4" w:color="auto"/>
+        </w:pBdr>
+        <w:shd w:val="clear" w:color="auto" w:fill="C5E0B3" w:themeFill="accent6" w:themeFillTint="66"/>
+        <w:tabs>
+          <w:tab w:val="left" w:pos="2298"/>
+        </w:tabs>
+        <w:rPr>
+          <w:rFonts w:ascii="Times New Roman" w:hAnsi="Times New Roman" w:cs="Times New Roman"/>
+        </w:rPr>
+      </w:pPr>
+      <w:r>
+        <w:rPr>
+          <w:rFonts w:ascii="Times New Roman" w:hAnsi="Times New Roman" w:cs="Times New Roman"/>
+        </w:rPr>
+        <w:t>git checkout main</w:t>
+      </w:r>
+    </w:p>
+    <w:p>
+      <w:pPr>
+        <w:pBdr>
+          <w:top w:val="single" w:sz="4" w:space="1" w:color="auto"/>
+          <w:left w:val="single" w:sz="4" w:space="4" w:color="auto"/>
+          <w:bottom w:val="single" w:sz="4" w:space="1" w:color="auto"/>
+          <w:right w:val="single" w:sz="4" w:space="4" w:color="auto"/>
+        </w:pBdr>
+        <w:shd w:val="clear" w:color="auto" w:fill="C5E0B3" w:themeFill="accent6" w:themeFillTint="66"/>
+        <w:tabs>
+          <w:tab w:val="left" w:pos="2298"/>
+        </w:tabs>
+        <w:rPr>
+          <w:rFonts w:ascii="Times New Roman" w:hAnsi="Times New Roman" w:cs="Times New Roman"/>
+        </w:rPr>
+      </w:pPr>
+      <w:r>
+        <w:rPr>
+          <w:rFonts w:ascii="Times New Roman" w:hAnsi="Times New Roman" w:cs="Times New Roman"/>
+        </w:rPr>
+        <w:t>git merge hotfix/critical-bug</w:t>
+      </w:r>
+    </w:p>
+    <w:p>
+      <w:pPr>
+        <w:pBdr>
+          <w:top w:val="single" w:sz="4" w:space="1" w:color="auto"/>
+          <w:left w:val="single" w:sz="4" w:space="4" w:color="auto"/>
+          <w:bottom w:val="single" w:sz="4" w:space="1" w:color="auto"/>
+          <w:right w:val="single" w:sz="4" w:space="4" w:color="auto"/>
+        </w:pBdr>
+        <w:shd w:val="clear" w:color="auto" w:fill="C5E0B3" w:themeFill="accent6" w:themeFillTint="66"/>
+        <w:tabs>
+          <w:tab w:val="left" w:pos="2298"/>
+        </w:tabs>
+        <w:rPr>
+          <w:rFonts w:ascii="Times New Roman" w:hAnsi="Times New Roman" w:cs="Times New Roman"/>
+        </w:rPr>
+      </w:pPr>
+      <w:r>
+        <w:rPr>
+          <w:rFonts w:ascii="Times New Roman" w:hAnsi="Times New Roman" w:cs="Times New Roman"/>
+        </w:rPr>
+        <w:t xml:space="preserve">git checkout </w:t>
+      </w:r>
+      <w:proofErr w:type="gramStart"/>
+      <w:r>
+        <w:rPr>
+          <w:rFonts w:ascii="Times New Roman" w:hAnsi="Times New Roman" w:cs="Times New Roman"/>
+        </w:rPr>
+        <w:t>develop</w:t>
+      </w:r>
+      <w:proofErr w:type="gramEnd"/>
+    </w:p>
+    <w:p>
+      <w:pPr>
+        <w:pBdr>
+          <w:top w:val="single" w:sz="4" w:space="1" w:color="auto"/>
+          <w:left w:val="single" w:sz="4" w:space="4" w:color="auto"/>
+          <w:bottom w:val="single" w:sz="4" w:space="1" w:color="auto"/>
+          <w:right w:val="single" w:sz="4" w:space="4" w:color="auto"/>
+        </w:pBdr>
+        <w:shd w:val="clear" w:color="auto" w:fill="C5E0B3" w:themeFill="accent6" w:themeFillTint="66"/>
+        <w:tabs>
+          <w:tab w:val="left" w:pos="2298"/>
+        </w:tabs>
+        <w:rPr>
+          <w:rFonts w:ascii="Times New Roman" w:hAnsi="Times New Roman" w:cs="Times New Roman"/>
+        </w:rPr>
+      </w:pPr>
+      <w:r>
+        <w:rPr>
+          <w:rFonts w:ascii="Times New Roman" w:hAnsi="Times New Roman" w:cs="Times New Roman"/>
+        </w:rPr>
+        <w:t>git merge hotfix/critical-bug</w:t>
+      </w:r>
+    </w:p>
+    <w:p>
+      <w:pPr>
+        <w:pBdr>
+          <w:top w:val="single" w:sz="4" w:space="1" w:color="auto"/>
+          <w:left w:val="single" w:sz="4" w:space="4" w:color="auto"/>
+          <w:bottom w:val="single" w:sz="4" w:space="1" w:color="auto"/>
+          <w:right w:val="single" w:sz="4" w:space="4" w:color="auto"/>
+        </w:pBdr>
+        <w:shd w:val="clear" w:color="auto" w:fill="C5E0B3" w:themeFill="accent6" w:themeFillTint="66"/>
+        <w:tabs>
+          <w:tab w:val="left" w:pos="2298"/>
+        </w:tabs>
+        <w:rPr>
+          <w:rFonts w:ascii="Times New Roman" w:hAnsi="Times New Roman" w:cs="Times New Roman"/>
+        </w:rPr>
+      </w:pPr>
+      <w:r>
+        <w:rPr>
+          <w:rFonts w:ascii="Times New Roman" w:hAnsi="Times New Roman" w:cs="Times New Roman"/>
+        </w:rPr>
+        <w:t>git branch -d hotfix/critical-bug</w:t>
+      </w:r>
+    </w:p>
+    <w:p>
+      <w:pPr>
+        <w:pBdr>
+          <w:top w:val="single" w:sz="4" w:space="1" w:color="auto"/>
+          <w:left w:val="single" w:sz="4" w:space="4" w:color="auto"/>
+          <w:bottom w:val="single" w:sz="4" w:space="1" w:color="auto"/>
+          <w:right w:val="single" w:sz="4" w:space="4" w:color="auto"/>
+        </w:pBdr>
+        <w:shd w:val="clear" w:color="auto" w:fill="C5E0B3" w:themeFill="accent6" w:themeFillTint="66"/>
+        <w:tabs>
+          <w:tab w:val="left" w:pos="2298"/>
+        </w:tabs>
+        <w:rPr>
+          <w:rFonts w:ascii="Times New Roman" w:hAnsi="Times New Roman" w:cs="Times New Roman"/>
+        </w:rPr>
+      </w:pPr>
+      <w:r>
+        <w:rPr>
+          <w:rFonts w:ascii="Times New Roman" w:hAnsi="Times New Roman" w:cs="Times New Roman"/>
+        </w:rPr>
+        <w:t>git push origin main develop</w:t>
+      </w:r>
+    </w:p>
     <w:sectPr>
       <w:pgSz w:w="11906" w:h="16838"/>
       <w:pgMar w:top="425" w:right="567" w:bottom="425" w:left="709" w:header="708" w:footer="708" w:gutter="0"/>
@@ -12406,6 +14243,123 @@
     </w:lvl>
   </w:abstractNum>
   <w:abstractNum w:abstractNumId="11" w15:restartNumberingAfterBreak="0">
+    <w:nsid w:val="400D02B8"/>
+    <w:multiLevelType w:val="multilevel"/>
+    <w:tmpl w:val="140C54CA"/>
+    <w:lvl w:ilvl="0">
+      <w:start w:val="1"/>
+      <w:numFmt w:val="decimal"/>
+      <w:lvlText w:val="%1."/>
+      <w:lvlJc w:val="left"/>
+      <w:pPr>
+        <w:tabs>
+          <w:tab w:val="num" w:pos="720"/>
+        </w:tabs>
+        <w:ind w:left="720" w:hanging="360"/>
+      </w:pPr>
+    </w:lvl>
+    <w:lvl w:ilvl="1">
+      <w:start w:val="1"/>
+      <w:numFmt w:val="bullet"/>
+      <w:lvlText w:val="o"/>
+      <w:lvlJc w:val="left"/>
+      <w:pPr>
+        <w:tabs>
+          <w:tab w:val="num" w:pos="1440"/>
+        </w:tabs>
+        <w:ind w:left="1440" w:hanging="360"/>
+      </w:pPr>
+      <w:rPr>
+        <w:rFonts w:ascii="Courier New" w:hAnsi="Courier New" w:hint="default"/>
+        <w:sz w:val="20"/>
+      </w:rPr>
+    </w:lvl>
+    <w:lvl w:ilvl="2" w:tentative="1">
+      <w:start w:val="1"/>
+      <w:numFmt w:val="decimal"/>
+      <w:lvlText w:val="%3."/>
+      <w:lvlJc w:val="left"/>
+      <w:pPr>
+        <w:tabs>
+          <w:tab w:val="num" w:pos="2160"/>
+        </w:tabs>
+        <w:ind w:left="2160" w:hanging="360"/>
+      </w:pPr>
+    </w:lvl>
+    <w:lvl w:ilvl="3" w:tentative="1">
+      <w:start w:val="1"/>
+      <w:numFmt w:val="decimal"/>
+      <w:lvlText w:val="%4."/>
+      <w:lvlJc w:val="left"/>
+      <w:pPr>
+        <w:tabs>
+          <w:tab w:val="num" w:pos="2880"/>
+        </w:tabs>
+        <w:ind w:left="2880" w:hanging="360"/>
+      </w:pPr>
+    </w:lvl>
+    <w:lvl w:ilvl="4" w:tentative="1">
+      <w:start w:val="1"/>
+      <w:numFmt w:val="decimal"/>
+      <w:lvlText w:val="%5."/>
+      <w:lvlJc w:val="left"/>
+      <w:pPr>
+        <w:tabs>
+          <w:tab w:val="num" w:pos="3600"/>
+        </w:tabs>
+        <w:ind w:left="3600" w:hanging="360"/>
+      </w:pPr>
+    </w:lvl>
+    <w:lvl w:ilvl="5" w:tentative="1">
+      <w:start w:val="1"/>
+      <w:numFmt w:val="decimal"/>
+      <w:lvlText w:val="%6."/>
+      <w:lvlJc w:val="left"/>
+      <w:pPr>
+        <w:tabs>
+          <w:tab w:val="num" w:pos="4320"/>
+        </w:tabs>
+        <w:ind w:left="4320" w:hanging="360"/>
+      </w:pPr>
+    </w:lvl>
+    <w:lvl w:ilvl="6" w:tentative="1">
+      <w:start w:val="1"/>
+      <w:numFmt w:val="decimal"/>
+      <w:lvlText w:val="%7."/>
+      <w:lvlJc w:val="left"/>
+      <w:pPr>
+        <w:tabs>
+          <w:tab w:val="num" w:pos="5040"/>
+        </w:tabs>
+        <w:ind w:left="5040" w:hanging="360"/>
+      </w:pPr>
+    </w:lvl>
+    <w:lvl w:ilvl="7" w:tentative="1">
+      <w:start w:val="1"/>
+      <w:numFmt w:val="decimal"/>
+      <w:lvlText w:val="%8."/>
+      <w:lvlJc w:val="left"/>
+      <w:pPr>
+        <w:tabs>
+          <w:tab w:val="num" w:pos="5760"/>
+        </w:tabs>
+        <w:ind w:left="5760" w:hanging="360"/>
+      </w:pPr>
+    </w:lvl>
+    <w:lvl w:ilvl="8" w:tentative="1">
+      <w:start w:val="1"/>
+      <w:numFmt w:val="decimal"/>
+      <w:lvlText w:val="%9."/>
+      <w:lvlJc w:val="left"/>
+      <w:pPr>
+        <w:tabs>
+          <w:tab w:val="num" w:pos="6480"/>
+        </w:tabs>
+        <w:ind w:left="6480" w:hanging="360"/>
+      </w:pPr>
+    </w:lvl>
+  </w:abstractNum>
+  <w:abstractNum w:abstractNumId="12" w15:restartNumberingAfterBreak="0">
     <w:nsid w:val="458658B0"/>
     <w:multiLevelType w:val="multilevel"/>
     <w:tmpl w:val="62C21E26"/>
@@ -12554,7 +14508,7 @@
       </w:rPr>
     </w:lvl>
   </w:abstractNum>
-  <w:abstractNum w:abstractNumId="12" w15:restartNumberingAfterBreak="0">
+  <w:abstractNum w:abstractNumId="13" w15:restartNumberingAfterBreak="0">
     <w:nsid w:val="48C61717"/>
     <w:multiLevelType w:val="multilevel"/>
     <w:tmpl w:val="F198057C"/>
@@ -12667,7 +14621,7 @@
       </w:pPr>
     </w:lvl>
   </w:abstractNum>
-  <w:abstractNum w:abstractNumId="13" w15:restartNumberingAfterBreak="0">
+  <w:abstractNum w:abstractNumId="14" w15:restartNumberingAfterBreak="0">
     <w:nsid w:val="73C06C86"/>
     <w:multiLevelType w:val="multilevel"/>
     <w:tmpl w:val="41629950"/>
@@ -12816,7 +14770,7 @@
       </w:rPr>
     </w:lvl>
   </w:abstractNum>
-  <w:abstractNum w:abstractNumId="14" w15:restartNumberingAfterBreak="0">
+  <w:abstractNum w:abstractNumId="15" w15:restartNumberingAfterBreak="0">
     <w:nsid w:val="745E021B"/>
     <w:multiLevelType w:val="multilevel"/>
     <w:tmpl w:val="E2CAFB48"/>
@@ -12965,7 +14919,7 @@
       </w:rPr>
     </w:lvl>
   </w:abstractNum>
-  <w:abstractNum w:abstractNumId="15" w15:restartNumberingAfterBreak="0">
+  <w:abstractNum w:abstractNumId="16" w15:restartNumberingAfterBreak="0">
     <w:nsid w:val="746F2344"/>
     <w:multiLevelType w:val="multilevel"/>
     <w:tmpl w:val="444A5646"/>
@@ -13114,7 +15068,7 @@
       </w:rPr>
     </w:lvl>
   </w:abstractNum>
-  <w:abstractNum w:abstractNumId="16" w15:restartNumberingAfterBreak="0">
+  <w:abstractNum w:abstractNumId="17" w15:restartNumberingAfterBreak="0">
     <w:nsid w:val="7E6E19E2"/>
     <w:multiLevelType w:val="multilevel"/>
     <w:tmpl w:val="56904166"/>
@@ -13263,7 +15217,7 @@
       </w:rPr>
     </w:lvl>
   </w:abstractNum>
-  <w:abstractNum w:abstractNumId="17" w15:restartNumberingAfterBreak="0">
+  <w:abstractNum w:abstractNumId="18" w15:restartNumberingAfterBreak="0">
     <w:nsid w:val="7FA93B0F"/>
     <w:multiLevelType w:val="multilevel"/>
     <w:tmpl w:val="C8667490"/>
@@ -13383,7 +15337,7 @@
     <w:abstractNumId w:val="6"/>
   </w:num>
   <w:num w:numId="3" w16cid:durableId="620571845">
-    <w:abstractNumId w:val="17"/>
+    <w:abstractNumId w:val="18"/>
   </w:num>
   <w:num w:numId="4" w16cid:durableId="1012072675">
     <w:abstractNumId w:val="5"/>
@@ -13398,19 +15352,19 @@
     <w:abstractNumId w:val="10"/>
   </w:num>
   <w:num w:numId="8" w16cid:durableId="1593514282">
-    <w:abstractNumId w:val="12"/>
+    <w:abstractNumId w:val="13"/>
   </w:num>
   <w:num w:numId="9" w16cid:durableId="1158837310">
-    <w:abstractNumId w:val="14"/>
+    <w:abstractNumId w:val="15"/>
   </w:num>
   <w:num w:numId="10" w16cid:durableId="883561628">
     <w:abstractNumId w:val="7"/>
   </w:num>
   <w:num w:numId="11" w16cid:durableId="213809607">
-    <w:abstractNumId w:val="13"/>
+    <w:abstractNumId w:val="14"/>
   </w:num>
   <w:num w:numId="12" w16cid:durableId="94985437">
-    <w:abstractNumId w:val="11"/>
+    <w:abstractNumId w:val="12"/>
   </w:num>
   <w:num w:numId="13" w16cid:durableId="2102753899">
     <w:abstractNumId w:val="2"/>
@@ -13422,13 +15376,16 @@
     <w:abstractNumId w:val="0"/>
   </w:num>
   <w:num w:numId="16" w16cid:durableId="583807871">
-    <w:abstractNumId w:val="15"/>
+    <w:abstractNumId w:val="16"/>
   </w:num>
   <w:num w:numId="17" w16cid:durableId="933703236">
-    <w:abstractNumId w:val="16"/>
+    <w:abstractNumId w:val="17"/>
   </w:num>
   <w:num w:numId="18" w16cid:durableId="29109041">
     <w:abstractNumId w:val="3"/>
+  </w:num>
+  <w:num w:numId="19" w16cid:durableId="732125005">
+    <w:abstractNumId w:val="11"/>
   </w:num>
 </w:numbering>
 </file>

</xml_diff>